<commit_message>
30/09/2026 - 22:56 h
</commit_message>
<xml_diff>
--- a/Estudo de O Livro dos Espíritos - 28-09-2026.docx
+++ b/Estudo de O Livro dos Espíritos - 28-09-2026.docx
@@ -486,29 +486,7 @@
           <w:szCs w:val="36"/>
           <w:lang w:val="pt-BR" w:eastAsia="zh-CN" w:bidi="hi-IN"/>
         </w:rPr>
-        <w:t xml:space="preserve">Kardec pergunta à Espiritualidade se existe uma maneira preferível para se compreender a divisão dos reinos na natureza: em 2 classes </w:t>
-      </w:r>
-      <w:r>
-        <w:rPr>
-          <w:rFonts w:eastAsia="Noto Serif CJK SC" w:cs="Noto Sans Devanagari" w:ascii="Garamond" w:hAnsi="Garamond"/>
-          <w:color w:val="00A0FC"/>
-          <w:kern w:val="2"/>
-          <w:sz w:val="36"/>
-          <w:szCs w:val="36"/>
-          <w:lang w:val="pt-BR" w:eastAsia="zh-CN" w:bidi="hi-IN"/>
-        </w:rPr>
-        <w:t>apenas</w:t>
-      </w:r>
-      <w:r>
-        <w:rPr>
-          <w:rFonts w:eastAsia="Noto Serif CJK SC" w:cs="Noto Sans Devanagari" w:ascii="Garamond" w:hAnsi="Garamond"/>
-          <w:color w:val="00A0FC"/>
-          <w:kern w:val="2"/>
-          <w:sz w:val="36"/>
-          <w:szCs w:val="36"/>
-          <w:lang w:val="pt-BR" w:eastAsia="zh-CN" w:bidi="hi-IN"/>
-        </w:rPr>
-        <w:t>, como seres orgânicos e inorgânicos, ou realmente em 3 reinos, sendo que alguns consideram o homem uma espécie de quarto reino.</w:t>
+        <w:t>Kardec pergunta à Espiritualidade se existe uma maneira preferível para se compreender a divisão dos reinos na natureza: em 2 classes apenas, como seres orgânicos e inorgânicos, ou realmente em 3 reinos, sendo que alguns consideram o homem uma espécie de quarto reino.</w:t>
       </w:r>
     </w:p>
     <w:p>
@@ -602,294 +580,123 @@
           <w:szCs w:val="36"/>
           <w:lang w:val="pt-BR" w:eastAsia="zh-CN" w:bidi="hi-IN"/>
         </w:rPr>
-        <w:t xml:space="preserve">Se pensarmos </w:t>
-      </w:r>
-      <w:r>
-        <w:rPr>
-          <w:rFonts w:eastAsia="Noto Serif CJK SC" w:cs="Noto Sans Devanagari" w:ascii="Garamond" w:hAnsi="Garamond"/>
-          <w:color w:val="00A0FC"/>
-          <w:kern w:val="2"/>
-          <w:sz w:val="36"/>
-          <w:szCs w:val="36"/>
-          <w:lang w:val="pt-BR" w:eastAsia="zh-CN" w:bidi="hi-IN"/>
-        </w:rPr>
-        <w:t>somente</w:t>
-      </w:r>
-      <w:r>
-        <w:rPr>
-          <w:rFonts w:eastAsia="Noto Serif CJK SC" w:cs="Noto Sans Devanagari" w:ascii="Garamond" w:hAnsi="Garamond"/>
-          <w:color w:val="00A0FC"/>
-          <w:kern w:val="2"/>
-          <w:sz w:val="36"/>
-          <w:szCs w:val="36"/>
-          <w:lang w:val="pt-BR" w:eastAsia="zh-CN" w:bidi="hi-IN"/>
-        </w:rPr>
-        <w:t xml:space="preserve"> em termos de matéria, realmente só </w:t>
-      </w:r>
-      <w:r>
-        <w:rPr>
-          <w:rFonts w:eastAsia="Noto Serif CJK SC" w:cs="Noto Sans Devanagari" w:ascii="Garamond" w:hAnsi="Garamond"/>
-          <w:color w:val="00A0FC"/>
-          <w:kern w:val="2"/>
-          <w:sz w:val="36"/>
-          <w:szCs w:val="36"/>
-          <w:lang w:val="pt-BR" w:eastAsia="zh-CN" w:bidi="hi-IN"/>
-        </w:rPr>
-        <w:t>existem</w:t>
-      </w:r>
-      <w:r>
-        <w:rPr>
-          <w:rFonts w:eastAsia="Noto Serif CJK SC" w:cs="Noto Sans Devanagari" w:ascii="Garamond" w:hAnsi="Garamond"/>
-          <w:color w:val="00A0FC"/>
-          <w:kern w:val="2"/>
-          <w:sz w:val="36"/>
-          <w:szCs w:val="36"/>
-          <w:lang w:val="pt-BR" w:eastAsia="zh-CN" w:bidi="hi-IN"/>
-        </w:rPr>
-        <w:t xml:space="preserve"> 2 classes: a dos seres inorgânicos, que compreende os minerais, e a dos seres orgânicos, composta pelas plantas, animais e o próprio homem.</w:t>
-      </w:r>
-    </w:p>
-    <w:p>
-      <w:pPr>
-        <w:pStyle w:val="Normal"/>
-        <w:bidi w:val="0"/>
-        <w:ind w:left="709" w:hanging="0"/>
-        <w:jc w:val="both"/>
-        <w:rPr>
-          <w:rFonts w:ascii="Garamond" w:hAnsi="Garamond"/>
-          <w:color w:val="00A0FC"/>
-          <w:sz w:val="36"/>
-          <w:szCs w:val="36"/>
-        </w:rPr>
-      </w:pPr>
-      <w:r>
-        <w:rPr>
-          <w:rFonts w:ascii="Garamond" w:hAnsi="Garamond"/>
-          <w:color w:val="00A0FC"/>
-          <w:sz w:val="36"/>
-          <w:szCs w:val="36"/>
-        </w:rPr>
-      </w:r>
-    </w:p>
-    <w:p>
-      <w:pPr>
-        <w:pStyle w:val="Normal"/>
-        <w:bidi w:val="0"/>
-        <w:ind w:left="709" w:hanging="0"/>
-        <w:jc w:val="both"/>
-        <w:rPr>
-          <w:rFonts w:ascii="Garamond" w:hAnsi="Garamond"/>
-          <w:color w:val="00A0FC"/>
-          <w:sz w:val="36"/>
-          <w:szCs w:val="36"/>
-        </w:rPr>
-      </w:pPr>
-      <w:r>
-        <w:rPr>
-          <w:rFonts w:eastAsia="Noto Serif CJK SC" w:cs="Noto Sans Devanagari" w:ascii="Garamond" w:hAnsi="Garamond"/>
-          <w:color w:val="00A0FC"/>
-          <w:kern w:val="2"/>
-          <w:sz w:val="36"/>
-          <w:szCs w:val="36"/>
-          <w:lang w:val="pt-BR" w:eastAsia="zh-CN" w:bidi="hi-IN"/>
-        </w:rPr>
-        <w:t xml:space="preserve">Se essa divisão for considerada do ponto de vista moral, aí sim, teremos 4 </w:t>
-      </w:r>
-      <w:r>
-        <w:rPr>
-          <w:rFonts w:eastAsia="Noto Serif CJK SC" w:cs="Noto Sans Devanagari" w:ascii="Garamond" w:hAnsi="Garamond"/>
-          <w:color w:val="00A0FC"/>
-          <w:kern w:val="2"/>
-          <w:sz w:val="36"/>
-          <w:szCs w:val="36"/>
-          <w:lang w:val="pt-BR" w:eastAsia="zh-CN" w:bidi="hi-IN"/>
-        </w:rPr>
-        <w:t>graus</w:t>
-      </w:r>
-      <w:r>
-        <w:rPr>
-          <w:rFonts w:eastAsia="Noto Serif CJK SC" w:cs="Noto Sans Devanagari" w:ascii="Garamond" w:hAnsi="Garamond"/>
-          <w:color w:val="00A0FC"/>
-          <w:kern w:val="2"/>
-          <w:sz w:val="36"/>
-          <w:szCs w:val="36"/>
-          <w:lang w:val="pt-BR" w:eastAsia="zh-CN" w:bidi="hi-IN"/>
-        </w:rPr>
-        <w:t>: os minerais, as plantas, os animais e o homem.</w:t>
-      </w:r>
-    </w:p>
-    <w:p>
-      <w:pPr>
-        <w:pStyle w:val="Normal"/>
-        <w:bidi w:val="0"/>
-        <w:ind w:left="709" w:hanging="0"/>
-        <w:jc w:val="both"/>
-        <w:rPr>
-          <w:rFonts w:ascii="Garamond" w:hAnsi="Garamond"/>
-          <w:color w:val="00A0FC"/>
-          <w:sz w:val="36"/>
-          <w:szCs w:val="36"/>
-        </w:rPr>
-      </w:pPr>
-      <w:r>
-        <w:rPr>
-          <w:rFonts w:ascii="Garamond" w:hAnsi="Garamond"/>
-          <w:color w:val="00A0FC"/>
-          <w:sz w:val="36"/>
-          <w:szCs w:val="36"/>
-        </w:rPr>
-      </w:r>
-    </w:p>
-    <w:p>
-      <w:pPr>
-        <w:pStyle w:val="Normal"/>
-        <w:bidi w:val="0"/>
-        <w:ind w:left="709" w:hanging="0"/>
-        <w:jc w:val="both"/>
-        <w:rPr>
-          <w:rFonts w:ascii="Garamond" w:hAnsi="Garamond"/>
-          <w:color w:val="00A0FC"/>
-          <w:sz w:val="36"/>
-          <w:szCs w:val="36"/>
-        </w:rPr>
-      </w:pPr>
-      <w:r>
-        <w:rPr>
-          <w:rFonts w:eastAsia="Noto Serif CJK SC" w:cs="Noto Sans Devanagari" w:ascii="Garamond" w:hAnsi="Garamond"/>
-          <w:color w:val="00A0FC"/>
-          <w:kern w:val="2"/>
-          <w:sz w:val="36"/>
-          <w:szCs w:val="36"/>
-          <w:lang w:val="pt-BR" w:eastAsia="zh-CN" w:bidi="hi-IN"/>
-        </w:rPr>
-        <w:t xml:space="preserve">Na nota que adicionou à resposta da Espiritualidade, Kardec </w:t>
-      </w:r>
-      <w:r>
-        <w:rPr>
-          <w:rFonts w:eastAsia="Noto Serif CJK SC" w:cs="Noto Sans Devanagari" w:ascii="Garamond" w:hAnsi="Garamond"/>
-          <w:color w:val="00A0FC"/>
-          <w:kern w:val="2"/>
-          <w:sz w:val="36"/>
-          <w:szCs w:val="36"/>
-          <w:lang w:val="pt-BR" w:eastAsia="zh-CN" w:bidi="hi-IN"/>
-        </w:rPr>
-        <w:t>diz</w:t>
-      </w:r>
-      <w:r>
-        <w:rPr>
-          <w:rFonts w:eastAsia="Noto Serif CJK SC" w:cs="Noto Sans Devanagari" w:ascii="Garamond" w:hAnsi="Garamond"/>
-          <w:color w:val="00A0FC"/>
-          <w:kern w:val="2"/>
-          <w:sz w:val="36"/>
-          <w:szCs w:val="36"/>
-          <w:lang w:val="pt-BR" w:eastAsia="zh-CN" w:bidi="hi-IN"/>
-        </w:rPr>
-        <w:t xml:space="preserve"> que, </w:t>
-      </w:r>
-      <w:r>
-        <w:rPr>
-          <w:rFonts w:eastAsia="Noto Serif CJK SC" w:cs="Noto Sans Devanagari" w:ascii="Garamond" w:hAnsi="Garamond"/>
-          <w:color w:val="00A0FC"/>
-          <w:kern w:val="2"/>
-          <w:sz w:val="36"/>
-          <w:szCs w:val="36"/>
-          <w:lang w:val="pt-BR" w:eastAsia="zh-CN" w:bidi="hi-IN"/>
-        </w:rPr>
-        <w:t>considerando</w:t>
-      </w:r>
-      <w:r>
-        <w:rPr>
-          <w:rFonts w:eastAsia="Noto Serif CJK SC" w:cs="Noto Sans Devanagari" w:ascii="Garamond" w:hAnsi="Garamond"/>
-          <w:color w:val="00A0FC"/>
-          <w:kern w:val="2"/>
-          <w:sz w:val="36"/>
-          <w:szCs w:val="36"/>
-          <w:lang w:val="pt-BR" w:eastAsia="zh-CN" w:bidi="hi-IN"/>
-        </w:rPr>
-        <w:t xml:space="preserve"> a divisão moral, ou seja, em 4 </w:t>
-      </w:r>
-      <w:r>
-        <w:rPr>
-          <w:rFonts w:eastAsia="Noto Serif CJK SC" w:cs="Noto Sans Devanagari" w:ascii="Garamond" w:hAnsi="Garamond"/>
-          <w:color w:val="00A0FC"/>
-          <w:kern w:val="2"/>
-          <w:sz w:val="36"/>
-          <w:szCs w:val="36"/>
-          <w:lang w:val="pt-BR" w:eastAsia="zh-CN" w:bidi="hi-IN"/>
-        </w:rPr>
-        <w:t>graus,</w:t>
-      </w:r>
-      <w:r>
-        <w:rPr>
-          <w:rFonts w:eastAsia="Noto Serif CJK SC" w:cs="Noto Sans Devanagari" w:ascii="Garamond" w:hAnsi="Garamond"/>
-          <w:color w:val="00A0FC"/>
-          <w:kern w:val="2"/>
-          <w:sz w:val="36"/>
-          <w:szCs w:val="36"/>
-          <w:lang w:val="pt-BR" w:eastAsia="zh-CN" w:bidi="hi-IN"/>
-        </w:rPr>
-        <w:t xml:space="preserve"> </w:t>
-      </w:r>
-      <w:r>
-        <w:rPr>
-          <w:rFonts w:eastAsia="Noto Serif CJK SC" w:cs="Noto Sans Devanagari" w:ascii="Garamond" w:hAnsi="Garamond"/>
-          <w:color w:val="00A0FC"/>
-          <w:kern w:val="2"/>
-          <w:sz w:val="36"/>
-          <w:szCs w:val="36"/>
-          <w:lang w:val="pt-BR" w:eastAsia="zh-CN" w:bidi="hi-IN"/>
-        </w:rPr>
-        <w:t>observaremos</w:t>
-      </w:r>
-      <w:r>
-        <w:rPr>
-          <w:rFonts w:eastAsia="Noto Serif CJK SC" w:cs="Noto Sans Devanagari" w:ascii="Garamond" w:hAnsi="Garamond"/>
-          <w:color w:val="00A0FC"/>
-          <w:kern w:val="2"/>
-          <w:sz w:val="36"/>
-          <w:szCs w:val="36"/>
-          <w:lang w:val="pt-BR" w:eastAsia="zh-CN" w:bidi="hi-IN"/>
-        </w:rPr>
-        <w:t xml:space="preserve"> uma escala que se inicia com os minerais e </w:t>
-      </w:r>
-      <w:r>
-        <w:rPr>
-          <w:rFonts w:eastAsia="Noto Serif CJK SC" w:cs="Noto Sans Devanagari" w:ascii="Garamond" w:hAnsi="Garamond"/>
-          <w:color w:val="00A0FC"/>
-          <w:kern w:val="2"/>
-          <w:sz w:val="36"/>
-          <w:szCs w:val="36"/>
-          <w:lang w:val="pt-BR" w:eastAsia="zh-CN" w:bidi="hi-IN"/>
-        </w:rPr>
-        <w:t>que se encerra</w:t>
-      </w:r>
-      <w:r>
-        <w:rPr>
-          <w:rFonts w:eastAsia="Noto Serif CJK SC" w:cs="Noto Sans Devanagari" w:ascii="Garamond" w:hAnsi="Garamond"/>
-          <w:color w:val="00A0FC"/>
-          <w:kern w:val="2"/>
-          <w:sz w:val="36"/>
-          <w:szCs w:val="36"/>
-          <w:lang w:val="pt-BR" w:eastAsia="zh-CN" w:bidi="hi-IN"/>
-        </w:rPr>
-        <w:t xml:space="preserve"> com o homem, pelo menos em se tratando de planeta Terra.</w:t>
-      </w:r>
-    </w:p>
-    <w:p>
-      <w:pPr>
-        <w:pStyle w:val="Normal"/>
-        <w:bidi w:val="0"/>
-        <w:ind w:left="709" w:hanging="0"/>
-        <w:jc w:val="both"/>
-        <w:rPr>
-          <w:rFonts w:ascii="Garamond" w:hAnsi="Garamond"/>
-          <w:color w:val="00A0FC"/>
-          <w:sz w:val="36"/>
-          <w:szCs w:val="36"/>
-        </w:rPr>
-      </w:pPr>
-      <w:r>
-        <w:rPr/>
+        <w:t>Se pensarmos somente em termos de matéria, realmente só existem 2 classes: a dos seres inorgânicos, que compreende os minerais, e a dos seres orgânicos, composta pelas plantas, animais e o próprio homem.</w:t>
+      </w:r>
+    </w:p>
+    <w:p>
+      <w:pPr>
+        <w:pStyle w:val="Normal"/>
+        <w:bidi w:val="0"/>
+        <w:ind w:left="709" w:hanging="0"/>
+        <w:jc w:val="both"/>
+        <w:rPr>
+          <w:rFonts w:ascii="Garamond" w:hAnsi="Garamond"/>
+          <w:color w:val="00A0FC"/>
+          <w:sz w:val="36"/>
+          <w:szCs w:val="36"/>
+        </w:rPr>
+      </w:pPr>
+      <w:r>
+        <w:rPr>
+          <w:rFonts w:ascii="Garamond" w:hAnsi="Garamond"/>
+          <w:color w:val="00A0FC"/>
+          <w:sz w:val="36"/>
+          <w:szCs w:val="36"/>
+        </w:rPr>
+      </w:r>
+    </w:p>
+    <w:p>
+      <w:pPr>
+        <w:pStyle w:val="Normal"/>
+        <w:bidi w:val="0"/>
+        <w:ind w:left="709" w:hanging="0"/>
+        <w:jc w:val="both"/>
+        <w:rPr>
+          <w:rFonts w:ascii="Garamond" w:hAnsi="Garamond"/>
+          <w:color w:val="00A0FC"/>
+          <w:sz w:val="36"/>
+          <w:szCs w:val="36"/>
+        </w:rPr>
+      </w:pPr>
+      <w:r>
+        <w:rPr>
+          <w:rFonts w:eastAsia="Noto Serif CJK SC" w:cs="Noto Sans Devanagari" w:ascii="Garamond" w:hAnsi="Garamond"/>
+          <w:color w:val="00A0FC"/>
+          <w:kern w:val="2"/>
+          <w:sz w:val="36"/>
+          <w:szCs w:val="36"/>
+          <w:lang w:val="pt-BR" w:eastAsia="zh-CN" w:bidi="hi-IN"/>
+        </w:rPr>
+        <w:t>Se essa divisão for considerada do ponto de vista moral, aí sim, teremos 4 graus: os minerais, as plantas, os animais e o homem.</w:t>
+      </w:r>
+    </w:p>
+    <w:p>
+      <w:pPr>
+        <w:pStyle w:val="Normal"/>
+        <w:bidi w:val="0"/>
+        <w:ind w:left="709" w:hanging="0"/>
+        <w:jc w:val="both"/>
+        <w:rPr>
+          <w:rFonts w:ascii="Garamond" w:hAnsi="Garamond"/>
+          <w:color w:val="00A0FC"/>
+          <w:sz w:val="36"/>
+          <w:szCs w:val="36"/>
+        </w:rPr>
+      </w:pPr>
+      <w:r>
+        <w:rPr>
+          <w:rFonts w:ascii="Garamond" w:hAnsi="Garamond"/>
+          <w:color w:val="00A0FC"/>
+          <w:sz w:val="36"/>
+          <w:szCs w:val="36"/>
+        </w:rPr>
+      </w:r>
+    </w:p>
+    <w:p>
+      <w:pPr>
+        <w:pStyle w:val="Normal"/>
+        <w:bidi w:val="0"/>
+        <w:ind w:left="709" w:hanging="0"/>
+        <w:jc w:val="both"/>
+        <w:rPr>
+          <w:rFonts w:ascii="Garamond" w:hAnsi="Garamond"/>
+          <w:color w:val="00A0FC"/>
+          <w:sz w:val="36"/>
+          <w:szCs w:val="36"/>
+        </w:rPr>
+      </w:pPr>
+      <w:r>
+        <w:rPr>
+          <w:rFonts w:eastAsia="Noto Serif CJK SC" w:cs="Noto Sans Devanagari" w:ascii="Garamond" w:hAnsi="Garamond"/>
+          <w:color w:val="00A0FC"/>
+          <w:kern w:val="2"/>
+          <w:sz w:val="36"/>
+          <w:szCs w:val="36"/>
+          <w:lang w:val="pt-BR" w:eastAsia="zh-CN" w:bidi="hi-IN"/>
+        </w:rPr>
+        <w:t>Na nota que adicionou à resposta da Espiritualidade, Kardec diz que, considerando a divisão moral, ou seja, em 4 graus, observaremos uma escala que se inicia com os minerais e que se encerra com o homem, pelo menos em se tratando de planeta Terra.</w:t>
+      </w:r>
+    </w:p>
+    <w:p>
+      <w:pPr>
+        <w:pStyle w:val="Normal"/>
+        <w:bidi w:val="0"/>
+        <w:ind w:left="709" w:hanging="0"/>
+        <w:jc w:val="both"/>
+        <w:rPr>
+          <w:rFonts w:ascii="Garamond" w:hAnsi="Garamond"/>
+          <w:color w:val="00A0FC"/>
+          <w:sz w:val="36"/>
+          <w:szCs w:val="36"/>
+        </w:rPr>
+      </w:pPr>
+      <w:r>
+        <w:rPr>
+          <w:rFonts w:ascii="Garamond" w:hAnsi="Garamond"/>
+          <w:color w:val="00A0FC"/>
+          <w:sz w:val="36"/>
+          <w:szCs w:val="36"/>
+        </w:rPr>
       </w:r>
     </w:p>
     <w:p>
@@ -931,7 +738,12 @@
         </w:rPr>
       </w:pPr>
       <w:r>
-        <w:rPr/>
+        <w:rPr>
+          <w:rFonts w:ascii="Garamond" w:hAnsi="Garamond"/>
+          <w:color w:val="00A0FC"/>
+          <w:sz w:val="36"/>
+          <w:szCs w:val="36"/>
+        </w:rPr>
       </w:r>
     </w:p>
     <w:p>
@@ -973,7 +785,12 @@
         </w:rPr>
       </w:pPr>
       <w:r>
-        <w:rPr/>
+        <w:rPr>
+          <w:rFonts w:ascii="Garamond" w:hAnsi="Garamond"/>
+          <w:color w:val="00A0FC"/>
+          <w:sz w:val="36"/>
+          <w:szCs w:val="36"/>
+        </w:rPr>
       </w:r>
     </w:p>
     <w:p>
@@ -1015,71 +832,59 @@
         </w:rPr>
       </w:pPr>
       <w:r>
-        <w:rPr/>
-      </w:r>
-    </w:p>
-    <w:p>
-      <w:pPr>
-        <w:pStyle w:val="Normal"/>
-        <w:bidi w:val="0"/>
-        <w:ind w:left="709" w:hanging="0"/>
-        <w:jc w:val="both"/>
-        <w:rPr>
-          <w:rFonts w:ascii="Garamond" w:hAnsi="Garamond"/>
-          <w:color w:val="00A0FC"/>
-          <w:sz w:val="36"/>
-          <w:szCs w:val="36"/>
-        </w:rPr>
-      </w:pPr>
-      <w:r>
-        <w:rPr>
-          <w:rFonts w:eastAsia="Noto Serif CJK SC" w:cs="Noto Sans Devanagari" w:ascii="Garamond" w:hAnsi="Garamond"/>
-          <w:color w:val="00A0FC"/>
-          <w:kern w:val="2"/>
-          <w:sz w:val="36"/>
-          <w:szCs w:val="36"/>
-          <w:lang w:val="pt-BR" w:eastAsia="zh-CN" w:bidi="hi-IN"/>
-        </w:rPr>
-        <w:t>Já o reino animal, sucedendo ao reino vegetal, possui força mecânica, vitalidade, e é também dotado de uma inteligência instintiva</w:t>
-      </w:r>
-      <w:r>
-        <w:rPr>
-          <w:rFonts w:eastAsia="Noto Serif CJK SC" w:cs="Noto Sans Devanagari" w:ascii="Garamond" w:hAnsi="Garamond"/>
-          <w:color w:val="00A0FC"/>
-          <w:kern w:val="2"/>
-          <w:sz w:val="36"/>
-          <w:szCs w:val="36"/>
-          <w:lang w:val="pt-BR" w:eastAsia="zh-CN" w:bidi="hi-IN"/>
-        </w:rPr>
-        <w:t xml:space="preserve">, o que permite aos animais terem </w:t>
-      </w:r>
-      <w:r>
-        <w:rPr>
-          <w:rFonts w:eastAsia="Noto Serif CJK SC" w:cs="Noto Sans Devanagari" w:ascii="Garamond" w:hAnsi="Garamond"/>
-          <w:color w:val="00A0FC"/>
-          <w:kern w:val="2"/>
-          <w:sz w:val="36"/>
-          <w:szCs w:val="36"/>
-          <w:lang w:val="pt-BR" w:eastAsia="zh-CN" w:bidi="hi-IN"/>
-        </w:rPr>
-        <w:t>consciência de sua existência  e de sua individualidade.</w:t>
-      </w:r>
-    </w:p>
-    <w:p>
-      <w:pPr>
-        <w:pStyle w:val="Normal"/>
-        <w:bidi w:val="0"/>
-        <w:ind w:left="709" w:hanging="0"/>
-        <w:jc w:val="both"/>
-        <w:rPr>
-          <w:rFonts w:ascii="Garamond" w:hAnsi="Garamond"/>
-          <w:color w:val="00A0FC"/>
-          <w:sz w:val="36"/>
-          <w:szCs w:val="36"/>
-        </w:rPr>
-      </w:pPr>
-      <w:r>
-        <w:rPr/>
+        <w:rPr>
+          <w:rFonts w:ascii="Garamond" w:hAnsi="Garamond"/>
+          <w:color w:val="00A0FC"/>
+          <w:sz w:val="36"/>
+          <w:szCs w:val="36"/>
+        </w:rPr>
+      </w:r>
+    </w:p>
+    <w:p>
+      <w:pPr>
+        <w:pStyle w:val="Normal"/>
+        <w:bidi w:val="0"/>
+        <w:ind w:left="709" w:hanging="0"/>
+        <w:jc w:val="both"/>
+        <w:rPr>
+          <w:rFonts w:ascii="Garamond" w:hAnsi="Garamond"/>
+          <w:color w:val="00A0FC"/>
+          <w:sz w:val="36"/>
+          <w:szCs w:val="36"/>
+        </w:rPr>
+      </w:pPr>
+      <w:r>
+        <w:rPr>
+          <w:rFonts w:eastAsia="Noto Serif CJK SC" w:cs="Noto Sans Devanagari" w:ascii="Garamond" w:hAnsi="Garamond"/>
+          <w:color w:val="00A0FC"/>
+          <w:kern w:val="2"/>
+          <w:sz w:val="36"/>
+          <w:szCs w:val="36"/>
+          <w:lang w:val="pt-BR" w:eastAsia="zh-CN" w:bidi="hi-IN"/>
+        </w:rPr>
+        <w:t>Já o reino animal, sucedendo ao reino vegetal, possui força mecânica, vitalidade, e é também dotado de uma inteligência instintiva, o que permite aos animais terem consciência de sua existência  e de sua individualidade.</w:t>
+      </w:r>
+    </w:p>
+    <w:p>
+      <w:pPr>
+        <w:pStyle w:val="Normal"/>
+        <w:bidi w:val="0"/>
+        <w:ind w:left="709" w:hanging="0"/>
+        <w:jc w:val="both"/>
+        <w:rPr>
+          <w:rFonts w:ascii="Garamond" w:hAnsi="Garamond"/>
+          <w:color w:val="00A0FC"/>
+          <w:sz w:val="36"/>
+          <w:szCs w:val="36"/>
+        </w:rPr>
+      </w:pPr>
+      <w:r>
+        <w:rPr>
+          <w:rFonts w:ascii="Garamond" w:hAnsi="Garamond"/>
+          <w:color w:val="00A0FC"/>
+          <w:sz w:val="36"/>
+          <w:szCs w:val="36"/>
+        </w:rPr>
       </w:r>
     </w:p>
     <w:p>
@@ -1123,6 +928,7 @@
       <w:r>
         <w:rPr>
           <w:rFonts w:ascii="Garamond" w:hAnsi="Garamond"/>
+          <w:color w:val="00A0FC"/>
           <w:sz w:val="36"/>
           <w:szCs w:val="36"/>
         </w:rPr>
@@ -1148,18 +954,7 @@
           <w:szCs w:val="36"/>
           <w:lang w:val="pt-BR" w:eastAsia="zh-CN" w:bidi="hi-IN"/>
         </w:rPr>
-        <w:t>5</w:t>
-      </w:r>
-      <w:r>
-        <w:rPr>
-          <w:rFonts w:eastAsia="Noto Serif CJK SC" w:cs="Noto Sans Devanagari" w:ascii="Garamond" w:hAnsi="Garamond"/>
-          <w:color w:val="auto"/>
-          <w:kern w:val="2"/>
-          <w:sz w:val="36"/>
-          <w:szCs w:val="36"/>
-          <w:lang w:val="pt-BR" w:eastAsia="zh-CN" w:bidi="hi-IN"/>
-        </w:rPr>
-        <w:t>86</w:t>
+        <w:t>586</w:t>
       </w:r>
       <w:r>
         <w:rPr>
@@ -1279,7 +1074,10 @@
         </w:rPr>
       </w:pPr>
       <w:r>
-        <w:rPr/>
+        <w:rPr>
+          <w:i w:val="false"/>
+          <w:iCs w:val="false"/>
+        </w:rPr>
       </w:r>
     </w:p>
     <w:p>
@@ -1321,7 +1119,10 @@
         </w:rPr>
       </w:pPr>
       <w:r>
-        <w:rPr/>
+        <w:rPr>
+          <w:i w:val="false"/>
+          <w:iCs w:val="false"/>
+        </w:rPr>
       </w:r>
     </w:p>
     <w:p>
@@ -1363,7 +1164,10 @@
         </w:rPr>
       </w:pPr>
       <w:r>
-        <w:rPr/>
+        <w:rPr>
+          <w:i w:val="false"/>
+          <w:iCs w:val="false"/>
+        </w:rPr>
       </w:r>
     </w:p>
     <w:p>
@@ -1405,75 +1209,55 @@
         </w:rPr>
       </w:pPr>
       <w:r>
-        <w:rPr/>
-      </w:r>
-    </w:p>
-    <w:p>
-      <w:pPr>
-        <w:pStyle w:val="Normal"/>
-        <w:bidi w:val="0"/>
-        <w:ind w:left="709" w:hanging="0"/>
-        <w:jc w:val="both"/>
-        <w:rPr>
-          <w:i w:val="false"/>
-          <w:i w:val="false"/>
-          <w:iCs w:val="false"/>
-        </w:rPr>
-      </w:pPr>
-      <w:r>
-        <w:rPr>
-          <w:rFonts w:eastAsia="Noto Serif CJK SC" w:cs="Noto Sans Devanagari" w:ascii="Garamond" w:hAnsi="Garamond"/>
-          <w:i w:val="false"/>
-          <w:iCs w:val="false"/>
-          <w:color w:val="00A0FC"/>
-          <w:kern w:val="2"/>
-          <w:sz w:val="36"/>
-          <w:szCs w:val="36"/>
-          <w:lang w:val="pt-BR" w:eastAsia="zh-CN" w:bidi="hi-IN"/>
-        </w:rPr>
-        <w:t xml:space="preserve">Mas, de acordo com a resposta da </w:t>
-      </w:r>
-      <w:r>
-        <w:rPr>
-          <w:rFonts w:eastAsia="Noto Serif CJK SC" w:cs="Noto Sans Devanagari" w:ascii="Garamond" w:hAnsi="Garamond"/>
-          <w:i w:val="false"/>
-          <w:iCs w:val="false"/>
-          <w:color w:val="00A0FC"/>
-          <w:kern w:val="2"/>
-          <w:sz w:val="36"/>
-          <w:szCs w:val="36"/>
-          <w:lang w:val="pt-BR" w:eastAsia="zh-CN" w:bidi="hi-IN"/>
-        </w:rPr>
-        <w:t>Espiritualidade</w:t>
-      </w:r>
-      <w:r>
-        <w:rPr>
-          <w:rFonts w:eastAsia="Noto Serif CJK SC" w:cs="Noto Sans Devanagari" w:ascii="Garamond" w:hAnsi="Garamond"/>
-          <w:i w:val="false"/>
-          <w:iCs w:val="false"/>
-          <w:color w:val="00A0FC"/>
-          <w:kern w:val="2"/>
-          <w:sz w:val="36"/>
-          <w:szCs w:val="36"/>
-          <w:lang w:val="pt-BR" w:eastAsia="zh-CN" w:bidi="hi-IN"/>
-        </w:rPr>
-        <w:t>, isso é impossível. A causa mais provável é que, tratando-as com amor e carinho, a pessoa transfere para suas plantas, energias extremamente benéficas que favorecem seu desenvolvimento.</w:t>
-      </w:r>
-    </w:p>
-    <w:p>
-      <w:pPr>
-        <w:pStyle w:val="Normal"/>
-        <w:bidi w:val="0"/>
-        <w:ind w:left="709" w:hanging="0"/>
-        <w:jc w:val="both"/>
-        <w:rPr>
-          <w:i w:val="false"/>
-          <w:i w:val="false"/>
-          <w:iCs w:val="false"/>
-        </w:rPr>
-      </w:pPr>
-      <w:r>
-        <w:rPr/>
+        <w:rPr>
+          <w:i w:val="false"/>
+          <w:iCs w:val="false"/>
+        </w:rPr>
+      </w:r>
+    </w:p>
+    <w:p>
+      <w:pPr>
+        <w:pStyle w:val="Normal"/>
+        <w:bidi w:val="0"/>
+        <w:ind w:left="709" w:hanging="0"/>
+        <w:jc w:val="both"/>
+        <w:rPr>
+          <w:i w:val="false"/>
+          <w:i w:val="false"/>
+          <w:iCs w:val="false"/>
+        </w:rPr>
+      </w:pPr>
+      <w:r>
+        <w:rPr>
+          <w:rFonts w:eastAsia="Noto Serif CJK SC" w:cs="Noto Sans Devanagari" w:ascii="Garamond" w:hAnsi="Garamond"/>
+          <w:i w:val="false"/>
+          <w:iCs w:val="false"/>
+          <w:color w:val="00A0FC"/>
+          <w:kern w:val="2"/>
+          <w:sz w:val="36"/>
+          <w:szCs w:val="36"/>
+          <w:lang w:val="pt-BR" w:eastAsia="zh-CN" w:bidi="hi-IN"/>
+        </w:rPr>
+        <w:t>Mas, de acordo com a resposta da Espiritualidade, isso é impossível. A causa mais provável é que, tratando-as com amor e carinho, a pessoa transfere para suas plantas, energias extremamente benéficas que favorecem seu desenvolvimento.</w:t>
+      </w:r>
+    </w:p>
+    <w:p>
+      <w:pPr>
+        <w:pStyle w:val="Normal"/>
+        <w:bidi w:val="0"/>
+        <w:ind w:left="709" w:hanging="0"/>
+        <w:jc w:val="both"/>
+        <w:rPr>
+          <w:i w:val="false"/>
+          <w:i w:val="false"/>
+          <w:iCs w:val="false"/>
+        </w:rPr>
+      </w:pPr>
+      <w:r>
+        <w:rPr>
+          <w:i w:val="false"/>
+          <w:iCs w:val="false"/>
+        </w:rPr>
       </w:r>
     </w:p>
     <w:p>
@@ -1515,7 +1299,10 @@
         </w:rPr>
       </w:pPr>
       <w:r>
-        <w:rPr/>
+        <w:rPr>
+          <w:i w:val="false"/>
+          <w:iCs w:val="false"/>
+        </w:rPr>
       </w:r>
     </w:p>
     <w:p>
@@ -1643,8 +1430,496 @@
           <w:sz w:val="36"/>
           <w:szCs w:val="36"/>
         </w:rPr>
-        <w:t>Recebem impressões físicas que atuam sobre a matéria, mas não</w:t>
-      </w:r>
+        <w:t>Recebem impressões físicas que atuam sobre a matéria, mas não têm percepções. Conseguintemente, não têm a sensação da dor.”</w:t>
+      </w:r>
+    </w:p>
+    <w:p>
+      <w:pPr>
+        <w:pStyle w:val="Normal"/>
+        <w:bidi w:val="0"/>
+        <w:ind w:hanging="0"/>
+        <w:jc w:val="both"/>
+        <w:rPr>
+          <w:rFonts w:ascii="Garamond" w:hAnsi="Garamond"/>
+          <w:sz w:val="36"/>
+          <w:szCs w:val="36"/>
+        </w:rPr>
+      </w:pPr>
+      <w:r>
+        <w:rPr>
+          <w:rFonts w:ascii="Garamond" w:hAnsi="Garamond"/>
+          <w:sz w:val="36"/>
+          <w:szCs w:val="36"/>
+        </w:rPr>
+      </w:r>
+    </w:p>
+    <w:p>
+      <w:pPr>
+        <w:pStyle w:val="Normal"/>
+        <w:bidi w:val="0"/>
+        <w:ind w:left="709" w:hanging="0"/>
+        <w:jc w:val="both"/>
+        <w:rPr>
+          <w:i w:val="false"/>
+          <w:i w:val="false"/>
+          <w:iCs w:val="false"/>
+        </w:rPr>
+      </w:pPr>
+      <w:r>
+        <w:rPr>
+          <w:rFonts w:eastAsia="Noto Serif CJK SC" w:cs="Noto Sans Devanagari" w:ascii="Garamond" w:hAnsi="Garamond"/>
+          <w:i w:val="false"/>
+          <w:iCs w:val="false"/>
+          <w:color w:val="00A0FC"/>
+          <w:kern w:val="2"/>
+          <w:sz w:val="36"/>
+          <w:szCs w:val="36"/>
+          <w:lang w:val="pt-BR" w:eastAsia="zh-CN" w:bidi="hi-IN"/>
+        </w:rPr>
+        <w:t>Na resposta anterior, a Espiritualidade deixou claro que as plantas não têm consciência de si, não são dotadas de nenhuma forma de pensamento; somente possuem a vida orgânica.</w:t>
+      </w:r>
+    </w:p>
+    <w:p>
+      <w:pPr>
+        <w:pStyle w:val="Normal"/>
+        <w:bidi w:val="0"/>
+        <w:ind w:left="709" w:hanging="0"/>
+        <w:jc w:val="both"/>
+        <w:rPr>
+          <w:i w:val="false"/>
+          <w:i w:val="false"/>
+          <w:iCs w:val="false"/>
+        </w:rPr>
+      </w:pPr>
+      <w:r>
+        <w:rPr>
+          <w:i w:val="false"/>
+          <w:iCs w:val="false"/>
+        </w:rPr>
+      </w:r>
+    </w:p>
+    <w:p>
+      <w:pPr>
+        <w:pStyle w:val="Normal"/>
+        <w:bidi w:val="0"/>
+        <w:ind w:left="709" w:hanging="0"/>
+        <w:jc w:val="both"/>
+        <w:rPr>
+          <w:i w:val="false"/>
+          <w:i w:val="false"/>
+          <w:iCs w:val="false"/>
+        </w:rPr>
+      </w:pPr>
+      <w:r>
+        <w:rPr>
+          <w:rFonts w:eastAsia="Noto Serif CJK SC" w:cs="Noto Sans Devanagari" w:ascii="Garamond" w:hAnsi="Garamond"/>
+          <w:i w:val="false"/>
+          <w:iCs w:val="false"/>
+          <w:color w:val="00A0FC"/>
+          <w:kern w:val="2"/>
+          <w:sz w:val="36"/>
+          <w:szCs w:val="36"/>
+          <w:lang w:val="pt-BR" w:eastAsia="zh-CN" w:bidi="hi-IN"/>
+        </w:rPr>
+        <w:t>E aí Kardec deseja saber se, mesmo tendo apenas a vitalidade, as plantas tem algum tipo de sensação, e se poderiam eventualmente sentir dor.</w:t>
+      </w:r>
+    </w:p>
+    <w:p>
+      <w:pPr>
+        <w:pStyle w:val="Normal"/>
+        <w:bidi w:val="0"/>
+        <w:ind w:left="709" w:hanging="0"/>
+        <w:jc w:val="both"/>
+        <w:rPr>
+          <w:i w:val="false"/>
+          <w:i w:val="false"/>
+          <w:iCs w:val="false"/>
+        </w:rPr>
+      </w:pPr>
+      <w:r>
+        <w:rPr>
+          <w:i w:val="false"/>
+          <w:iCs w:val="false"/>
+        </w:rPr>
+      </w:r>
+    </w:p>
+    <w:p>
+      <w:pPr>
+        <w:pStyle w:val="Normal"/>
+        <w:bidi w:val="0"/>
+        <w:ind w:left="709" w:hanging="0"/>
+        <w:jc w:val="both"/>
+        <w:rPr>
+          <w:i w:val="false"/>
+          <w:i w:val="false"/>
+          <w:iCs w:val="false"/>
+        </w:rPr>
+      </w:pPr>
+      <w:r>
+        <w:rPr>
+          <w:rFonts w:eastAsia="Noto Serif CJK SC" w:cs="Noto Sans Devanagari" w:ascii="Garamond" w:hAnsi="Garamond"/>
+          <w:i w:val="false"/>
+          <w:iCs w:val="false"/>
+          <w:color w:val="00A0FC"/>
+          <w:kern w:val="2"/>
+          <w:sz w:val="36"/>
+          <w:szCs w:val="36"/>
+          <w:lang w:val="pt-BR" w:eastAsia="zh-CN" w:bidi="hi-IN"/>
+        </w:rPr>
+        <w:t>A Espiritualidade diz que não, as plantas não sentem dor. O que quer que façamos a elas - arrancá-las da terra, desfolhá-las, cortá-las a machado ou serra, tudo fica restrito ao campo físico. Em outras palavras: serão somente impressões físicas. Nenhuma percepção, nada de dor.</w:t>
+      </w:r>
+    </w:p>
+    <w:p>
+      <w:pPr>
+        <w:pStyle w:val="Normal"/>
+        <w:bidi w:val="0"/>
+        <w:ind w:left="709" w:hanging="0"/>
+        <w:jc w:val="both"/>
+        <w:rPr>
+          <w:i w:val="false"/>
+          <w:i w:val="false"/>
+          <w:iCs w:val="false"/>
+        </w:rPr>
+      </w:pPr>
+      <w:r>
+        <w:rPr>
+          <w:i w:val="false"/>
+          <w:iCs w:val="false"/>
+        </w:rPr>
+      </w:r>
+    </w:p>
+    <w:p>
+      <w:pPr>
+        <w:pStyle w:val="Normal"/>
+        <w:bidi w:val="0"/>
+        <w:ind w:left="709" w:hanging="0"/>
+        <w:jc w:val="both"/>
+        <w:rPr>
+          <w:i w:val="false"/>
+          <w:i w:val="false"/>
+          <w:iCs w:val="false"/>
+        </w:rPr>
+      </w:pPr>
+      <w:r>
+        <w:rPr>
+          <w:rFonts w:eastAsia="Noto Serif CJK SC" w:cs="Noto Sans Devanagari" w:ascii="Garamond" w:hAnsi="Garamond"/>
+          <w:i w:val="false"/>
+          <w:iCs w:val="false"/>
+          <w:color w:val="00A0FC"/>
+          <w:kern w:val="2"/>
+          <w:sz w:val="36"/>
+          <w:szCs w:val="36"/>
+          <w:lang w:val="pt-BR" w:eastAsia="zh-CN" w:bidi="hi-IN"/>
+        </w:rPr>
+        <w:t>Embora muitas vezes a Ciência ignore ou mesmo despreze o lado espiritual das coisas, nessa pergunta de Kardec, ela corrobora a resposta da Espiritualidade.</w:t>
+      </w:r>
+    </w:p>
+    <w:p>
+      <w:pPr>
+        <w:pStyle w:val="Normal"/>
+        <w:bidi w:val="0"/>
+        <w:ind w:left="709" w:hanging="0"/>
+        <w:jc w:val="both"/>
+        <w:rPr>
+          <w:i w:val="false"/>
+          <w:i w:val="false"/>
+          <w:iCs w:val="false"/>
+        </w:rPr>
+      </w:pPr>
+      <w:r>
+        <w:rPr>
+          <w:i w:val="false"/>
+          <w:iCs w:val="false"/>
+        </w:rPr>
+      </w:r>
+    </w:p>
+    <w:p>
+      <w:pPr>
+        <w:pStyle w:val="Normal"/>
+        <w:bidi w:val="0"/>
+        <w:ind w:left="709" w:hanging="0"/>
+        <w:jc w:val="both"/>
+        <w:rPr>
+          <w:i w:val="false"/>
+          <w:i w:val="false"/>
+          <w:iCs w:val="false"/>
+        </w:rPr>
+      </w:pPr>
+      <w:r>
+        <w:rPr>
+          <w:rFonts w:eastAsia="Noto Serif CJK SC" w:cs="Noto Sans Devanagari" w:ascii="Garamond" w:hAnsi="Garamond"/>
+          <w:i w:val="false"/>
+          <w:iCs w:val="false"/>
+          <w:color w:val="00A0FC"/>
+          <w:kern w:val="2"/>
+          <w:sz w:val="36"/>
+          <w:szCs w:val="36"/>
+          <w:lang w:val="pt-BR" w:eastAsia="zh-CN" w:bidi="hi-IN"/>
+        </w:rPr>
+        <w:t xml:space="preserve">A principal razão para plantas e mesmo alguns animais simples não sentirem dor é a ausência de um cérebro e de um sistema nervoso central. A dor não é produzida no local onde ocorre um machucado, mas sim interpretada e sentida na mente. </w:t>
+      </w:r>
+    </w:p>
+    <w:p>
+      <w:pPr>
+        <w:pStyle w:val="Normal"/>
+        <w:bidi w:val="0"/>
+        <w:ind w:left="709" w:hanging="0"/>
+        <w:jc w:val="both"/>
+        <w:rPr>
+          <w:i w:val="false"/>
+          <w:i w:val="false"/>
+          <w:iCs w:val="false"/>
+        </w:rPr>
+      </w:pPr>
+      <w:r>
+        <w:rPr>
+          <w:i w:val="false"/>
+          <w:iCs w:val="false"/>
+        </w:rPr>
+      </w:r>
+    </w:p>
+    <w:p>
+      <w:pPr>
+        <w:pStyle w:val="Normal"/>
+        <w:bidi w:val="0"/>
+        <w:ind w:left="709" w:hanging="0"/>
+        <w:jc w:val="both"/>
+        <w:rPr>
+          <w:i w:val="false"/>
+          <w:i w:val="false"/>
+          <w:iCs w:val="false"/>
+        </w:rPr>
+      </w:pPr>
+      <w:r>
+        <w:rPr>
+          <w:rFonts w:eastAsia="Noto Serif CJK SC" w:cs="Noto Sans Devanagari" w:ascii="Garamond" w:hAnsi="Garamond"/>
+          <w:i w:val="false"/>
+          <w:iCs w:val="false"/>
+          <w:color w:val="00A0FC"/>
+          <w:kern w:val="2"/>
+          <w:sz w:val="36"/>
+          <w:szCs w:val="36"/>
+          <w:lang w:val="pt-BR" w:eastAsia="zh-CN" w:bidi="hi-IN"/>
+        </w:rPr>
+        <w:t>Sem neurônios para enviar a mensagem e sem um cérebro para transformar esse sinal elétrico em uma sensação de sofrimento, o organismo apenas reage de forma automática e mecânica aos danos, como um alarme de incêndio que toca sem "saber" ou "sentir" o fogo.</w:t>
+      </w:r>
+    </w:p>
+    <w:p>
+      <w:pPr>
+        <w:pStyle w:val="Normal"/>
+        <w:bidi w:val="0"/>
+        <w:ind w:left="709" w:hanging="0"/>
+        <w:jc w:val="both"/>
+        <w:rPr>
+          <w:i w:val="false"/>
+          <w:i w:val="false"/>
+          <w:iCs w:val="false"/>
+        </w:rPr>
+      </w:pPr>
+      <w:r>
+        <w:rPr>
+          <w:i w:val="false"/>
+          <w:iCs w:val="false"/>
+        </w:rPr>
+      </w:r>
+    </w:p>
+    <w:p>
+      <w:pPr>
+        <w:pStyle w:val="Normal"/>
+        <w:bidi w:val="0"/>
+        <w:ind w:left="709" w:hanging="0"/>
+        <w:jc w:val="both"/>
+        <w:rPr>
+          <w:i w:val="false"/>
+          <w:i w:val="false"/>
+          <w:iCs w:val="false"/>
+        </w:rPr>
+      </w:pPr>
+      <w:r>
+        <w:rPr>
+          <w:rFonts w:eastAsia="Noto Serif CJK SC" w:cs="Noto Sans Devanagari" w:ascii="Garamond" w:hAnsi="Garamond"/>
+          <w:i w:val="false"/>
+          <w:iCs w:val="false"/>
+          <w:color w:val="00A0FC"/>
+          <w:kern w:val="2"/>
+          <w:sz w:val="36"/>
+          <w:szCs w:val="36"/>
+          <w:lang w:val="pt-BR" w:eastAsia="zh-CN" w:bidi="hi-IN"/>
+        </w:rPr>
+        <w:t>É com base nesse princípio que muitas vezes os médicos se utilizam da produção de dor para comprovar a morte cerebral de uma pessoa. A medicina chama isso de estímulo sem resposta supraespinhal.</w:t>
+      </w:r>
+    </w:p>
+    <w:p>
+      <w:pPr>
+        <w:pStyle w:val="Normal"/>
+        <w:bidi w:val="0"/>
+        <w:ind w:left="709" w:hanging="0"/>
+        <w:jc w:val="both"/>
+        <w:rPr>
+          <w:i w:val="false"/>
+          <w:i w:val="false"/>
+          <w:iCs w:val="false"/>
+        </w:rPr>
+      </w:pPr>
+      <w:r>
+        <w:rPr>
+          <w:i w:val="false"/>
+          <w:iCs w:val="false"/>
+        </w:rPr>
+      </w:r>
+    </w:p>
+    <w:p>
+      <w:pPr>
+        <w:pStyle w:val="Normal"/>
+        <w:bidi w:val="0"/>
+        <w:ind w:left="709" w:hanging="0"/>
+        <w:jc w:val="both"/>
+        <w:rPr>
+          <w:i w:val="false"/>
+          <w:i w:val="false"/>
+          <w:iCs w:val="false"/>
+        </w:rPr>
+      </w:pPr>
+      <w:r>
+        <w:rPr>
+          <w:rFonts w:eastAsia="Noto Serif CJK SC" w:cs="Noto Sans Devanagari" w:ascii="Garamond" w:hAnsi="Garamond"/>
+          <w:i w:val="false"/>
+          <w:iCs w:val="false"/>
+          <w:color w:val="00A0FC"/>
+          <w:kern w:val="2"/>
+          <w:sz w:val="36"/>
+          <w:szCs w:val="36"/>
+          <w:lang w:val="pt-BR" w:eastAsia="zh-CN" w:bidi="hi-IN"/>
+        </w:rPr>
+        <w:t>O médico aplica estímulos intensos (como uma pressão forte sobre a região acima do olho ou no tórax). Em uma pessoa viva ou apenas em coma profundo, esses estímulos desencadeiam reações organizadas pelo cérebro (como franzir a testa, tentar afastar a mão do médico ou gemer). Na morte cerebral, como não há cérebro para "sentir" a dor, o corpo permanece completamente imóvel e sem qualquer reação emocional ou de proteção.</w:t>
+      </w:r>
+    </w:p>
+    <w:p>
+      <w:pPr>
+        <w:pStyle w:val="Normal"/>
+        <w:bidi w:val="0"/>
+        <w:ind w:left="709" w:hanging="0"/>
+        <w:jc w:val="both"/>
+        <w:rPr>
+          <w:i w:val="false"/>
+          <w:i w:val="false"/>
+          <w:iCs w:val="false"/>
+        </w:rPr>
+      </w:pPr>
+      <w:r>
+        <w:rPr>
+          <w:i w:val="false"/>
+          <w:iCs w:val="false"/>
+        </w:rPr>
+      </w:r>
+    </w:p>
+    <w:p>
+      <w:pPr>
+        <w:pStyle w:val="Normal"/>
+        <w:bidi w:val="0"/>
+        <w:ind w:left="709" w:hanging="0"/>
+        <w:jc w:val="both"/>
+        <w:rPr>
+          <w:i w:val="false"/>
+          <w:i w:val="false"/>
+          <w:iCs w:val="false"/>
+        </w:rPr>
+      </w:pPr>
+      <w:r>
+        <w:rPr>
+          <w:rFonts w:eastAsia="Noto Serif CJK SC" w:cs="Noto Sans Devanagari" w:ascii="Garamond" w:hAnsi="Garamond"/>
+          <w:i w:val="false"/>
+          <w:iCs w:val="false"/>
+          <w:color w:val="00A0FC"/>
+          <w:kern w:val="2"/>
+          <w:sz w:val="36"/>
+          <w:szCs w:val="36"/>
+          <w:lang w:val="pt-BR" w:eastAsia="zh-CN" w:bidi="hi-IN"/>
+        </w:rPr>
+        <w:t>Então, como as plantas não têm cérebro nem sistema nervoso central, naturalmente elas não experimentam qualquer tipo de sensação, além das de ordem física.</w:t>
+      </w:r>
+    </w:p>
+    <w:p>
+      <w:pPr>
+        <w:pStyle w:val="Normal"/>
+        <w:bidi w:val="0"/>
+        <w:ind w:left="709" w:hanging="0"/>
+        <w:jc w:val="both"/>
+        <w:rPr>
+          <w:i w:val="false"/>
+          <w:i w:val="false"/>
+          <w:iCs w:val="false"/>
+        </w:rPr>
+      </w:pPr>
+      <w:r>
+        <w:rPr>
+          <w:i w:val="false"/>
+          <w:iCs w:val="false"/>
+        </w:rPr>
+      </w:r>
+    </w:p>
+    <w:p>
+      <w:pPr>
+        <w:pStyle w:val="Normal"/>
+        <w:bidi w:val="0"/>
+        <w:jc w:val="both"/>
+        <w:rPr>
+          <w:rFonts w:ascii="Garamond" w:hAnsi="Garamond"/>
+          <w:sz w:val="36"/>
+          <w:szCs w:val="36"/>
+        </w:rPr>
+      </w:pPr>
+      <w:r>
+        <w:rPr>
+          <w:rFonts w:eastAsia="Noto Serif CJK SC" w:cs="Noto Sans Devanagari" w:ascii="Garamond" w:hAnsi="Garamond"/>
+          <w:color w:val="auto"/>
+          <w:kern w:val="2"/>
+          <w:sz w:val="36"/>
+          <w:szCs w:val="36"/>
+          <w:lang w:val="pt-BR" w:eastAsia="zh-CN" w:bidi="hi-IN"/>
+        </w:rPr>
+        <w:t>588</w:t>
+      </w:r>
+      <w:r>
+        <w:rPr>
+          <w:rFonts w:ascii="Garamond" w:hAnsi="Garamond"/>
+          <w:sz w:val="36"/>
+          <w:szCs w:val="36"/>
+        </w:rPr>
+        <w:t>. Independe da vontade delas a força que as atrai umas para as outras?</w:t>
+      </w:r>
+    </w:p>
+    <w:p>
+      <w:pPr>
+        <w:pStyle w:val="Normal"/>
+        <w:bidi w:val="0"/>
+        <w:jc w:val="both"/>
+        <w:rPr>
+          <w:rFonts w:ascii="Garamond" w:hAnsi="Garamond"/>
+          <w:sz w:val="36"/>
+          <w:szCs w:val="36"/>
+        </w:rPr>
+      </w:pPr>
+      <w:r>
+        <w:rPr>
+          <w:rFonts w:ascii="Garamond" w:hAnsi="Garamond"/>
+          <w:sz w:val="36"/>
+          <w:szCs w:val="36"/>
+        </w:rPr>
+      </w:r>
+    </w:p>
+    <w:p>
+      <w:pPr>
+        <w:pStyle w:val="Normal"/>
+        <w:bidi w:val="0"/>
+        <w:ind w:hanging="0"/>
+        <w:jc w:val="both"/>
+        <w:rPr>
+          <w:rFonts w:ascii="Garamond" w:hAnsi="Garamond"/>
+          <w:sz w:val="36"/>
+          <w:szCs w:val="36"/>
+        </w:rPr>
+      </w:pPr>
       <w:r>
         <w:rPr>
           <w:rFonts w:ascii="Garamond" w:hAnsi="Garamond"/>
@@ -1653,7 +1928,7 @@
           <w:sz w:val="36"/>
           <w:szCs w:val="36"/>
         </w:rPr>
-        <w:t xml:space="preserve"> </w:t>
+        <w:t>“</w:t>
       </w:r>
       <w:r>
         <w:rPr>
@@ -1663,496 +1938,354 @@
           <w:sz w:val="36"/>
           <w:szCs w:val="36"/>
         </w:rPr>
-        <w:t>têm percepções. Conseguintemente, não têm a sensação da dor.”</w:t>
-      </w:r>
-    </w:p>
-    <w:p>
-      <w:pPr>
-        <w:pStyle w:val="Normal"/>
-        <w:bidi w:val="0"/>
-        <w:ind w:hanging="0"/>
-        <w:jc w:val="both"/>
-        <w:rPr>
-          <w:rFonts w:ascii="Garamond" w:hAnsi="Garamond"/>
-          <w:sz w:val="36"/>
-          <w:szCs w:val="36"/>
-        </w:rPr>
-      </w:pPr>
-      <w:r>
-        <w:rPr>
-          <w:rFonts w:ascii="Garamond" w:hAnsi="Garamond"/>
-          <w:sz w:val="36"/>
-          <w:szCs w:val="36"/>
-        </w:rPr>
-      </w:r>
-    </w:p>
-    <w:p>
-      <w:pPr>
-        <w:pStyle w:val="Normal"/>
-        <w:bidi w:val="0"/>
-        <w:ind w:left="709" w:hanging="0"/>
-        <w:jc w:val="both"/>
-        <w:rPr>
-          <w:i w:val="false"/>
-          <w:i w:val="false"/>
-          <w:iCs w:val="false"/>
-        </w:rPr>
-      </w:pPr>
-      <w:r>
-        <w:rPr>
-          <w:rFonts w:eastAsia="Noto Serif CJK SC" w:cs="Noto Sans Devanagari" w:ascii="Garamond" w:hAnsi="Garamond"/>
-          <w:i w:val="false"/>
-          <w:iCs w:val="false"/>
-          <w:color w:val="00A0FC"/>
-          <w:kern w:val="2"/>
-          <w:sz w:val="36"/>
-          <w:szCs w:val="36"/>
-          <w:lang w:val="pt-BR" w:eastAsia="zh-CN" w:bidi="hi-IN"/>
-        </w:rPr>
-        <w:t>Na resposta anterior, a Espiritualidade deixou claro que as plantas não têm consciência de si, não são dotadas de nenhuma forma de pensamento; somente possuem a vida orgânica.</w:t>
-      </w:r>
-    </w:p>
-    <w:p>
-      <w:pPr>
-        <w:pStyle w:val="Normal"/>
-        <w:bidi w:val="0"/>
-        <w:ind w:left="709" w:hanging="0"/>
-        <w:jc w:val="both"/>
-        <w:rPr>
-          <w:i w:val="false"/>
-          <w:i w:val="false"/>
-          <w:iCs w:val="false"/>
-        </w:rPr>
-      </w:pPr>
-      <w:r>
-        <w:rPr/>
-      </w:r>
-    </w:p>
-    <w:p>
-      <w:pPr>
-        <w:pStyle w:val="Normal"/>
-        <w:bidi w:val="0"/>
-        <w:ind w:left="709" w:hanging="0"/>
-        <w:jc w:val="both"/>
-        <w:rPr>
-          <w:i w:val="false"/>
-          <w:i w:val="false"/>
-          <w:iCs w:val="false"/>
-        </w:rPr>
-      </w:pPr>
-      <w:r>
-        <w:rPr>
-          <w:rFonts w:eastAsia="Noto Serif CJK SC" w:cs="Noto Sans Devanagari" w:ascii="Garamond" w:hAnsi="Garamond"/>
-          <w:i w:val="false"/>
-          <w:iCs w:val="false"/>
-          <w:color w:val="00A0FC"/>
-          <w:kern w:val="2"/>
-          <w:sz w:val="36"/>
-          <w:szCs w:val="36"/>
-          <w:lang w:val="pt-BR" w:eastAsia="zh-CN" w:bidi="hi-IN"/>
-        </w:rPr>
-        <w:t xml:space="preserve">E aí Kardec deseja saber se, mesmo tendo apenas a vitalidade, as plantas </w:t>
-      </w:r>
-      <w:r>
-        <w:rPr>
-          <w:rFonts w:eastAsia="Noto Serif CJK SC" w:cs="Noto Sans Devanagari" w:ascii="Garamond" w:hAnsi="Garamond"/>
-          <w:i w:val="false"/>
-          <w:iCs w:val="false"/>
-          <w:color w:val="00A0FC"/>
-          <w:kern w:val="2"/>
-          <w:sz w:val="36"/>
-          <w:szCs w:val="36"/>
-          <w:lang w:val="pt-BR" w:eastAsia="zh-CN" w:bidi="hi-IN"/>
-        </w:rPr>
-        <w:t>tem algum tipo de sensação, e se poderiam eventualmente sentir dor.</w:t>
-      </w:r>
-    </w:p>
-    <w:p>
-      <w:pPr>
-        <w:pStyle w:val="Normal"/>
-        <w:bidi w:val="0"/>
-        <w:ind w:left="709" w:hanging="0"/>
-        <w:jc w:val="both"/>
-        <w:rPr>
-          <w:i w:val="false"/>
-          <w:i w:val="false"/>
-          <w:iCs w:val="false"/>
-        </w:rPr>
-      </w:pPr>
-      <w:r>
-        <w:rPr/>
-      </w:r>
-    </w:p>
-    <w:p>
-      <w:pPr>
-        <w:pStyle w:val="Normal"/>
-        <w:bidi w:val="0"/>
-        <w:ind w:left="709" w:hanging="0"/>
-        <w:jc w:val="both"/>
-        <w:rPr>
-          <w:i w:val="false"/>
-          <w:i w:val="false"/>
-          <w:iCs w:val="false"/>
-        </w:rPr>
-      </w:pPr>
-      <w:r>
-        <w:rPr>
-          <w:rFonts w:eastAsia="Noto Serif CJK SC" w:cs="Noto Sans Devanagari" w:ascii="Garamond" w:hAnsi="Garamond"/>
-          <w:i w:val="false"/>
-          <w:iCs w:val="false"/>
-          <w:color w:val="00A0FC"/>
-          <w:kern w:val="2"/>
-          <w:sz w:val="36"/>
-          <w:szCs w:val="36"/>
-          <w:lang w:val="pt-BR" w:eastAsia="zh-CN" w:bidi="hi-IN"/>
-        </w:rPr>
-        <w:t>A Espiritualidade diz que não, as plantas não sentem dor. O que quer que façamos a elas - arrancá-las da terra, desfolhá-las, cortá-las a machado ou serra, tudo fica restrito ao campo físico. Em outras palavras: serão somente impressões físicas. Nenhuma percepção, nada de dor.</w:t>
-      </w:r>
-    </w:p>
-    <w:p>
-      <w:pPr>
-        <w:pStyle w:val="Normal"/>
-        <w:bidi w:val="0"/>
-        <w:ind w:left="709" w:hanging="0"/>
-        <w:jc w:val="both"/>
-        <w:rPr>
-          <w:i w:val="false"/>
-          <w:i w:val="false"/>
-          <w:iCs w:val="false"/>
-        </w:rPr>
-      </w:pPr>
-      <w:r>
-        <w:rPr/>
-      </w:r>
-    </w:p>
-    <w:p>
-      <w:pPr>
-        <w:pStyle w:val="Normal"/>
-        <w:bidi w:val="0"/>
-        <w:ind w:left="709" w:hanging="0"/>
-        <w:jc w:val="both"/>
-        <w:rPr>
-          <w:i w:val="false"/>
-          <w:i w:val="false"/>
-          <w:iCs w:val="false"/>
-        </w:rPr>
-      </w:pPr>
-      <w:r>
-        <w:rPr>
-          <w:rFonts w:eastAsia="Noto Serif CJK SC" w:cs="Noto Sans Devanagari" w:ascii="Garamond" w:hAnsi="Garamond"/>
-          <w:i w:val="false"/>
-          <w:iCs w:val="false"/>
-          <w:color w:val="00A0FC"/>
-          <w:kern w:val="2"/>
-          <w:sz w:val="36"/>
-          <w:szCs w:val="36"/>
-          <w:lang w:val="pt-BR" w:eastAsia="zh-CN" w:bidi="hi-IN"/>
-        </w:rPr>
-        <w:t>Embora muitas vezes a Ciência ignore ou mesmo despreze o lado espiritual das coisas, nessa pergunta de Kardec, ela corrobora a resposta da Espiritualidade.</w:t>
-      </w:r>
-    </w:p>
-    <w:p>
-      <w:pPr>
-        <w:pStyle w:val="Normal"/>
-        <w:bidi w:val="0"/>
-        <w:ind w:left="709" w:hanging="0"/>
-        <w:jc w:val="both"/>
-        <w:rPr>
-          <w:i w:val="false"/>
-          <w:i w:val="false"/>
-          <w:iCs w:val="false"/>
-        </w:rPr>
-      </w:pPr>
-      <w:r>
-        <w:rPr/>
-      </w:r>
-    </w:p>
-    <w:p>
-      <w:pPr>
-        <w:pStyle w:val="Normal"/>
-        <w:bidi w:val="0"/>
-        <w:ind w:left="709" w:hanging="0"/>
-        <w:jc w:val="both"/>
-        <w:rPr>
-          <w:i w:val="false"/>
-          <w:i w:val="false"/>
-          <w:iCs w:val="false"/>
-        </w:rPr>
-      </w:pPr>
-      <w:r>
-        <w:rPr>
-          <w:rFonts w:eastAsia="Noto Serif CJK SC" w:cs="Noto Sans Devanagari" w:ascii="Garamond" w:hAnsi="Garamond"/>
-          <w:i w:val="false"/>
-          <w:iCs w:val="false"/>
-          <w:color w:val="00A0FC"/>
-          <w:kern w:val="2"/>
-          <w:sz w:val="36"/>
-          <w:szCs w:val="36"/>
-          <w:lang w:val="pt-BR" w:eastAsia="zh-CN" w:bidi="hi-IN"/>
-        </w:rPr>
-        <w:t xml:space="preserve">A principal razão para plantas e </w:t>
-      </w:r>
-      <w:r>
-        <w:rPr>
-          <w:rFonts w:eastAsia="Noto Serif CJK SC" w:cs="Noto Sans Devanagari" w:ascii="Garamond" w:hAnsi="Garamond"/>
-          <w:i w:val="false"/>
-          <w:iCs w:val="false"/>
-          <w:color w:val="00A0FC"/>
-          <w:kern w:val="2"/>
-          <w:sz w:val="36"/>
-          <w:szCs w:val="36"/>
-          <w:lang w:val="pt-BR" w:eastAsia="zh-CN" w:bidi="hi-IN"/>
-        </w:rPr>
-        <w:t xml:space="preserve">mesmo </w:t>
-      </w:r>
-      <w:r>
-        <w:rPr>
-          <w:rFonts w:eastAsia="Noto Serif CJK SC" w:cs="Noto Sans Devanagari" w:ascii="Garamond" w:hAnsi="Garamond"/>
-          <w:i w:val="false"/>
-          <w:iCs w:val="false"/>
-          <w:color w:val="00A0FC"/>
-          <w:kern w:val="2"/>
-          <w:sz w:val="36"/>
-          <w:szCs w:val="36"/>
-          <w:lang w:val="pt-BR" w:eastAsia="zh-CN" w:bidi="hi-IN"/>
-        </w:rPr>
-        <w:t xml:space="preserve">alguns animais simples não sentirem dor é a ausência de um cérebro e de um sistema nervoso central. A dor não é produzida no local onde ocorre um machucado, mas sim interpretada e sentida na mente. </w:t>
-      </w:r>
-    </w:p>
-    <w:p>
-      <w:pPr>
-        <w:pStyle w:val="Normal"/>
-        <w:bidi w:val="0"/>
-        <w:ind w:left="709" w:hanging="0"/>
-        <w:jc w:val="both"/>
-        <w:rPr>
-          <w:i w:val="false"/>
-          <w:i w:val="false"/>
-          <w:iCs w:val="false"/>
-        </w:rPr>
-      </w:pPr>
-      <w:r>
-        <w:rPr/>
-      </w:r>
-    </w:p>
-    <w:p>
-      <w:pPr>
-        <w:pStyle w:val="Normal"/>
-        <w:bidi w:val="0"/>
-        <w:ind w:left="709" w:hanging="0"/>
-        <w:jc w:val="both"/>
-        <w:rPr>
-          <w:i w:val="false"/>
-          <w:i w:val="false"/>
-          <w:iCs w:val="false"/>
-        </w:rPr>
-      </w:pPr>
-      <w:r>
-        <w:rPr>
-          <w:rFonts w:eastAsia="Noto Serif CJK SC" w:cs="Noto Sans Devanagari" w:ascii="Garamond" w:hAnsi="Garamond"/>
-          <w:i w:val="false"/>
-          <w:iCs w:val="false"/>
-          <w:color w:val="00A0FC"/>
-          <w:kern w:val="2"/>
-          <w:sz w:val="36"/>
-          <w:szCs w:val="36"/>
-          <w:lang w:val="pt-BR" w:eastAsia="zh-CN" w:bidi="hi-IN"/>
-        </w:rPr>
-        <w:t>Sem neurônios para enviar a mensagem e sem um cérebro para transformar esse sinal elétrico em uma sensação de sofrimento, o organismo apenas reage de forma automática e mecânica aos danos, como um alarme de incêndio que toca sem "saber" ou "sentir" o fogo.</w:t>
-      </w:r>
-    </w:p>
-    <w:p>
-      <w:pPr>
-        <w:pStyle w:val="Normal"/>
-        <w:bidi w:val="0"/>
-        <w:ind w:left="709" w:hanging="0"/>
-        <w:jc w:val="both"/>
-        <w:rPr>
-          <w:i w:val="false"/>
-          <w:i w:val="false"/>
-          <w:iCs w:val="false"/>
-        </w:rPr>
-      </w:pPr>
-      <w:r>
-        <w:rPr/>
-      </w:r>
-    </w:p>
-    <w:p>
-      <w:pPr>
-        <w:pStyle w:val="Normal"/>
-        <w:bidi w:val="0"/>
-        <w:ind w:left="709" w:hanging="0"/>
-        <w:jc w:val="both"/>
-        <w:rPr>
-          <w:i w:val="false"/>
-          <w:i w:val="false"/>
-          <w:iCs w:val="false"/>
-        </w:rPr>
-      </w:pPr>
-      <w:r>
-        <w:rPr>
-          <w:rFonts w:eastAsia="Noto Serif CJK SC" w:cs="Noto Sans Devanagari" w:ascii="Garamond" w:hAnsi="Garamond"/>
-          <w:i w:val="false"/>
-          <w:iCs w:val="false"/>
-          <w:color w:val="00A0FC"/>
-          <w:kern w:val="2"/>
-          <w:sz w:val="36"/>
-          <w:szCs w:val="36"/>
-          <w:lang w:val="pt-BR" w:eastAsia="zh-CN" w:bidi="hi-IN"/>
-        </w:rPr>
-        <w:t>É</w:t>
-      </w:r>
-      <w:r>
-        <w:rPr>
-          <w:rFonts w:eastAsia="Noto Serif CJK SC" w:cs="Noto Sans Devanagari" w:ascii="Garamond" w:hAnsi="Garamond"/>
-          <w:i w:val="false"/>
-          <w:iCs w:val="false"/>
-          <w:color w:val="00A0FC"/>
-          <w:kern w:val="2"/>
-          <w:sz w:val="36"/>
-          <w:szCs w:val="36"/>
-          <w:lang w:val="pt-BR" w:eastAsia="zh-CN" w:bidi="hi-IN"/>
-        </w:rPr>
-        <w:t xml:space="preserve"> com base nesse princípio que muitas vezes os médicos se utilizam da produção de dor para comprovar a morte cerebral de uma pessoa. A medicina chama isso de</w:t>
-      </w:r>
-      <w:r>
-        <w:rPr>
-          <w:rFonts w:eastAsia="Noto Serif CJK SC" w:cs="Noto Sans Devanagari" w:ascii="Garamond" w:hAnsi="Garamond"/>
-          <w:i w:val="false"/>
-          <w:iCs w:val="false"/>
-          <w:color w:val="00A0FC"/>
-          <w:kern w:val="2"/>
-          <w:sz w:val="36"/>
-          <w:szCs w:val="36"/>
-          <w:lang w:val="pt-BR" w:eastAsia="zh-CN" w:bidi="hi-IN"/>
-        </w:rPr>
-        <w:t xml:space="preserve"> estímulo sem resposta supraespinhal</w:t>
-      </w:r>
-      <w:r>
-        <w:rPr>
-          <w:rFonts w:eastAsia="Noto Serif CJK SC" w:cs="Noto Sans Devanagari" w:ascii="Garamond" w:hAnsi="Garamond"/>
-          <w:i w:val="false"/>
-          <w:iCs w:val="false"/>
-          <w:color w:val="00A0FC"/>
-          <w:kern w:val="2"/>
-          <w:sz w:val="36"/>
-          <w:szCs w:val="36"/>
-          <w:lang w:val="pt-BR" w:eastAsia="zh-CN" w:bidi="hi-IN"/>
-        </w:rPr>
-        <w:t>.</w:t>
-      </w:r>
-    </w:p>
-    <w:p>
-      <w:pPr>
-        <w:pStyle w:val="Normal"/>
-        <w:bidi w:val="0"/>
-        <w:ind w:left="709" w:hanging="0"/>
-        <w:jc w:val="both"/>
-        <w:rPr>
-          <w:i w:val="false"/>
-          <w:i w:val="false"/>
-          <w:iCs w:val="false"/>
-        </w:rPr>
-      </w:pPr>
-      <w:r>
-        <w:rPr/>
-      </w:r>
-    </w:p>
-    <w:p>
-      <w:pPr>
-        <w:pStyle w:val="Normal"/>
-        <w:bidi w:val="0"/>
-        <w:ind w:left="709" w:hanging="0"/>
-        <w:jc w:val="both"/>
-        <w:rPr>
-          <w:i w:val="false"/>
-          <w:i w:val="false"/>
-          <w:iCs w:val="false"/>
-        </w:rPr>
-      </w:pPr>
-      <w:r>
-        <w:rPr>
-          <w:rFonts w:eastAsia="Noto Serif CJK SC" w:cs="Noto Sans Devanagari" w:ascii="Garamond" w:hAnsi="Garamond"/>
-          <w:i w:val="false"/>
-          <w:iCs w:val="false"/>
-          <w:color w:val="00A0FC"/>
-          <w:kern w:val="2"/>
-          <w:sz w:val="36"/>
-          <w:szCs w:val="36"/>
-          <w:lang w:val="pt-BR" w:eastAsia="zh-CN" w:bidi="hi-IN"/>
-        </w:rPr>
-        <w:t>O</w:t>
-      </w:r>
-      <w:r>
-        <w:rPr>
-          <w:rFonts w:eastAsia="Noto Serif CJK SC" w:cs="Noto Sans Devanagari" w:ascii="Garamond" w:hAnsi="Garamond"/>
-          <w:i w:val="false"/>
-          <w:iCs w:val="false"/>
-          <w:color w:val="00A0FC"/>
-          <w:kern w:val="2"/>
-          <w:sz w:val="36"/>
-          <w:szCs w:val="36"/>
-          <w:lang w:val="pt-BR" w:eastAsia="zh-CN" w:bidi="hi-IN"/>
-        </w:rPr>
-        <w:t xml:space="preserve"> médico aplica estímulos intensos (como uma pressão forte sobre a região acima do olho ou no tórax). Em uma pessoa viva ou apenas em coma profundo, esses estímulos desencadeiam reações organizadas pelo cérebro (como franzir a testa, tentar afastar a mão do médico ou gemer). Na morte cerebral, como não há cérebro para "sentir" a dor, o corpo permanece completamente imóvel e sem qualquer reação emocional ou de proteção.</w:t>
-      </w:r>
-    </w:p>
-    <w:p>
-      <w:pPr>
-        <w:pStyle w:val="Normal"/>
-        <w:bidi w:val="0"/>
-        <w:ind w:left="709" w:hanging="0"/>
-        <w:jc w:val="both"/>
-        <w:rPr>
-          <w:i w:val="false"/>
-          <w:i w:val="false"/>
-          <w:iCs w:val="false"/>
-        </w:rPr>
-      </w:pPr>
-      <w:r>
-        <w:rPr/>
-      </w:r>
-    </w:p>
-    <w:p>
-      <w:pPr>
-        <w:pStyle w:val="Normal"/>
-        <w:bidi w:val="0"/>
-        <w:ind w:left="709" w:hanging="0"/>
-        <w:jc w:val="both"/>
-        <w:rPr>
-          <w:i w:val="false"/>
-          <w:i w:val="false"/>
-          <w:iCs w:val="false"/>
-        </w:rPr>
-      </w:pPr>
-      <w:r>
-        <w:rPr>
-          <w:rFonts w:eastAsia="Noto Serif CJK SC" w:cs="Noto Sans Devanagari" w:ascii="Garamond" w:hAnsi="Garamond"/>
-          <w:i w:val="false"/>
-          <w:iCs w:val="false"/>
-          <w:color w:val="00A0FC"/>
-          <w:kern w:val="2"/>
-          <w:sz w:val="36"/>
-          <w:szCs w:val="36"/>
-          <w:lang w:val="pt-BR" w:eastAsia="zh-CN" w:bidi="hi-IN"/>
-        </w:rPr>
-        <w:t>Então, como as plantas não têm cérebro nem sistema nervoso central, naturalmente elas não experimentam qualquer tipo de sensação, além das de ordem física.</w:t>
-      </w:r>
-    </w:p>
-    <w:p>
-      <w:pPr>
-        <w:pStyle w:val="Normal"/>
-        <w:bidi w:val="0"/>
-        <w:ind w:left="709" w:hanging="0"/>
-        <w:jc w:val="both"/>
-        <w:rPr>
-          <w:i w:val="false"/>
-          <w:i w:val="false"/>
-          <w:iCs w:val="false"/>
-        </w:rPr>
-      </w:pPr>
-      <w:r>
-        <w:rPr/>
+        <w:t>Certo, porquanto não pensam. É uma força mecânica da matéria, que atua sobre a matéria, sem que elas possam a isso opor-se.”</w:t>
+      </w:r>
+    </w:p>
+    <w:p>
+      <w:pPr>
+        <w:pStyle w:val="Normal"/>
+        <w:bidi w:val="0"/>
+        <w:ind w:left="709" w:hanging="0"/>
+        <w:jc w:val="both"/>
+        <w:rPr>
+          <w:rFonts w:ascii="Garamond" w:hAnsi="Garamond" w:eastAsia="Noto Serif CJK SC" w:cs="Noto Sans Devanagari"/>
+          <w:i w:val="false"/>
+          <w:i w:val="false"/>
+          <w:iCs w:val="false"/>
+          <w:color w:val="00A0FC"/>
+          <w:kern w:val="2"/>
+          <w:sz w:val="36"/>
+          <w:szCs w:val="36"/>
+          <w:lang w:val="pt-BR" w:eastAsia="zh-CN" w:bidi="hi-IN"/>
+        </w:rPr>
+      </w:pPr>
+      <w:r>
+        <w:rPr>
+          <w:rFonts w:eastAsia="Noto Serif CJK SC" w:cs="Noto Sans Devanagari" w:ascii="Garamond" w:hAnsi="Garamond"/>
+          <w:i w:val="false"/>
+          <w:iCs w:val="false"/>
+          <w:color w:val="00A0FC"/>
+          <w:kern w:val="2"/>
+          <w:sz w:val="36"/>
+          <w:szCs w:val="36"/>
+          <w:lang w:val="pt-BR" w:eastAsia="zh-CN" w:bidi="hi-IN"/>
+        </w:rPr>
+      </w:r>
+    </w:p>
+    <w:p>
+      <w:pPr>
+        <w:pStyle w:val="Normal"/>
+        <w:bidi w:val="0"/>
+        <w:ind w:left="709" w:hanging="0"/>
+        <w:jc w:val="both"/>
+        <w:rPr>
+          <w:rFonts w:ascii="Garamond" w:hAnsi="Garamond"/>
+          <w:color w:val="00A0FC"/>
+          <w:sz w:val="36"/>
+          <w:szCs w:val="36"/>
+        </w:rPr>
+      </w:pPr>
+      <w:r>
+        <w:rPr>
+          <w:rFonts w:eastAsia="Noto Serif CJK SC" w:cs="Noto Sans Devanagari" w:ascii="Garamond" w:hAnsi="Garamond"/>
+          <w:i w:val="false"/>
+          <w:iCs w:val="false"/>
+          <w:color w:val="00A0FC"/>
+          <w:kern w:val="2"/>
+          <w:sz w:val="36"/>
+          <w:szCs w:val="36"/>
+          <w:lang w:val="pt-BR" w:eastAsia="zh-CN" w:bidi="hi-IN"/>
+        </w:rPr>
+        <w:t>A pergunta de Kardec se refere ao comportamento que algumas plantas têm de buscar outras plantas ou de se direcionar para um alvo específico.</w:t>
+      </w:r>
+    </w:p>
+    <w:p>
+      <w:pPr>
+        <w:pStyle w:val="Normal"/>
+        <w:bidi w:val="0"/>
+        <w:ind w:left="709" w:hanging="0"/>
+        <w:jc w:val="both"/>
+        <w:rPr>
+          <w:rFonts w:ascii="Garamond" w:hAnsi="Garamond"/>
+          <w:color w:val="00A0FC"/>
+          <w:sz w:val="36"/>
+          <w:szCs w:val="36"/>
+        </w:rPr>
+      </w:pPr>
+      <w:r>
+        <w:rPr>
+          <w:rFonts w:ascii="Garamond" w:hAnsi="Garamond"/>
+          <w:color w:val="00A0FC"/>
+          <w:sz w:val="36"/>
+          <w:szCs w:val="36"/>
+        </w:rPr>
+      </w:r>
+    </w:p>
+    <w:p>
+      <w:pPr>
+        <w:pStyle w:val="Normal"/>
+        <w:bidi w:val="0"/>
+        <w:ind w:left="709" w:hanging="0"/>
+        <w:jc w:val="both"/>
+        <w:rPr>
+          <w:rFonts w:ascii="Garamond" w:hAnsi="Garamond"/>
+          <w:color w:val="00A0FC"/>
+          <w:sz w:val="36"/>
+          <w:szCs w:val="36"/>
+        </w:rPr>
+      </w:pPr>
+      <w:r>
+        <w:rPr>
+          <w:rFonts w:eastAsia="Noto Serif CJK SC" w:cs="Noto Sans Devanagari" w:ascii="Garamond" w:hAnsi="Garamond"/>
+          <w:i w:val="false"/>
+          <w:iCs w:val="false"/>
+          <w:color w:val="00A0FC"/>
+          <w:kern w:val="2"/>
+          <w:sz w:val="36"/>
+          <w:szCs w:val="36"/>
+          <w:lang w:val="pt-BR" w:eastAsia="zh-CN" w:bidi="hi-IN"/>
+        </w:rPr>
+        <w:t>É o caso, por exemplo, de plantas parasitas, que se movem em direção aos seus hospedeiros, e de  trepadeiras, que buscam sustentação em outras plantas ou mesmo em objetos.</w:t>
+      </w:r>
+    </w:p>
+    <w:p>
+      <w:pPr>
+        <w:pStyle w:val="Normal"/>
+        <w:bidi w:val="0"/>
+        <w:ind w:left="709" w:hanging="0"/>
+        <w:jc w:val="both"/>
+        <w:rPr>
+          <w:rFonts w:ascii="Garamond" w:hAnsi="Garamond"/>
+          <w:color w:val="00A0FC"/>
+          <w:sz w:val="36"/>
+          <w:szCs w:val="36"/>
+        </w:rPr>
+      </w:pPr>
+      <w:r>
+        <w:rPr>
+          <w:rFonts w:ascii="Garamond" w:hAnsi="Garamond"/>
+          <w:color w:val="00A0FC"/>
+          <w:sz w:val="36"/>
+          <w:szCs w:val="36"/>
+        </w:rPr>
+      </w:r>
+    </w:p>
+    <w:p>
+      <w:pPr>
+        <w:pStyle w:val="Normal"/>
+        <w:bidi w:val="0"/>
+        <w:ind w:left="709" w:hanging="0"/>
+        <w:jc w:val="both"/>
+        <w:rPr>
+          <w:rFonts w:ascii="Garamond" w:hAnsi="Garamond"/>
+          <w:color w:val="00A0FC"/>
+          <w:sz w:val="36"/>
+          <w:szCs w:val="36"/>
+        </w:rPr>
+      </w:pPr>
+      <w:r>
+        <w:rPr>
+          <w:rFonts w:eastAsia="Noto Serif CJK SC" w:cs="Noto Sans Devanagari" w:ascii="Garamond" w:hAnsi="Garamond"/>
+          <w:i w:val="false"/>
+          <w:iCs w:val="false"/>
+          <w:color w:val="00A0FC"/>
+          <w:kern w:val="2"/>
+          <w:sz w:val="36"/>
+          <w:szCs w:val="36"/>
+          <w:lang w:val="pt-BR" w:eastAsia="zh-CN" w:bidi="hi-IN"/>
+        </w:rPr>
+        <w:t>Kardec quer saber se tais plantas têm algum tipo de controle sobre esses movimentos, ou se eles acontecem contra a vontade delas.</w:t>
+      </w:r>
+    </w:p>
+    <w:p>
+      <w:pPr>
+        <w:pStyle w:val="Normal"/>
+        <w:bidi w:val="0"/>
+        <w:ind w:left="709" w:hanging="0"/>
+        <w:jc w:val="both"/>
+        <w:rPr>
+          <w:rFonts w:ascii="Garamond" w:hAnsi="Garamond"/>
+          <w:color w:val="00A0FC"/>
+          <w:sz w:val="36"/>
+          <w:szCs w:val="36"/>
+        </w:rPr>
+      </w:pPr>
+      <w:r>
+        <w:rPr>
+          <w:rFonts w:ascii="Garamond" w:hAnsi="Garamond"/>
+          <w:color w:val="00A0FC"/>
+          <w:sz w:val="36"/>
+          <w:szCs w:val="36"/>
+        </w:rPr>
+      </w:r>
+    </w:p>
+    <w:p>
+      <w:pPr>
+        <w:pStyle w:val="Normal"/>
+        <w:bidi w:val="0"/>
+        <w:ind w:left="709" w:hanging="0"/>
+        <w:jc w:val="both"/>
+        <w:rPr>
+          <w:rFonts w:ascii="Garamond" w:hAnsi="Garamond"/>
+          <w:color w:val="00A0FC"/>
+          <w:sz w:val="36"/>
+          <w:szCs w:val="36"/>
+        </w:rPr>
+      </w:pPr>
+      <w:r>
+        <w:rPr>
+          <w:rFonts w:eastAsia="Noto Serif CJK SC" w:cs="Noto Sans Devanagari" w:ascii="Garamond" w:hAnsi="Garamond"/>
+          <w:i w:val="false"/>
+          <w:iCs w:val="false"/>
+          <w:color w:val="00A0FC"/>
+          <w:kern w:val="2"/>
+          <w:sz w:val="36"/>
+          <w:szCs w:val="36"/>
+          <w:lang w:val="pt-BR" w:eastAsia="zh-CN" w:bidi="hi-IN"/>
+        </w:rPr>
+        <w:t>E a Espiritualidade responde que trata-se exclusivamente de um movimento mecânico atuando na matéria. As plantas não têm nem vontade própria para realizar esses movimentos, e muito menos força para se opor a eles.</w:t>
+      </w:r>
+    </w:p>
+    <w:p>
+      <w:pPr>
+        <w:pStyle w:val="Normal"/>
+        <w:bidi w:val="0"/>
+        <w:ind w:left="709" w:hanging="0"/>
+        <w:jc w:val="both"/>
+        <w:rPr>
+          <w:rFonts w:ascii="Garamond" w:hAnsi="Garamond"/>
+          <w:color w:val="00A0FC"/>
+          <w:sz w:val="36"/>
+          <w:szCs w:val="36"/>
+        </w:rPr>
+      </w:pPr>
+      <w:r>
+        <w:rPr>
+          <w:rFonts w:ascii="Garamond" w:hAnsi="Garamond"/>
+          <w:color w:val="00A0FC"/>
+          <w:sz w:val="36"/>
+          <w:szCs w:val="36"/>
+        </w:rPr>
+      </w:r>
+    </w:p>
+    <w:p>
+      <w:pPr>
+        <w:pStyle w:val="Normal"/>
+        <w:bidi w:val="0"/>
+        <w:ind w:left="709" w:hanging="0"/>
+        <w:jc w:val="both"/>
+        <w:rPr>
+          <w:rFonts w:ascii="Garamond" w:hAnsi="Garamond"/>
+          <w:color w:val="00A0FC"/>
+          <w:sz w:val="36"/>
+          <w:szCs w:val="36"/>
+        </w:rPr>
+      </w:pPr>
+      <w:r>
+        <w:rPr>
+          <w:rFonts w:eastAsia="Noto Serif CJK SC" w:cs="Noto Sans Devanagari" w:ascii="Garamond" w:hAnsi="Garamond"/>
+          <w:i w:val="false"/>
+          <w:iCs w:val="false"/>
+          <w:color w:val="00A0FC"/>
+          <w:kern w:val="2"/>
+          <w:sz w:val="36"/>
+          <w:szCs w:val="36"/>
+          <w:lang w:val="pt-BR" w:eastAsia="zh-CN" w:bidi="hi-IN"/>
+        </w:rPr>
+        <w:t xml:space="preserve">Por essa resposta vemos como Deus é infinitamente sábio. Ele provê Sua criação, mesmo os seres menos evoluídos, com todos os recursos necessários para sua reprodução, crescimento e sobrevivência. </w:t>
+      </w:r>
+    </w:p>
+    <w:p>
+      <w:pPr>
+        <w:pStyle w:val="Normal"/>
+        <w:bidi w:val="0"/>
+        <w:ind w:left="709" w:hanging="0"/>
+        <w:jc w:val="both"/>
+        <w:rPr>
+          <w:rFonts w:ascii="Garamond" w:hAnsi="Garamond"/>
+          <w:color w:val="00A0FC"/>
+          <w:sz w:val="36"/>
+          <w:szCs w:val="36"/>
+        </w:rPr>
+      </w:pPr>
+      <w:r>
+        <w:rPr>
+          <w:rFonts w:ascii="Garamond" w:hAnsi="Garamond"/>
+          <w:color w:val="00A0FC"/>
+          <w:sz w:val="36"/>
+          <w:szCs w:val="36"/>
+        </w:rPr>
+      </w:r>
+    </w:p>
+    <w:p>
+      <w:pPr>
+        <w:pStyle w:val="Normal"/>
+        <w:bidi w:val="0"/>
+        <w:ind w:left="709" w:hanging="0"/>
+        <w:jc w:val="both"/>
+        <w:rPr>
+          <w:rFonts w:ascii="Garamond" w:hAnsi="Garamond"/>
+          <w:color w:val="00A0FC"/>
+          <w:sz w:val="36"/>
+          <w:szCs w:val="36"/>
+        </w:rPr>
+      </w:pPr>
+      <w:r>
+        <w:rPr>
+          <w:rFonts w:eastAsia="Noto Serif CJK SC" w:cs="Noto Sans Devanagari" w:ascii="Garamond" w:hAnsi="Garamond"/>
+          <w:i w:val="false"/>
+          <w:iCs w:val="false"/>
+          <w:color w:val="00A0FC"/>
+          <w:kern w:val="2"/>
+          <w:sz w:val="36"/>
+          <w:szCs w:val="36"/>
+          <w:lang w:val="pt-BR" w:eastAsia="zh-CN" w:bidi="hi-IN"/>
+        </w:rPr>
+        <w:t>O movimento mecânico ao qual a Espiritualidade  se refere na resposta, carrega em si a sabedoria divina. Tudo acontece de forma harmônica e perfeita, guiando seres que sequer têm a capacidade  de pensar.</w:t>
+      </w:r>
+    </w:p>
+    <w:p>
+      <w:pPr>
+        <w:pStyle w:val="Normal"/>
+        <w:bidi w:val="0"/>
+        <w:ind w:left="709" w:hanging="0"/>
+        <w:jc w:val="both"/>
+        <w:rPr>
+          <w:rFonts w:ascii="Garamond" w:hAnsi="Garamond"/>
+          <w:color w:val="00A0FC"/>
+          <w:sz w:val="36"/>
+          <w:szCs w:val="36"/>
+        </w:rPr>
+      </w:pPr>
+      <w:r>
+        <w:rPr>
+          <w:rFonts w:ascii="Garamond" w:hAnsi="Garamond"/>
+          <w:color w:val="00A0FC"/>
+          <w:sz w:val="36"/>
+          <w:szCs w:val="36"/>
+        </w:rPr>
+      </w:r>
+    </w:p>
+    <w:p>
+      <w:pPr>
+        <w:pStyle w:val="Normal"/>
+        <w:bidi w:val="0"/>
+        <w:ind w:left="709" w:hanging="0"/>
+        <w:jc w:val="both"/>
+        <w:rPr>
+          <w:rFonts w:ascii="Garamond" w:hAnsi="Garamond"/>
+          <w:color w:val="00A0FC"/>
+          <w:sz w:val="36"/>
+          <w:szCs w:val="36"/>
+        </w:rPr>
+      </w:pPr>
+      <w:r>
+        <w:rPr>
+          <w:rFonts w:ascii="Garamond" w:hAnsi="Garamond"/>
+          <w:color w:val="00A0FC"/>
+          <w:sz w:val="36"/>
+          <w:szCs w:val="36"/>
+        </w:rPr>
       </w:r>
     </w:p>
     <w:p>
@@ -2175,15 +2308,15 @@
           <w:szCs w:val="36"/>
           <w:lang w:val="pt-BR" w:eastAsia="zh-CN" w:bidi="hi-IN"/>
         </w:rPr>
-        <w:t>588</w:t>
-      </w:r>
-      <w:r>
-        <w:rPr>
-          <w:rFonts w:ascii="Garamond" w:hAnsi="Garamond"/>
-          <w:sz w:val="36"/>
-          <w:szCs w:val="36"/>
-        </w:rPr>
-        <w:t>. Independe da vontade delas a força que as atrai umas para as outras?</w:t>
+        <w:t>589</w:t>
+      </w:r>
+      <w:r>
+        <w:rPr>
+          <w:rFonts w:ascii="Garamond" w:hAnsi="Garamond"/>
+          <w:sz w:val="36"/>
+          <w:szCs w:val="36"/>
+        </w:rPr>
+        <w:t>. Algumas plantas, como a sensitiva e a dioneia, por exemplo, executam movimentos que denotam grande sensibilidade e, em certos casos, uma espécie de vontade, conforme se observa na segunda, cujos lóbulos apanham a mosca que sobre ela pousa para sugá-la, parecendo que urde uma armadilha com o fim de capturar e matar aquele inseto. São dotadas essas plantas da faculdade de pensar? Têm vontade e formam uma classe intermediária entre a Natureza vegetal e a Natureza animal? Constituem a transição de uma para outra?</w:t>
       </w:r>
     </w:p>
     <w:p>
@@ -2235,7 +2368,27 @@
           <w:sz w:val="36"/>
           <w:szCs w:val="36"/>
         </w:rPr>
-        <w:t>Certo, porquanto não pensam. É uma força mecânica da matéria, que atua sobre a matéria, sem que elas possam a isso opor-se.”</w:t>
+        <w:t>Tudo na Natureza é transição, por isso mesmo que uma coisa não se assemelha a outra e, no entanto, todas se prendem umas às outras. As plantas não pensam; por conseguinte carecem de vontade. Nem a ostra que se abre, nem os zoófitos pensam: têm apenas um instinto cego e natural.”</w:t>
+      </w:r>
+    </w:p>
+    <w:p>
+      <w:pPr>
+        <w:pStyle w:val="Normal"/>
+        <w:bidi w:val="0"/>
+        <w:ind w:hanging="0"/>
+        <w:jc w:val="both"/>
+        <w:rPr>
+          <w:rFonts w:ascii="Garamond" w:hAnsi="Garamond"/>
+          <w:sz w:val="36"/>
+          <w:szCs w:val="36"/>
+        </w:rPr>
+      </w:pPr>
+      <w:r>
+        <w:rPr>
+          <w:rFonts w:ascii="Garamond" w:hAnsi="Garamond"/>
+          <w:sz w:val="36"/>
+          <w:szCs w:val="36"/>
+        </w:rPr>
       </w:r>
     </w:p>
     <w:p>
@@ -2249,51 +2402,109 @@
           <w:i w:val="false"/>
           <w:i w:val="false"/>
           <w:iCs w:val="false"/>
-          <w:color w:val="00A0FC"/>
-          <w:kern w:val="2"/>
-          <w:sz w:val="36"/>
-          <w:szCs w:val="36"/>
-          <w:lang w:val="pt-BR" w:eastAsia="zh-CN" w:bidi="hi-IN"/>
-        </w:rPr>
-      </w:pPr>
-      <w:r>
-        <w:rPr>
-          <w:rFonts w:eastAsia="Noto Serif CJK SC" w:cs="Noto Sans Devanagari" w:ascii="Garamond" w:hAnsi="Garamond"/>
-          <w:i w:val="false"/>
-          <w:iCs w:val="false"/>
-          <w:color w:val="00A0FC"/>
-          <w:kern w:val="2"/>
-          <w:sz w:val="36"/>
-          <w:szCs w:val="36"/>
-          <w:lang w:val="pt-BR" w:eastAsia="zh-CN" w:bidi="hi-IN"/>
-        </w:rPr>
-      </w:r>
-    </w:p>
-    <w:p>
-      <w:pPr>
-        <w:pStyle w:val="Normal"/>
-        <w:bidi w:val="0"/>
-        <w:ind w:left="709" w:hanging="0"/>
-        <w:jc w:val="both"/>
-        <w:rPr>
-          <w:rFonts w:ascii="Garamond" w:hAnsi="Garamond"/>
-          <w:color w:val="00A0FC"/>
-          <w:sz w:val="36"/>
-          <w:szCs w:val="36"/>
-        </w:rPr>
-      </w:pPr>
-      <w:r>
-        <w:rPr>
-          <w:rFonts w:eastAsia="Noto Serif CJK SC" w:cs="Noto Sans Devanagari" w:ascii="Garamond" w:hAnsi="Garamond"/>
-          <w:i w:val="false"/>
-          <w:iCs w:val="false"/>
-          <w:color w:val="00A0FC"/>
-          <w:kern w:val="2"/>
-          <w:sz w:val="36"/>
-          <w:szCs w:val="36"/>
-          <w:lang w:val="pt-BR" w:eastAsia="zh-CN" w:bidi="hi-IN"/>
-        </w:rPr>
-        <w:t>A pergunta de Kardec se refere ao comportamento que algumas plantas têm de buscar outras plantas ou de se direcionar para um alvo específico.</w:t>
+          <w:color w:val="000000"/>
+          <w:kern w:val="2"/>
+          <w:sz w:val="36"/>
+          <w:szCs w:val="36"/>
+          <w:lang w:val="pt-BR" w:eastAsia="zh-CN" w:bidi="hi-IN"/>
+        </w:rPr>
+      </w:pPr>
+      <w:r>
+        <w:rPr>
+          <w:rFonts w:eastAsia="Noto Serif CJK SC" w:cs="Noto Sans Devanagari" w:ascii="Garamond" w:hAnsi="Garamond"/>
+          <w:i w:val="false"/>
+          <w:iCs w:val="false"/>
+          <w:color w:val="000000"/>
+          <w:kern w:val="2"/>
+          <w:sz w:val="28"/>
+          <w:szCs w:val="28"/>
+          <w:lang w:val="pt-BR" w:eastAsia="zh-CN" w:bidi="hi-IN"/>
+        </w:rPr>
+        <w:t>O organismo humano nos proporciona exemplo de movimentos análogos, sem participação da vontade, nas funções digestivas e circulatórias. O piloro se contrai, ao contato de certos corpos, para lhes negar passagem. O mesmo provavelmente se dá na sensitiva, cujos movimentos de nenhum modo implicam a necessidade de percepção e, ainda menos, da vontade.</w:t>
+      </w:r>
+    </w:p>
+    <w:p>
+      <w:pPr>
+        <w:pStyle w:val="Normal"/>
+        <w:bidi w:val="0"/>
+        <w:ind w:left="709" w:hanging="0"/>
+        <w:jc w:val="both"/>
+        <w:rPr>
+          <w:rFonts w:ascii="Garamond" w:hAnsi="Garamond" w:eastAsia="Noto Serif CJK SC" w:cs="Noto Sans Devanagari"/>
+          <w:i w:val="false"/>
+          <w:i w:val="false"/>
+          <w:iCs w:val="false"/>
+          <w:color w:val="00A0FC"/>
+          <w:kern w:val="2"/>
+          <w:sz w:val="36"/>
+          <w:szCs w:val="36"/>
+          <w:lang w:val="pt-BR" w:eastAsia="zh-CN" w:bidi="hi-IN"/>
+        </w:rPr>
+      </w:pPr>
+      <w:r>
+        <w:rPr>
+          <w:rFonts w:eastAsia="Noto Serif CJK SC" w:cs="Noto Sans Devanagari" w:ascii="Garamond" w:hAnsi="Garamond"/>
+          <w:i w:val="false"/>
+          <w:iCs w:val="false"/>
+          <w:color w:val="00A0FC"/>
+          <w:kern w:val="2"/>
+          <w:sz w:val="36"/>
+          <w:szCs w:val="36"/>
+          <w:lang w:val="pt-BR" w:eastAsia="zh-CN" w:bidi="hi-IN"/>
+        </w:rPr>
+      </w:r>
+    </w:p>
+    <w:p>
+      <w:pPr>
+        <w:pStyle w:val="Normal"/>
+        <w:bidi w:val="0"/>
+        <w:ind w:left="709" w:hanging="0"/>
+        <w:jc w:val="both"/>
+        <w:rPr>
+          <w:rFonts w:ascii="Garamond" w:hAnsi="Garamond"/>
+          <w:color w:val="00A0FC"/>
+          <w:sz w:val="36"/>
+          <w:szCs w:val="36"/>
+        </w:rPr>
+      </w:pPr>
+      <w:r>
+        <w:rPr>
+          <w:rFonts w:eastAsia="Noto Serif CJK SC" w:cs="Noto Sans Devanagari" w:ascii="Garamond" w:hAnsi="Garamond"/>
+          <w:i w:val="false"/>
+          <w:iCs w:val="false"/>
+          <w:color w:val="00A0FC"/>
+          <w:kern w:val="2"/>
+          <w:sz w:val="36"/>
+          <w:szCs w:val="36"/>
+          <w:lang w:val="pt-BR" w:eastAsia="zh-CN" w:bidi="hi-IN"/>
+        </w:rPr>
+        <w:t xml:space="preserve">Bastante interessante a </w:t>
+      </w:r>
+      <w:r>
+        <w:rPr>
+          <w:rFonts w:eastAsia="Noto Serif CJK SC" w:cs="Noto Sans Devanagari" w:ascii="Garamond" w:hAnsi="Garamond"/>
+          <w:i w:val="false"/>
+          <w:iCs w:val="false"/>
+          <w:color w:val="00A0FC"/>
+          <w:kern w:val="2"/>
+          <w:sz w:val="36"/>
+          <w:szCs w:val="36"/>
+          <w:lang w:val="pt-BR" w:eastAsia="zh-CN" w:bidi="hi-IN"/>
+        </w:rPr>
+        <w:t xml:space="preserve"> pergunta de Kardec</w:t>
+      </w:r>
+      <w:r>
+        <w:rPr>
+          <w:rFonts w:eastAsia="Noto Serif CJK SC" w:cs="Noto Sans Devanagari" w:ascii="Garamond" w:hAnsi="Garamond"/>
+          <w:i w:val="false"/>
+          <w:iCs w:val="false"/>
+          <w:color w:val="00A0FC"/>
+          <w:kern w:val="2"/>
+          <w:sz w:val="36"/>
+          <w:szCs w:val="36"/>
+          <w:lang w:val="pt-BR" w:eastAsia="zh-CN" w:bidi="hi-IN"/>
+        </w:rPr>
+        <w:t>. Ele fala de determinadas espécies de plantas que tem um comportamento que dá a entender que elas pensam.</w:t>
       </w:r>
     </w:p>
     <w:p>
@@ -2337,20 +2548,7 @@
           <w:szCs w:val="36"/>
           <w:lang w:val="pt-BR" w:eastAsia="zh-CN" w:bidi="hi-IN"/>
         </w:rPr>
-        <w:t>É</w:t>
-      </w:r>
-      <w:r>
-        <w:rPr>
-          <w:rFonts w:eastAsia="Noto Serif CJK SC" w:cs="Noto Sans Devanagari" w:ascii="Garamond" w:hAnsi="Garamond"/>
-          <w:i w:val="false"/>
-          <w:iCs w:val="false"/>
-          <w:color w:val="00A0FC"/>
-          <w:kern w:val="2"/>
-          <w:sz w:val="36"/>
-          <w:szCs w:val="36"/>
-          <w:lang w:val="pt-BR" w:eastAsia="zh-CN" w:bidi="hi-IN"/>
-        </w:rPr>
-        <w:t xml:space="preserve"> o caso, por exemplo, de plantas parasitas, que se movem em direção aos seus hospedeiros, e de  trepadeiras, que buscam sustentação em outras plantas ou mesmo em objetos.</w:t>
+        <w:t>Pelas respostas anteriores da Espiritualidade, fica claro que as plantas não pensam. Como eu falei nos comentários da pergunta 587, as plantas não possuem cérebro e nem sistema nervoso central. Portanto, seria impossível que elas pensassem.</w:t>
       </w:r>
     </w:p>
     <w:p>
@@ -2394,7 +2592,7 @@
           <w:szCs w:val="36"/>
           <w:lang w:val="pt-BR" w:eastAsia="zh-CN" w:bidi="hi-IN"/>
         </w:rPr>
-        <w:t>Kardec quer saber se tais plantas têm algum tipo de controle sobre esses movimentos, ou se eles acontecem contra a vontade delas.</w:t>
+        <w:t>Ainda assim Kardec questiona se as plantas que apresentam esses comportamentos, digamos, inteligentes, realizam aqueles movimentos por vontade própria. E, naturalmente a Espiritualidade diz que não, reafirmando que as plantas não pensam e não têm vontade própria.</w:t>
       </w:r>
     </w:p>
     <w:p>
@@ -2438,7 +2636,7 @@
           <w:szCs w:val="36"/>
           <w:lang w:val="pt-BR" w:eastAsia="zh-CN" w:bidi="hi-IN"/>
         </w:rPr>
-        <w:t>E a Espiritualidade responde que trata-se exclusivamente de um movimento mecânico atuando na matéria. As plantas não têm nem vontade própria para realizar esses movimentos, e muito menos força para se opor a eles.</w:t>
+        <w:t>Mas Kardec traz à tona uma questão importantíssima quando falamos dos reinos da natureza: a transição entre eles.</w:t>
       </w:r>
     </w:p>
     <w:p>
@@ -2482,7 +2680,7 @@
           <w:szCs w:val="36"/>
           <w:lang w:val="pt-BR" w:eastAsia="zh-CN" w:bidi="hi-IN"/>
         </w:rPr>
-        <w:t xml:space="preserve">Por essa resposta vemos como Deus é infinitamente sábio. Ele provê Sua criação, mesmo os seres menos evoluídos, com todos os recursos necessários para sua reprodução, crescimento e sobrevivência. </w:t>
+        <w:t>Kardec pergunta se a sensitiva e a dioneia estariam num estágio mais elevado dentro do reino vegetal, aproximando-se do estágio menos elevado do reino animal. É como se essas plantas estivessem na fronteira entre o reino vegetal e o reino animal.</w:t>
       </w:r>
     </w:p>
     <w:p>
@@ -2526,7 +2724,7 @@
           <w:szCs w:val="36"/>
           <w:lang w:val="pt-BR" w:eastAsia="zh-CN" w:bidi="hi-IN"/>
         </w:rPr>
-        <w:t>O movimento mecânico ao qual a Espiritualidade  se refere na resposta, carrega em si a sabedoria divina. Tudo acontece de forma harmônica e perfeita, guiando seres que sequer têm a capacidade  de pensar.</w:t>
+        <w:t>E a Espiritualidade confirma que sim, que tudo na natureza está em transição, e que existe uma conexão entre todas as coisas, por mais que elas se pareçam diferentes.</w:t>
       </w:r>
     </w:p>
     <w:p>
@@ -2561,11 +2759,538 @@
       </w:pPr>
       <w:r>
         <w:rPr>
-          <w:rFonts w:ascii="Garamond" w:hAnsi="Garamond"/>
-          <w:color w:val="00A0FC"/>
-          <w:sz w:val="36"/>
-          <w:szCs w:val="36"/>
-        </w:rPr>
+          <w:rFonts w:eastAsia="Noto Serif CJK SC" w:cs="Noto Sans Devanagari" w:ascii="Garamond" w:hAnsi="Garamond"/>
+          <w:i w:val="false"/>
+          <w:iCs w:val="false"/>
+          <w:color w:val="00A0FC"/>
+          <w:kern w:val="2"/>
+          <w:sz w:val="36"/>
+          <w:szCs w:val="36"/>
+          <w:lang w:val="pt-BR" w:eastAsia="zh-CN" w:bidi="hi-IN"/>
+        </w:rPr>
+        <w:t xml:space="preserve">Na nota que adicionou à resposta da Espiritualidade, Kardec corrobora a explicação da Espiritualidade, lembrando de determinados partes do corpo humano que funcionam sem depender de nossa vontade. Kardec cita o piloro. </w:t>
+      </w:r>
+    </w:p>
+    <w:p>
+      <w:pPr>
+        <w:pStyle w:val="Normal"/>
+        <w:bidi w:val="0"/>
+        <w:ind w:left="709" w:hanging="0"/>
+        <w:jc w:val="both"/>
+        <w:rPr>
+          <w:rFonts w:ascii="Garamond" w:hAnsi="Garamond"/>
+          <w:color w:val="00A0FC"/>
+          <w:sz w:val="36"/>
+          <w:szCs w:val="36"/>
+        </w:rPr>
+      </w:pPr>
+      <w:r>
+        <w:rPr/>
+      </w:r>
+    </w:p>
+    <w:p>
+      <w:pPr>
+        <w:pStyle w:val="Normal"/>
+        <w:bidi w:val="0"/>
+        <w:ind w:left="709" w:hanging="0"/>
+        <w:jc w:val="both"/>
+        <w:rPr>
+          <w:rFonts w:ascii="Garamond" w:hAnsi="Garamond"/>
+          <w:color w:val="00A0FC"/>
+          <w:sz w:val="36"/>
+          <w:szCs w:val="36"/>
+        </w:rPr>
+      </w:pPr>
+      <w:r>
+        <w:rPr>
+          <w:rFonts w:eastAsia="Noto Serif CJK SC" w:cs="Noto Sans Devanagari" w:ascii="Garamond" w:hAnsi="Garamond"/>
+          <w:i w:val="false"/>
+          <w:iCs w:val="false"/>
+          <w:color w:val="00A0FC"/>
+          <w:kern w:val="2"/>
+          <w:sz w:val="36"/>
+          <w:szCs w:val="36"/>
+          <w:lang w:val="pt-BR" w:eastAsia="zh-CN" w:bidi="hi-IN"/>
+        </w:rPr>
+        <w:t>O piloro é um anel muscular na saída do estômago que funciona como uma válvula, controlando a passagem dos alimentos para o duodeno (a primeira parte do intestino delgado). Ele pode se contrair automaticamente para evitar a passagem de determinados alimentos.</w:t>
+      </w:r>
+    </w:p>
+    <w:p>
+      <w:pPr>
+        <w:pStyle w:val="Normal"/>
+        <w:bidi w:val="0"/>
+        <w:ind w:left="709" w:hanging="0"/>
+        <w:jc w:val="both"/>
+        <w:rPr>
+          <w:rFonts w:ascii="Garamond" w:hAnsi="Garamond"/>
+          <w:color w:val="00A0FC"/>
+          <w:sz w:val="36"/>
+          <w:szCs w:val="36"/>
+        </w:rPr>
+      </w:pPr>
+      <w:r>
+        <w:rPr/>
+      </w:r>
+    </w:p>
+    <w:p>
+      <w:pPr>
+        <w:pStyle w:val="Normal"/>
+        <w:bidi w:val="0"/>
+        <w:ind w:left="709" w:hanging="0"/>
+        <w:jc w:val="both"/>
+        <w:rPr>
+          <w:rFonts w:ascii="Garamond" w:hAnsi="Garamond"/>
+          <w:color w:val="00A0FC"/>
+          <w:sz w:val="36"/>
+          <w:szCs w:val="36"/>
+        </w:rPr>
+      </w:pPr>
+      <w:r>
+        <w:rPr>
+          <w:rFonts w:eastAsia="Noto Serif CJK SC" w:cs="Noto Sans Devanagari" w:ascii="Garamond" w:hAnsi="Garamond"/>
+          <w:i w:val="false"/>
+          <w:iCs w:val="false"/>
+          <w:color w:val="00A0FC"/>
+          <w:kern w:val="2"/>
+          <w:sz w:val="36"/>
+          <w:szCs w:val="36"/>
+          <w:lang w:val="pt-BR" w:eastAsia="zh-CN" w:bidi="hi-IN"/>
+        </w:rPr>
+        <w:t>E nós somos seres pensantes. Se em nós, existem partes do corpo que agem sem que sequer pensemos neles, que dirá em seres desprovidos de pensamentos, como é o caso das plantas.</w:t>
+      </w:r>
+    </w:p>
+    <w:p>
+      <w:pPr>
+        <w:pStyle w:val="Normal"/>
+        <w:bidi w:val="0"/>
+        <w:ind w:left="709" w:hanging="0"/>
+        <w:jc w:val="both"/>
+        <w:rPr>
+          <w:rFonts w:ascii="Garamond" w:hAnsi="Garamond"/>
+          <w:color w:val="00A0FC"/>
+          <w:sz w:val="36"/>
+          <w:szCs w:val="36"/>
+        </w:rPr>
+      </w:pPr>
+      <w:r>
+        <w:rPr/>
+      </w:r>
+    </w:p>
+    <w:p>
+      <w:pPr>
+        <w:pStyle w:val="Normal"/>
+        <w:bidi w:val="0"/>
+        <w:ind w:left="709" w:hanging="0"/>
+        <w:jc w:val="both"/>
+        <w:rPr>
+          <w:rFonts w:ascii="Garamond" w:hAnsi="Garamond"/>
+          <w:color w:val="00A0FC"/>
+          <w:sz w:val="36"/>
+          <w:szCs w:val="36"/>
+        </w:rPr>
+      </w:pPr>
+      <w:r>
+        <w:rPr>
+          <w:rFonts w:eastAsia="Noto Serif CJK SC" w:cs="Noto Sans Devanagari" w:ascii="Garamond" w:hAnsi="Garamond"/>
+          <w:i w:val="false"/>
+          <w:iCs w:val="false"/>
+          <w:color w:val="00A0FC"/>
+          <w:kern w:val="2"/>
+          <w:sz w:val="36"/>
+          <w:szCs w:val="36"/>
+          <w:lang w:val="pt-BR" w:eastAsia="zh-CN" w:bidi="hi-IN"/>
+        </w:rPr>
+        <w:t>Voltando à questão da transição. Lembram-se quando nós estudamos sobre a classificação dos Espíritos de acordo com o grau de evolução? Lá, Kardec nos explicou que, mesmo dentro de uma única categoria - ou ordem - de Espíritos, há uma diversidade enorme de graus evolutivos.</w:t>
+      </w:r>
+    </w:p>
+    <w:p>
+      <w:pPr>
+        <w:pStyle w:val="Normal"/>
+        <w:bidi w:val="0"/>
+        <w:ind w:left="709" w:hanging="0"/>
+        <w:jc w:val="both"/>
+        <w:rPr>
+          <w:rFonts w:ascii="Garamond" w:hAnsi="Garamond"/>
+          <w:color w:val="00A0FC"/>
+          <w:sz w:val="36"/>
+          <w:szCs w:val="36"/>
+        </w:rPr>
+      </w:pPr>
+      <w:r>
+        <w:rPr/>
+      </w:r>
+    </w:p>
+    <w:p>
+      <w:pPr>
+        <w:pStyle w:val="Normal"/>
+        <w:bidi w:val="0"/>
+        <w:ind w:left="709" w:hanging="0"/>
+        <w:jc w:val="both"/>
+        <w:rPr>
+          <w:rFonts w:ascii="Garamond" w:hAnsi="Garamond"/>
+          <w:color w:val="00A0FC"/>
+          <w:sz w:val="36"/>
+          <w:szCs w:val="36"/>
+        </w:rPr>
+      </w:pPr>
+      <w:r>
+        <w:rPr>
+          <w:rFonts w:eastAsia="Noto Serif CJK SC" w:cs="Noto Sans Devanagari" w:ascii="Garamond" w:hAnsi="Garamond"/>
+          <w:i w:val="false"/>
+          <w:iCs w:val="false"/>
+          <w:color w:val="00A0FC"/>
+          <w:kern w:val="2"/>
+          <w:sz w:val="36"/>
+          <w:szCs w:val="36"/>
+          <w:lang w:val="pt-BR" w:eastAsia="zh-CN" w:bidi="hi-IN"/>
+        </w:rPr>
+        <w:t>É uma série ininterrupta, desde o mais ínfimo grau até o grau superior.</w:t>
+      </w:r>
+    </w:p>
+    <w:p>
+      <w:pPr>
+        <w:pStyle w:val="Normal"/>
+        <w:bidi w:val="0"/>
+        <w:ind w:left="709" w:hanging="0"/>
+        <w:jc w:val="both"/>
+        <w:rPr>
+          <w:rFonts w:ascii="Garamond" w:hAnsi="Garamond"/>
+          <w:color w:val="00A0FC"/>
+          <w:sz w:val="36"/>
+          <w:szCs w:val="36"/>
+        </w:rPr>
+      </w:pPr>
+      <w:r>
+        <w:rPr/>
+      </w:r>
+    </w:p>
+    <w:p>
+      <w:pPr>
+        <w:pStyle w:val="Normal"/>
+        <w:bidi w:val="0"/>
+        <w:ind w:left="709" w:hanging="0"/>
+        <w:jc w:val="both"/>
+        <w:rPr>
+          <w:rFonts w:ascii="Garamond" w:hAnsi="Garamond"/>
+          <w:color w:val="00A0FC"/>
+          <w:sz w:val="36"/>
+          <w:szCs w:val="36"/>
+        </w:rPr>
+      </w:pPr>
+      <w:r>
+        <w:rPr>
+          <w:rFonts w:eastAsia="Noto Serif CJK SC" w:cs="Noto Sans Devanagari" w:ascii="Garamond" w:hAnsi="Garamond"/>
+          <w:i w:val="false"/>
+          <w:iCs w:val="false"/>
+          <w:color w:val="00A0FC"/>
+          <w:kern w:val="2"/>
+          <w:sz w:val="36"/>
+          <w:szCs w:val="36"/>
+          <w:lang w:val="pt-BR" w:eastAsia="zh-CN" w:bidi="hi-IN"/>
+        </w:rPr>
+        <w:t>Assim também acontece na natureza. Os animais, por serem dotados de alguma inteligência, nos fornecem exemplos excelentes do quão extensa é a faixa evolutiva que eles compreendem.</w:t>
+      </w:r>
+    </w:p>
+    <w:p>
+      <w:pPr>
+        <w:pStyle w:val="Normal"/>
+        <w:bidi w:val="0"/>
+        <w:ind w:left="709" w:hanging="0"/>
+        <w:jc w:val="both"/>
+        <w:rPr>
+          <w:rFonts w:ascii="Garamond" w:hAnsi="Garamond"/>
+          <w:color w:val="00A0FC"/>
+          <w:sz w:val="36"/>
+          <w:szCs w:val="36"/>
+        </w:rPr>
+      </w:pPr>
+      <w:r>
+        <w:rPr/>
+      </w:r>
+    </w:p>
+    <w:p>
+      <w:pPr>
+        <w:pStyle w:val="Normal"/>
+        <w:bidi w:val="0"/>
+        <w:ind w:left="709" w:hanging="0"/>
+        <w:jc w:val="both"/>
+        <w:rPr>
+          <w:rFonts w:ascii="Garamond" w:hAnsi="Garamond"/>
+          <w:color w:val="00A0FC"/>
+          <w:sz w:val="36"/>
+          <w:szCs w:val="36"/>
+        </w:rPr>
+      </w:pPr>
+      <w:r>
+        <w:rPr/>
+      </w:r>
+    </w:p>
+    <w:p>
+      <w:pPr>
+        <w:pStyle w:val="Normal"/>
+        <w:bidi w:val="0"/>
+        <w:ind w:left="709" w:hanging="0"/>
+        <w:jc w:val="both"/>
+        <w:rPr>
+          <w:rFonts w:ascii="Garamond" w:hAnsi="Garamond" w:eastAsia="Noto Serif CJK SC" w:cs="Noto Sans Devanagari"/>
+          <w:i w:val="false"/>
+          <w:i w:val="false"/>
+          <w:iCs w:val="false"/>
+          <w:color w:val="00A0FC"/>
+          <w:kern w:val="2"/>
+          <w:sz w:val="36"/>
+          <w:szCs w:val="36"/>
+          <w:lang w:val="pt-BR" w:eastAsia="zh-CN" w:bidi="hi-IN"/>
+        </w:rPr>
+      </w:pPr>
+      <w:r>
+        <w:rPr>
+          <w:rFonts w:eastAsia="Noto Serif CJK SC" w:cs="Noto Sans Devanagari" w:ascii="Garamond" w:hAnsi="Garamond"/>
+          <w:i w:val="false"/>
+          <w:iCs w:val="false"/>
+          <w:color w:val="00A0FC"/>
+          <w:kern w:val="2"/>
+          <w:sz w:val="36"/>
+          <w:szCs w:val="36"/>
+          <w:lang w:val="pt-BR" w:eastAsia="zh-CN" w:bidi="hi-IN"/>
+        </w:rPr>
+        <w:t>Basta nós observarmos a diferença absurda que existe entre o organismo de um</w:t>
+      </w:r>
+      <w:r>
+        <w:rPr>
+          <w:rFonts w:eastAsia="Noto Serif CJK SC" w:cs="Noto Sans Devanagari" w:ascii="Garamond" w:hAnsi="Garamond"/>
+          <w:i w:val="false"/>
+          <w:iCs w:val="false"/>
+          <w:color w:val="00A0FC"/>
+          <w:kern w:val="2"/>
+          <w:sz w:val="36"/>
+          <w:szCs w:val="36"/>
+          <w:lang w:val="pt-BR" w:eastAsia="zh-CN" w:bidi="hi-IN"/>
+        </w:rPr>
+        <w:t xml:space="preserve">a esponja-do-mar e um chimpanzé. Só por curiosidade: preparando esse estudo eu descobri que os insetos e os caramujos possuem organismos mais complexos do que a esponja-do-mar. </w:t>
+      </w:r>
+    </w:p>
+    <w:p>
+      <w:pPr>
+        <w:pStyle w:val="Normal"/>
+        <w:bidi w:val="0"/>
+        <w:ind w:left="709" w:hanging="0"/>
+        <w:jc w:val="both"/>
+        <w:rPr>
+          <w:rFonts w:ascii="Garamond" w:hAnsi="Garamond" w:eastAsia="Noto Serif CJK SC" w:cs="Noto Sans Devanagari"/>
+          <w:i w:val="false"/>
+          <w:i w:val="false"/>
+          <w:iCs w:val="false"/>
+          <w:color w:val="00A0FC"/>
+          <w:kern w:val="2"/>
+          <w:sz w:val="36"/>
+          <w:szCs w:val="36"/>
+          <w:lang w:val="pt-BR" w:eastAsia="zh-CN" w:bidi="hi-IN"/>
+        </w:rPr>
+      </w:pPr>
+      <w:r>
+        <w:rPr>
+          <w:rFonts w:eastAsia="Noto Serif CJK SC" w:cs="Noto Sans Devanagari" w:ascii="Garamond" w:hAnsi="Garamond"/>
+          <w:i w:val="false"/>
+          <w:iCs w:val="false"/>
+          <w:color w:val="00A0FC"/>
+          <w:kern w:val="2"/>
+          <w:sz w:val="36"/>
+          <w:szCs w:val="36"/>
+          <w:lang w:val="pt-BR" w:eastAsia="zh-CN" w:bidi="hi-IN"/>
+        </w:rPr>
+      </w:r>
+    </w:p>
+    <w:p>
+      <w:pPr>
+        <w:pStyle w:val="Normal"/>
+        <w:bidi w:val="0"/>
+        <w:ind w:left="709" w:hanging="0"/>
+        <w:jc w:val="both"/>
+        <w:rPr>
+          <w:rFonts w:ascii="Garamond" w:hAnsi="Garamond" w:eastAsia="Noto Serif CJK SC" w:cs="Noto Sans Devanagari"/>
+          <w:i w:val="false"/>
+          <w:i w:val="false"/>
+          <w:iCs w:val="false"/>
+          <w:color w:val="00A0FC"/>
+          <w:kern w:val="2"/>
+          <w:sz w:val="36"/>
+          <w:szCs w:val="36"/>
+          <w:lang w:val="pt-BR" w:eastAsia="zh-CN" w:bidi="hi-IN"/>
+        </w:rPr>
+      </w:pPr>
+      <w:r>
+        <w:rPr>
+          <w:rFonts w:eastAsia="Noto Serif CJK SC" w:cs="Noto Sans Devanagari" w:ascii="Garamond" w:hAnsi="Garamond"/>
+          <w:i w:val="false"/>
+          <w:iCs w:val="false"/>
+          <w:color w:val="00A0FC"/>
+          <w:kern w:val="2"/>
+          <w:sz w:val="36"/>
+          <w:szCs w:val="36"/>
+          <w:lang w:val="pt-BR" w:eastAsia="zh-CN" w:bidi="hi-IN"/>
+        </w:rPr>
+        <w:t>Mas, enfim: chimpanzés e esponjas-do-mar  pertencem ao reino animal, mas estão absurdamente distantes um do outro na linha de evolução.</w:t>
+      </w:r>
+    </w:p>
+    <w:p>
+      <w:pPr>
+        <w:pStyle w:val="Normal"/>
+        <w:bidi w:val="0"/>
+        <w:ind w:left="709" w:hanging="0"/>
+        <w:jc w:val="both"/>
+        <w:rPr>
+          <w:rFonts w:ascii="Garamond" w:hAnsi="Garamond" w:eastAsia="Noto Serif CJK SC" w:cs="Noto Sans Devanagari"/>
+          <w:i w:val="false"/>
+          <w:i w:val="false"/>
+          <w:iCs w:val="false"/>
+          <w:color w:val="00A0FC"/>
+          <w:kern w:val="2"/>
+          <w:sz w:val="36"/>
+          <w:szCs w:val="36"/>
+          <w:lang w:val="pt-BR" w:eastAsia="zh-CN" w:bidi="hi-IN"/>
+        </w:rPr>
+      </w:pPr>
+      <w:r>
+        <w:rPr>
+          <w:rFonts w:eastAsia="Noto Serif CJK SC" w:cs="Noto Sans Devanagari" w:ascii="Garamond" w:hAnsi="Garamond"/>
+          <w:i w:val="false"/>
+          <w:iCs w:val="false"/>
+          <w:color w:val="00A0FC"/>
+          <w:kern w:val="2"/>
+          <w:sz w:val="36"/>
+          <w:szCs w:val="36"/>
+          <w:lang w:val="pt-BR" w:eastAsia="zh-CN" w:bidi="hi-IN"/>
+        </w:rPr>
+      </w:r>
+    </w:p>
+    <w:p>
+      <w:pPr>
+        <w:pStyle w:val="Normal"/>
+        <w:bidi w:val="0"/>
+        <w:ind w:left="709" w:hanging="0"/>
+        <w:jc w:val="both"/>
+        <w:rPr>
+          <w:rFonts w:ascii="Garamond" w:hAnsi="Garamond" w:eastAsia="Noto Serif CJK SC" w:cs="Noto Sans Devanagari"/>
+          <w:i w:val="false"/>
+          <w:i w:val="false"/>
+          <w:iCs w:val="false"/>
+          <w:color w:val="00A0FC"/>
+          <w:kern w:val="2"/>
+          <w:sz w:val="36"/>
+          <w:szCs w:val="36"/>
+          <w:lang w:val="pt-BR" w:eastAsia="zh-CN" w:bidi="hi-IN"/>
+        </w:rPr>
+      </w:pPr>
+      <w:r>
+        <w:rPr>
+          <w:rFonts w:eastAsia="Noto Serif CJK SC" w:cs="Noto Sans Devanagari" w:ascii="Garamond" w:hAnsi="Garamond"/>
+          <w:i w:val="false"/>
+          <w:iCs w:val="false"/>
+          <w:color w:val="00A0FC"/>
+          <w:kern w:val="2"/>
+          <w:sz w:val="36"/>
+          <w:szCs w:val="36"/>
+          <w:lang w:val="pt-BR" w:eastAsia="zh-CN" w:bidi="hi-IN"/>
+        </w:rPr>
+        <w:t>Só que nós percebemos essa diferença também no aspecto comportamental. Por que existem animais com uma gigantesca agressividade tais como o crocodilo do Nilo e o tubarão branco, e outros capazes de demonstrar gratidão e afeto quase como um ser humano, como os animais domésticos?</w:t>
+      </w:r>
+    </w:p>
+    <w:p>
+      <w:pPr>
+        <w:pStyle w:val="Normal"/>
+        <w:bidi w:val="0"/>
+        <w:ind w:left="709" w:hanging="0"/>
+        <w:jc w:val="both"/>
+        <w:rPr>
+          <w:rFonts w:ascii="Garamond" w:hAnsi="Garamond" w:eastAsia="Noto Serif CJK SC" w:cs="Noto Sans Devanagari"/>
+          <w:i w:val="false"/>
+          <w:i w:val="false"/>
+          <w:iCs w:val="false"/>
+          <w:color w:val="00A0FC"/>
+          <w:kern w:val="2"/>
+          <w:sz w:val="36"/>
+          <w:szCs w:val="36"/>
+          <w:lang w:val="pt-BR" w:eastAsia="zh-CN" w:bidi="hi-IN"/>
+        </w:rPr>
+      </w:pPr>
+      <w:r>
+        <w:rPr>
+          <w:rFonts w:eastAsia="Noto Serif CJK SC" w:cs="Noto Sans Devanagari" w:ascii="Garamond" w:hAnsi="Garamond"/>
+          <w:i w:val="false"/>
+          <w:iCs w:val="false"/>
+          <w:color w:val="00A0FC"/>
+          <w:kern w:val="2"/>
+          <w:sz w:val="36"/>
+          <w:szCs w:val="36"/>
+          <w:lang w:val="pt-BR" w:eastAsia="zh-CN" w:bidi="hi-IN"/>
+        </w:rPr>
+      </w:r>
+    </w:p>
+    <w:p>
+      <w:pPr>
+        <w:pStyle w:val="Normal"/>
+        <w:bidi w:val="0"/>
+        <w:ind w:left="709" w:hanging="0"/>
+        <w:jc w:val="both"/>
+        <w:rPr>
+          <w:rFonts w:ascii="Garamond" w:hAnsi="Garamond" w:eastAsia="Noto Serif CJK SC" w:cs="Noto Sans Devanagari"/>
+          <w:i w:val="false"/>
+          <w:i w:val="false"/>
+          <w:iCs w:val="false"/>
+          <w:color w:val="00A0FC"/>
+          <w:kern w:val="2"/>
+          <w:sz w:val="36"/>
+          <w:szCs w:val="36"/>
+          <w:lang w:val="pt-BR" w:eastAsia="zh-CN" w:bidi="hi-IN"/>
+        </w:rPr>
+      </w:pPr>
+      <w:r>
+        <w:rPr>
+          <w:rFonts w:eastAsia="Noto Serif CJK SC" w:cs="Noto Sans Devanagari" w:ascii="Garamond" w:hAnsi="Garamond"/>
+          <w:i w:val="false"/>
+          <w:iCs w:val="false"/>
+          <w:color w:val="00A0FC"/>
+          <w:kern w:val="2"/>
+          <w:sz w:val="36"/>
+          <w:szCs w:val="36"/>
+          <w:lang w:val="pt-BR" w:eastAsia="zh-CN" w:bidi="hi-IN"/>
+        </w:rPr>
+        <w:t>Porque Deus é sábio, misericordioso e perfeito em toda sua criação.</w:t>
+      </w:r>
+    </w:p>
+    <w:p>
+      <w:pPr>
+        <w:pStyle w:val="Normal"/>
+        <w:bidi w:val="0"/>
+        <w:ind w:left="709" w:hanging="0"/>
+        <w:jc w:val="both"/>
+        <w:rPr>
+          <w:rFonts w:ascii="Garamond" w:hAnsi="Garamond"/>
+          <w:color w:val="00A0FC"/>
+          <w:sz w:val="36"/>
+          <w:szCs w:val="36"/>
+        </w:rPr>
+      </w:pPr>
+      <w:r>
+        <w:rPr/>
+      </w:r>
+    </w:p>
+    <w:p>
+      <w:pPr>
+        <w:pStyle w:val="Normal"/>
+        <w:bidi w:val="0"/>
+        <w:ind w:left="709" w:hanging="0"/>
+        <w:jc w:val="both"/>
+        <w:rPr>
+          <w:rFonts w:ascii="Garamond" w:hAnsi="Garamond"/>
+          <w:color w:val="00A0FC"/>
+          <w:sz w:val="36"/>
+          <w:szCs w:val="36"/>
+        </w:rPr>
+      </w:pPr>
+      <w:r>
+        <w:rPr/>
       </w:r>
     </w:p>
     <w:p>
@@ -2588,15 +3313,31 @@
           <w:szCs w:val="36"/>
           <w:lang w:val="pt-BR" w:eastAsia="zh-CN" w:bidi="hi-IN"/>
         </w:rPr>
-        <w:t>553</w:t>
-      </w:r>
-      <w:r>
-        <w:rPr>
-          <w:rFonts w:ascii="Garamond" w:hAnsi="Garamond"/>
-          <w:sz w:val="36"/>
-          <w:szCs w:val="36"/>
-        </w:rPr>
-        <w:t>. Que efeito podem produzir as fórmulas e práticas mediante as quais pessoas há que pretendem dispor do concurso dos Espíritos?</w:t>
+        <w:t>590</w:t>
+      </w:r>
+      <w:r>
+        <w:rPr>
+          <w:rFonts w:ascii="Garamond" w:hAnsi="Garamond"/>
+          <w:sz w:val="36"/>
+          <w:szCs w:val="36"/>
+        </w:rPr>
+        <w:t>. Não haverá nas plantas, como nos animais, um instinto de conservação, que as induza a procurar o que lhes possa ser útil e a evitar o</w:t>
+      </w:r>
+      <w:r>
+        <w:rPr>
+          <w:rFonts w:ascii="Garamond" w:hAnsi="Garamond"/>
+          <w:sz w:val="36"/>
+          <w:szCs w:val="36"/>
+        </w:rPr>
+        <w:t xml:space="preserve"> </w:t>
+      </w:r>
+      <w:r>
+        <w:rPr>
+          <w:rFonts w:ascii="Garamond" w:hAnsi="Garamond"/>
+          <w:sz w:val="36"/>
+          <w:szCs w:val="36"/>
+        </w:rPr>
+        <w:t>que lhes possa ser nocivo?</w:t>
       </w:r>
     </w:p>
     <w:p>
@@ -2648,491 +3389,8 @@
           <w:sz w:val="36"/>
           <w:szCs w:val="36"/>
         </w:rPr>
-        <w:t>O efeito de torná-las ridículas, se procedem de boa-fé. No caso contrário, são tratantes que merecem castigo. Todas as fórmulas são mera charlatanaria. Não há palavra sacramental nenhuma, nenhum sinal cabalístico, nem talismã, que tenha qualquer ação sobre os Espíritos, porquanto estes só são atraídos pelo pensamento e não pelas coisas materiais.”</w:t>
-      </w:r>
-    </w:p>
-    <w:p>
-      <w:pPr>
-        <w:pStyle w:val="Normal"/>
-        <w:bidi w:val="0"/>
-        <w:ind w:left="709" w:hanging="0"/>
-        <w:jc w:val="both"/>
-        <w:rPr>
-          <w:rFonts w:ascii="Garamond" w:hAnsi="Garamond" w:eastAsia="Noto Serif CJK SC" w:cs="Noto Sans Devanagari"/>
-          <w:i w:val="false"/>
-          <w:i w:val="false"/>
-          <w:iCs w:val="false"/>
-          <w:color w:val="00A0FC"/>
-          <w:kern w:val="2"/>
-          <w:sz w:val="36"/>
-          <w:szCs w:val="36"/>
-          <w:lang w:val="pt-BR" w:eastAsia="zh-CN" w:bidi="hi-IN"/>
-        </w:rPr>
-      </w:pPr>
-      <w:r>
-        <w:rPr>
-          <w:rFonts w:eastAsia="Noto Serif CJK SC" w:cs="Noto Sans Devanagari" w:ascii="Garamond" w:hAnsi="Garamond"/>
-          <w:i w:val="false"/>
-          <w:iCs w:val="false"/>
-          <w:color w:val="00A0FC"/>
-          <w:kern w:val="2"/>
-          <w:sz w:val="36"/>
-          <w:szCs w:val="36"/>
-          <w:lang w:val="pt-BR" w:eastAsia="zh-CN" w:bidi="hi-IN"/>
-        </w:rPr>
-      </w:r>
-    </w:p>
-    <w:p>
-      <w:pPr>
-        <w:pStyle w:val="Normal"/>
-        <w:bidi w:val="0"/>
-        <w:ind w:left="709" w:hanging="0"/>
-        <w:jc w:val="both"/>
-        <w:rPr>
-          <w:rFonts w:ascii="Garamond" w:hAnsi="Garamond"/>
-          <w:color w:val="00A0FC"/>
-          <w:sz w:val="36"/>
-          <w:szCs w:val="36"/>
-        </w:rPr>
-      </w:pPr>
-      <w:r>
-        <w:rPr>
-          <w:rFonts w:eastAsia="Noto Serif CJK SC" w:cs="Noto Sans Devanagari" w:ascii="Garamond" w:hAnsi="Garamond"/>
-          <w:i w:val="false"/>
-          <w:iCs w:val="false"/>
-          <w:color w:val="00A0FC"/>
-          <w:kern w:val="2"/>
-          <w:sz w:val="36"/>
-          <w:szCs w:val="36"/>
-          <w:lang w:val="pt-BR" w:eastAsia="zh-CN" w:bidi="hi-IN"/>
-        </w:rPr>
-        <w:t>A pergunta de Kardec refere-se às pessoas que afirmam ser capazes de atrair os espíritos através de fórmulas e determinados rituais. Kardec deseja saber que efeito tais pessoas conseguem produzir.</w:t>
-      </w:r>
-    </w:p>
-    <w:p>
-      <w:pPr>
-        <w:pStyle w:val="Normal"/>
-        <w:bidi w:val="0"/>
-        <w:ind w:left="709" w:hanging="0"/>
-        <w:jc w:val="both"/>
-        <w:rPr>
-          <w:rFonts w:ascii="Garamond" w:hAnsi="Garamond"/>
-          <w:color w:val="00A0FC"/>
-          <w:sz w:val="36"/>
-          <w:szCs w:val="36"/>
-        </w:rPr>
-      </w:pPr>
-      <w:r>
-        <w:rPr>
-          <w:rFonts w:ascii="Garamond" w:hAnsi="Garamond"/>
-          <w:color w:val="00A0FC"/>
-          <w:sz w:val="36"/>
-          <w:szCs w:val="36"/>
-        </w:rPr>
-      </w:r>
-    </w:p>
-    <w:p>
-      <w:pPr>
-        <w:pStyle w:val="Normal"/>
-        <w:bidi w:val="0"/>
-        <w:ind w:left="709" w:hanging="0"/>
-        <w:jc w:val="both"/>
-        <w:rPr>
-          <w:rFonts w:ascii="Garamond" w:hAnsi="Garamond"/>
-          <w:color w:val="00A0FC"/>
-          <w:sz w:val="36"/>
-          <w:szCs w:val="36"/>
-        </w:rPr>
-      </w:pPr>
-      <w:r>
-        <w:rPr>
-          <w:rFonts w:eastAsia="Noto Serif CJK SC" w:cs="Noto Sans Devanagari" w:ascii="Garamond" w:hAnsi="Garamond"/>
-          <w:i w:val="false"/>
-          <w:iCs w:val="false"/>
-          <w:color w:val="00A0FC"/>
-          <w:kern w:val="2"/>
-          <w:sz w:val="36"/>
-          <w:szCs w:val="36"/>
-          <w:lang w:val="pt-BR" w:eastAsia="zh-CN" w:bidi="hi-IN"/>
-        </w:rPr>
-        <w:t xml:space="preserve">A Espiritualidade responde que depende da pessoa que se dispõe a tais atos. Se for alguém de boa-fé,  que acredita de fato que suas palavras e  rituais podem colocar os espíritos ao seu dispor, essa pessoa cairá no ridículo. </w:t>
-      </w:r>
-    </w:p>
-    <w:p>
-      <w:pPr>
-        <w:pStyle w:val="Normal"/>
-        <w:bidi w:val="0"/>
-        <w:ind w:left="709" w:hanging="0"/>
-        <w:jc w:val="both"/>
-        <w:rPr>
-          <w:rFonts w:ascii="Garamond" w:hAnsi="Garamond"/>
-          <w:color w:val="00A0FC"/>
-          <w:sz w:val="36"/>
-          <w:szCs w:val="36"/>
-        </w:rPr>
-      </w:pPr>
-      <w:r>
-        <w:rPr>
-          <w:rFonts w:ascii="Garamond" w:hAnsi="Garamond"/>
-          <w:color w:val="00A0FC"/>
-          <w:sz w:val="36"/>
-          <w:szCs w:val="36"/>
-        </w:rPr>
-      </w:r>
-    </w:p>
-    <w:p>
-      <w:pPr>
-        <w:pStyle w:val="Normal"/>
-        <w:bidi w:val="0"/>
-        <w:ind w:left="709" w:hanging="0"/>
-        <w:jc w:val="both"/>
-        <w:rPr>
-          <w:rFonts w:ascii="Garamond" w:hAnsi="Garamond"/>
-          <w:color w:val="00A0FC"/>
-          <w:sz w:val="36"/>
-          <w:szCs w:val="36"/>
-        </w:rPr>
-      </w:pPr>
-      <w:r>
-        <w:rPr>
-          <w:rFonts w:eastAsia="Noto Serif CJK SC" w:cs="Noto Sans Devanagari" w:ascii="Garamond" w:hAnsi="Garamond"/>
-          <w:i w:val="false"/>
-          <w:iCs w:val="false"/>
-          <w:color w:val="00A0FC"/>
-          <w:kern w:val="2"/>
-          <w:sz w:val="36"/>
-          <w:szCs w:val="36"/>
-          <w:lang w:val="pt-BR" w:eastAsia="zh-CN" w:bidi="hi-IN"/>
-        </w:rPr>
-        <w:t>Por outro lado, se for uma pessoa que tem consciência de que palavras e rituais não atraem os espíritos para lhe servir, em outras palavras, se for um charlatão, então essa pessoa merece até mesmo um castigo.</w:t>
-      </w:r>
-    </w:p>
-    <w:p>
-      <w:pPr>
-        <w:pStyle w:val="Normal"/>
-        <w:bidi w:val="0"/>
-        <w:ind w:left="709" w:hanging="0"/>
-        <w:jc w:val="both"/>
-        <w:rPr>
-          <w:rFonts w:ascii="Garamond" w:hAnsi="Garamond"/>
-          <w:color w:val="00A0FC"/>
-          <w:sz w:val="36"/>
-          <w:szCs w:val="36"/>
-        </w:rPr>
-      </w:pPr>
-      <w:r>
-        <w:rPr>
-          <w:rFonts w:ascii="Garamond" w:hAnsi="Garamond"/>
-          <w:color w:val="00A0FC"/>
-          <w:sz w:val="36"/>
-          <w:szCs w:val="36"/>
-        </w:rPr>
-      </w:r>
-    </w:p>
-    <w:p>
-      <w:pPr>
-        <w:pStyle w:val="Normal"/>
-        <w:bidi w:val="0"/>
-        <w:ind w:left="709" w:hanging="0"/>
-        <w:jc w:val="both"/>
-        <w:rPr>
-          <w:rFonts w:ascii="Garamond" w:hAnsi="Garamond"/>
-          <w:color w:val="00A0FC"/>
-          <w:sz w:val="36"/>
-          <w:szCs w:val="36"/>
-        </w:rPr>
-      </w:pPr>
-      <w:r>
-        <w:rPr>
-          <w:rFonts w:eastAsia="Noto Serif CJK SC" w:cs="Noto Sans Devanagari" w:ascii="Garamond" w:hAnsi="Garamond"/>
-          <w:i w:val="false"/>
-          <w:iCs w:val="false"/>
-          <w:color w:val="00A0FC"/>
-          <w:kern w:val="2"/>
-          <w:sz w:val="36"/>
-          <w:szCs w:val="36"/>
-          <w:lang w:val="pt-BR" w:eastAsia="zh-CN" w:bidi="hi-IN"/>
-        </w:rPr>
-        <w:t xml:space="preserve">A Espiritualidade afirma que não existe palavra sacramental, talismã, rituais ou qualquer outra coisa de ordem material que seja capaz de atrair os espíritos. </w:t>
-      </w:r>
-    </w:p>
-    <w:p>
-      <w:pPr>
-        <w:pStyle w:val="Normal"/>
-        <w:bidi w:val="0"/>
-        <w:ind w:left="709" w:hanging="0"/>
-        <w:jc w:val="both"/>
-        <w:rPr>
-          <w:rFonts w:ascii="Garamond" w:hAnsi="Garamond"/>
-          <w:color w:val="00A0FC"/>
-          <w:sz w:val="36"/>
-          <w:szCs w:val="36"/>
-        </w:rPr>
-      </w:pPr>
-      <w:r>
-        <w:rPr>
-          <w:rFonts w:ascii="Garamond" w:hAnsi="Garamond"/>
-          <w:color w:val="00A0FC"/>
-          <w:sz w:val="36"/>
-          <w:szCs w:val="36"/>
-        </w:rPr>
-      </w:r>
-    </w:p>
-    <w:p>
-      <w:pPr>
-        <w:pStyle w:val="Normal"/>
-        <w:bidi w:val="0"/>
-        <w:ind w:left="709" w:hanging="0"/>
-        <w:jc w:val="both"/>
-        <w:rPr>
-          <w:rFonts w:ascii="Garamond" w:hAnsi="Garamond"/>
-          <w:color w:val="00A0FC"/>
-          <w:sz w:val="36"/>
-          <w:szCs w:val="36"/>
-        </w:rPr>
-      </w:pPr>
-      <w:r>
-        <w:rPr>
-          <w:rFonts w:eastAsia="Noto Serif CJK SC" w:cs="Noto Sans Devanagari" w:ascii="Garamond" w:hAnsi="Garamond"/>
-          <w:i w:val="false"/>
-          <w:iCs w:val="false"/>
-          <w:color w:val="00A0FC"/>
-          <w:kern w:val="2"/>
-          <w:sz w:val="36"/>
-          <w:szCs w:val="36"/>
-          <w:lang w:val="pt-BR" w:eastAsia="zh-CN" w:bidi="hi-IN"/>
-        </w:rPr>
-        <w:t>É a natureza dos pensamentos que realmente cria a força de atração entre nós e eles.</w:t>
-      </w:r>
-    </w:p>
-    <w:p>
-      <w:pPr>
-        <w:pStyle w:val="Normal"/>
-        <w:bidi w:val="0"/>
-        <w:ind w:left="709" w:hanging="0"/>
-        <w:jc w:val="both"/>
-        <w:rPr>
-          <w:rFonts w:ascii="Garamond" w:hAnsi="Garamond"/>
-          <w:color w:val="00A0FC"/>
-          <w:sz w:val="36"/>
-          <w:szCs w:val="36"/>
-        </w:rPr>
-      </w:pPr>
-      <w:r>
-        <w:rPr>
-          <w:rFonts w:ascii="Garamond" w:hAnsi="Garamond"/>
-          <w:color w:val="00A0FC"/>
-          <w:sz w:val="36"/>
-          <w:szCs w:val="36"/>
-        </w:rPr>
-      </w:r>
-    </w:p>
-    <w:p>
-      <w:pPr>
-        <w:pStyle w:val="Normal"/>
-        <w:bidi w:val="0"/>
-        <w:ind w:left="709" w:hanging="0"/>
-        <w:jc w:val="both"/>
-        <w:rPr>
-          <w:rFonts w:ascii="Garamond" w:hAnsi="Garamond"/>
-          <w:color w:val="00A0FC"/>
-          <w:sz w:val="36"/>
-          <w:szCs w:val="36"/>
-        </w:rPr>
-      </w:pPr>
-      <w:r>
-        <w:rPr>
-          <w:rFonts w:eastAsia="Noto Serif CJK SC" w:cs="Noto Sans Devanagari" w:ascii="Garamond" w:hAnsi="Garamond"/>
-          <w:i w:val="false"/>
-          <w:iCs w:val="false"/>
-          <w:color w:val="00A0FC"/>
-          <w:kern w:val="2"/>
-          <w:sz w:val="36"/>
-          <w:szCs w:val="36"/>
-          <w:lang w:val="pt-BR" w:eastAsia="zh-CN" w:bidi="hi-IN"/>
-        </w:rPr>
-        <w:t>Aqui cabe uma observação. A literatura espírita está repleta de exemplos em que são narradas situações onde espíritos inferiores vão à determinados lugares atraídos pelas bebidas alcoólicas, pelo fumo ou pelas práticas sexuais desregradas.</w:t>
-      </w:r>
-    </w:p>
-    <w:p>
-      <w:pPr>
-        <w:pStyle w:val="Normal"/>
-        <w:bidi w:val="0"/>
-        <w:ind w:left="709" w:hanging="0"/>
-        <w:jc w:val="both"/>
-        <w:rPr>
-          <w:rFonts w:ascii="Garamond" w:hAnsi="Garamond"/>
-          <w:color w:val="00A0FC"/>
-          <w:sz w:val="36"/>
-          <w:szCs w:val="36"/>
-        </w:rPr>
-      </w:pPr>
-      <w:r>
-        <w:rPr>
-          <w:rFonts w:ascii="Garamond" w:hAnsi="Garamond"/>
-          <w:color w:val="00A0FC"/>
-          <w:sz w:val="36"/>
-          <w:szCs w:val="36"/>
-        </w:rPr>
-      </w:r>
-    </w:p>
-    <w:p>
-      <w:pPr>
-        <w:pStyle w:val="Normal"/>
-        <w:bidi w:val="0"/>
-        <w:ind w:left="709" w:hanging="0"/>
-        <w:jc w:val="both"/>
-        <w:rPr>
-          <w:rFonts w:ascii="Garamond" w:hAnsi="Garamond"/>
-          <w:color w:val="00A0FC"/>
-          <w:sz w:val="36"/>
-          <w:szCs w:val="36"/>
-        </w:rPr>
-      </w:pPr>
-      <w:r>
-        <w:rPr>
-          <w:rFonts w:eastAsia="Noto Serif CJK SC" w:cs="Noto Sans Devanagari" w:ascii="Garamond" w:hAnsi="Garamond"/>
-          <w:i w:val="false"/>
-          <w:iCs w:val="false"/>
-          <w:color w:val="00A0FC"/>
-          <w:kern w:val="2"/>
-          <w:sz w:val="36"/>
-          <w:szCs w:val="36"/>
-          <w:lang w:val="pt-BR" w:eastAsia="zh-CN" w:bidi="hi-IN"/>
-        </w:rPr>
-        <w:t>Então, alguém poderia questionar a resposta da Espiritualidade e argumentar que nesses casos, os Espíritos foram, sim, atraídos por questões de ordem material.</w:t>
-      </w:r>
-    </w:p>
-    <w:p>
-      <w:pPr>
-        <w:pStyle w:val="Normal"/>
-        <w:bidi w:val="0"/>
-        <w:ind w:left="709" w:hanging="0"/>
-        <w:jc w:val="both"/>
-        <w:rPr>
-          <w:rFonts w:ascii="Garamond" w:hAnsi="Garamond"/>
-          <w:color w:val="00A0FC"/>
-          <w:sz w:val="36"/>
-          <w:szCs w:val="36"/>
-        </w:rPr>
-      </w:pPr>
-      <w:r>
-        <w:rPr>
-          <w:rFonts w:ascii="Garamond" w:hAnsi="Garamond"/>
-          <w:color w:val="00A0FC"/>
-          <w:sz w:val="36"/>
-          <w:szCs w:val="36"/>
-        </w:rPr>
-      </w:r>
-    </w:p>
-    <w:p>
-      <w:pPr>
-        <w:pStyle w:val="Normal"/>
-        <w:bidi w:val="0"/>
-        <w:ind w:left="709" w:hanging="0"/>
-        <w:jc w:val="both"/>
-        <w:rPr>
-          <w:rFonts w:ascii="Garamond" w:hAnsi="Garamond"/>
-          <w:color w:val="00A0FC"/>
-          <w:sz w:val="36"/>
-          <w:szCs w:val="36"/>
-        </w:rPr>
-      </w:pPr>
-      <w:r>
-        <w:rPr>
-          <w:rFonts w:eastAsia="Noto Serif CJK SC" w:cs="Noto Sans Devanagari" w:ascii="Garamond" w:hAnsi="Garamond"/>
-          <w:i w:val="false"/>
-          <w:iCs w:val="false"/>
-          <w:color w:val="00A0FC"/>
-          <w:kern w:val="2"/>
-          <w:sz w:val="36"/>
-          <w:szCs w:val="36"/>
-          <w:lang w:val="pt-BR" w:eastAsia="zh-CN" w:bidi="hi-IN"/>
-        </w:rPr>
-        <w:t xml:space="preserve">De fato, o fator material nesses casos, exerce grande influência, mas não podemos nos esquecer que, antes de tudo, são as vibrações inferiores, são os pensamentos infelizes que os atraíram em primeiro lugar. Indo a esses locais atraídos pelos pensamentos, eles se comprazem com os recursos materiais que ali encontram - álcool, fumo, sexo - mas o primeiro e principal atrativo que os levou até ali foram os pensamentos dos encarnados que ali se encontram. </w:t>
-      </w:r>
-    </w:p>
-    <w:p>
-      <w:pPr>
-        <w:pStyle w:val="Normal"/>
-        <w:bidi w:val="0"/>
-        <w:jc w:val="both"/>
-        <w:rPr>
-          <w:rFonts w:ascii="Garamond" w:hAnsi="Garamond"/>
-          <w:sz w:val="36"/>
-          <w:szCs w:val="36"/>
-        </w:rPr>
-      </w:pPr>
-      <w:r>
-        <w:rPr>
-          <w:rFonts w:ascii="Garamond" w:hAnsi="Garamond"/>
-          <w:sz w:val="36"/>
-          <w:szCs w:val="36"/>
-        </w:rPr>
-      </w:r>
-    </w:p>
-    <w:p>
-      <w:pPr>
-        <w:pStyle w:val="Normal"/>
-        <w:bidi w:val="0"/>
-        <w:jc w:val="both"/>
-        <w:rPr>
-          <w:rFonts w:ascii="Garamond" w:hAnsi="Garamond"/>
-          <w:sz w:val="36"/>
-          <w:szCs w:val="36"/>
-        </w:rPr>
-      </w:pPr>
-      <w:r>
-        <w:rPr>
-          <w:rFonts w:eastAsia="Noto Serif CJK SC" w:cs="Noto Sans Devanagari" w:ascii="Garamond" w:hAnsi="Garamond"/>
-          <w:color w:val="auto"/>
-          <w:kern w:val="2"/>
-          <w:sz w:val="36"/>
-          <w:szCs w:val="36"/>
-          <w:lang w:val="pt-BR" w:eastAsia="zh-CN" w:bidi="hi-IN"/>
-        </w:rPr>
-        <w:t>a)</w:t>
-      </w:r>
-      <w:r>
-        <w:rPr>
-          <w:rFonts w:ascii="Garamond" w:hAnsi="Garamond"/>
-          <w:sz w:val="36"/>
-          <w:szCs w:val="36"/>
-        </w:rPr>
-        <w:t xml:space="preserve"> Mas não é exato que alguns Espíritos têm ditado, eles próprios, fórmulas cabalísticas?</w:t>
-      </w:r>
-    </w:p>
-    <w:p>
-      <w:pPr>
-        <w:pStyle w:val="Normal"/>
-        <w:bidi w:val="0"/>
-        <w:jc w:val="both"/>
-        <w:rPr>
-          <w:rFonts w:ascii="Garamond" w:hAnsi="Garamond"/>
-          <w:sz w:val="36"/>
-          <w:szCs w:val="36"/>
-        </w:rPr>
-      </w:pPr>
-      <w:r>
-        <w:rPr>
-          <w:rFonts w:ascii="Garamond" w:hAnsi="Garamond"/>
-          <w:sz w:val="36"/>
-          <w:szCs w:val="36"/>
-        </w:rPr>
-      </w:r>
-    </w:p>
-    <w:p>
-      <w:pPr>
-        <w:pStyle w:val="Normal"/>
-        <w:bidi w:val="0"/>
-        <w:ind w:hanging="0"/>
-        <w:jc w:val="both"/>
-        <w:rPr>
-          <w:rFonts w:ascii="Garamond" w:hAnsi="Garamond"/>
-          <w:sz w:val="36"/>
-          <w:szCs w:val="36"/>
-        </w:rPr>
-      </w:pPr>
+        <w:t>Há, se quiserdes, uma espécie de instinto, dependendo isso da</w:t>
+      </w:r>
       <w:r>
         <w:rPr>
           <w:rFonts w:ascii="Garamond" w:hAnsi="Garamond"/>
@@ -3141,7 +3399,7 @@
           <w:sz w:val="36"/>
           <w:szCs w:val="36"/>
         </w:rPr>
-        <w:t>“</w:t>
+        <w:t xml:space="preserve"> </w:t>
       </w:r>
       <w:r>
         <w:rPr>
@@ -3151,192 +3409,8 @@
           <w:sz w:val="36"/>
           <w:szCs w:val="36"/>
         </w:rPr>
-        <w:t>Efetivamente, Espíritos há que indicam sinais, palavras estranhas, ou prescrevem a prática de atos, por meio dos quais se fazem os chamados conjuros. Ficai certos, porém, de que são Espíritos que de vós outros escarnecem e zombam da vossa credulidade."</w:t>
-      </w:r>
-    </w:p>
-    <w:p>
-      <w:pPr>
-        <w:pStyle w:val="Normal"/>
-        <w:bidi w:val="0"/>
-        <w:ind w:hanging="0"/>
-        <w:jc w:val="both"/>
-        <w:rPr>
-          <w:rFonts w:ascii="Garamond" w:hAnsi="Garamond"/>
-          <w:sz w:val="36"/>
-          <w:szCs w:val="36"/>
-        </w:rPr>
-      </w:pPr>
-      <w:r>
-        <w:rPr>
-          <w:rFonts w:ascii="Garamond" w:hAnsi="Garamond"/>
-          <w:sz w:val="36"/>
-          <w:szCs w:val="36"/>
-        </w:rPr>
-      </w:r>
-    </w:p>
-    <w:p>
-      <w:pPr>
-        <w:pStyle w:val="Normal"/>
-        <w:bidi w:val="0"/>
-        <w:ind w:left="709" w:hanging="0"/>
-        <w:jc w:val="both"/>
-        <w:rPr>
-          <w:rFonts w:ascii="Garamond" w:hAnsi="Garamond"/>
-          <w:color w:val="00A0FC"/>
-          <w:sz w:val="36"/>
-          <w:szCs w:val="36"/>
-        </w:rPr>
-      </w:pPr>
-      <w:r>
-        <w:rPr>
-          <w:rFonts w:eastAsia="Noto Serif CJK SC" w:cs="Noto Sans Devanagari" w:ascii="Garamond" w:hAnsi="Garamond"/>
-          <w:i w:val="false"/>
-          <w:iCs w:val="false"/>
-          <w:color w:val="00A0FC"/>
-          <w:kern w:val="2"/>
-          <w:sz w:val="36"/>
-          <w:szCs w:val="36"/>
-          <w:lang w:val="pt-BR" w:eastAsia="zh-CN" w:bidi="hi-IN"/>
-        </w:rPr>
-        <w:t>Kardec questiona à Espiritualidade o seguinte: muito bem, vocês dizem que palavras e rituais não exercem nenhuma influência sobre os espíritos. Entretanto, há aqueles que, eles próprios tem ditado palavras e rituais que podem ser usados para invocá-los. Que se deve pensar sobre isso?</w:t>
-      </w:r>
-    </w:p>
-    <w:p>
-      <w:pPr>
-        <w:pStyle w:val="Normal"/>
-        <w:bidi w:val="0"/>
-        <w:ind w:left="709" w:hanging="0"/>
-        <w:jc w:val="both"/>
-        <w:rPr>
-          <w:rFonts w:ascii="Garamond" w:hAnsi="Garamond"/>
-          <w:color w:val="00A0FC"/>
-          <w:sz w:val="36"/>
-          <w:szCs w:val="36"/>
-        </w:rPr>
-      </w:pPr>
-      <w:r>
-        <w:rPr>
-          <w:rFonts w:ascii="Garamond" w:hAnsi="Garamond"/>
-          <w:color w:val="00A0FC"/>
-          <w:sz w:val="36"/>
-          <w:szCs w:val="36"/>
-        </w:rPr>
-      </w:r>
-    </w:p>
-    <w:p>
-      <w:pPr>
-        <w:pStyle w:val="Normal"/>
-        <w:bidi w:val="0"/>
-        <w:ind w:left="709" w:hanging="0"/>
-        <w:jc w:val="both"/>
-        <w:rPr>
-          <w:rFonts w:ascii="Garamond" w:hAnsi="Garamond"/>
-          <w:color w:val="00A0FC"/>
-          <w:sz w:val="36"/>
-          <w:szCs w:val="36"/>
-        </w:rPr>
-      </w:pPr>
-      <w:r>
-        <w:rPr>
-          <w:rFonts w:eastAsia="Noto Serif CJK SC" w:cs="Noto Sans Devanagari" w:ascii="Garamond" w:hAnsi="Garamond"/>
-          <w:i w:val="false"/>
-          <w:iCs w:val="false"/>
-          <w:color w:val="00A0FC"/>
-          <w:kern w:val="2"/>
-          <w:sz w:val="36"/>
-          <w:szCs w:val="36"/>
-          <w:lang w:val="pt-BR" w:eastAsia="zh-CN" w:bidi="hi-IN"/>
-        </w:rPr>
-        <w:t>A Espiritualidade responde que é certo que há tais espíritos, mas nos adverte quanto à natureza deles: são espíritos zombeteiros e escarnecedores. Eles próprios sabem que a recomendação que dão nesse sentido, de nada vale. Fazem isso apenas para poderem rir, zombar  e escarnecer das pessoas que neles acreditam e que levam adiante as práticas por eles recomendadas.</w:t>
-      </w:r>
-    </w:p>
-    <w:p>
-      <w:pPr>
-        <w:pStyle w:val="Normal"/>
-        <w:bidi w:val="0"/>
-        <w:ind w:left="709" w:hanging="0"/>
-        <w:jc w:val="both"/>
-        <w:rPr>
-          <w:rFonts w:ascii="Garamond" w:hAnsi="Garamond"/>
-          <w:color w:val="00A0FC"/>
-          <w:sz w:val="36"/>
-          <w:szCs w:val="36"/>
-        </w:rPr>
-      </w:pPr>
-      <w:r>
-        <w:rPr>
-          <w:rFonts w:ascii="Garamond" w:hAnsi="Garamond"/>
-          <w:color w:val="00A0FC"/>
-          <w:sz w:val="36"/>
-          <w:szCs w:val="36"/>
-        </w:rPr>
-      </w:r>
-      <w:r>
-        <w:br w:type="page"/>
-      </w:r>
-    </w:p>
-    <w:p>
-      <w:pPr>
-        <w:pStyle w:val="Normal"/>
-        <w:bidi w:val="0"/>
-        <w:jc w:val="both"/>
-        <w:rPr>
-          <w:rFonts w:ascii="Garamond" w:hAnsi="Garamond"/>
-          <w:sz w:val="36"/>
-          <w:szCs w:val="36"/>
-        </w:rPr>
-      </w:pPr>
-      <w:r>
-        <w:rPr>
-          <w:rFonts w:eastAsia="Noto Serif CJK SC" w:cs="Noto Sans Devanagari" w:ascii="Garamond" w:hAnsi="Garamond"/>
-          <w:color w:val="auto"/>
-          <w:kern w:val="2"/>
-          <w:sz w:val="36"/>
-          <w:szCs w:val="36"/>
-          <w:lang w:val="pt-BR" w:eastAsia="zh-CN" w:bidi="hi-IN"/>
-        </w:rPr>
-        <w:t>554</w:t>
-      </w:r>
-      <w:r>
-        <w:rPr>
-          <w:rFonts w:ascii="Garamond" w:hAnsi="Garamond"/>
-          <w:sz w:val="36"/>
-          <w:szCs w:val="36"/>
-        </w:rPr>
-        <w:t>. Não pode aquele que, com ou sem razão, confia no que chama a virtude de um talismã, atrair um Espírito, por efeito mesmo dessa confiança, visto que, então, o que atua é o pensamento, não passando o talismã de um sinal que apenas lhe auxilia a concentração?</w:t>
-      </w:r>
-    </w:p>
-    <w:p>
-      <w:pPr>
-        <w:pStyle w:val="Normal"/>
-        <w:bidi w:val="0"/>
-        <w:jc w:val="both"/>
-        <w:rPr>
-          <w:rFonts w:ascii="Garamond" w:hAnsi="Garamond"/>
-          <w:sz w:val="36"/>
-          <w:szCs w:val="36"/>
-        </w:rPr>
-      </w:pPr>
-      <w:r>
-        <w:rPr>
-          <w:rFonts w:ascii="Garamond" w:hAnsi="Garamond"/>
-          <w:sz w:val="36"/>
-          <w:szCs w:val="36"/>
-        </w:rPr>
-      </w:r>
-    </w:p>
-    <w:p>
-      <w:pPr>
-        <w:pStyle w:val="Normal"/>
-        <w:bidi w:val="0"/>
-        <w:ind w:hanging="0"/>
-        <w:jc w:val="both"/>
-        <w:rPr>
-          <w:rFonts w:ascii="Garamond" w:hAnsi="Garamond"/>
-          <w:sz w:val="36"/>
-          <w:szCs w:val="36"/>
-        </w:rPr>
-      </w:pPr>
+        <w:t>extensão que se dê ao significado desta palavra. É, porém, um</w:t>
+      </w:r>
       <w:r>
         <w:rPr>
           <w:rFonts w:ascii="Garamond" w:hAnsi="Garamond"/>
@@ -3345,7 +3419,7 @@
           <w:sz w:val="36"/>
           <w:szCs w:val="36"/>
         </w:rPr>
-        <w:t>“</w:t>
+        <w:t xml:space="preserve"> </w:t>
       </w:r>
       <w:r>
         <w:rPr>
@@ -3355,17 +3429,47 @@
           <w:sz w:val="36"/>
           <w:szCs w:val="36"/>
         </w:rPr>
-        <w:t>É verdade, mas da pureza da intenção e da elevação dos sentimentos depende a natureza do Espírito que é atraído. Ora, muito raramente aquele que seja bastante simplório para acreditar na virtude de um talismã deixará de colimar um fim mais material do que moral. Qualquer, porém, que seja o caso, essa crença denuncia uma inferioridade e uma fraqueza de ideias que favorecem a ação dos Espíritos imperfeitos e escarninhos.</w:t>
-      </w:r>
-      <w:r>
-        <w:rPr>
-          <w:rFonts w:ascii="Garamond" w:hAnsi="Garamond"/>
-          <w:i w:val="false"/>
-          <w:iCs w:val="false"/>
-          <w:sz w:val="36"/>
-          <w:szCs w:val="36"/>
-        </w:rPr>
-        <w:t>"</w:t>
+        <w:t>instinto puramente mecânico. Quando, nas operações químicas,observais que dois corpos se reúnem, é que um ao outro convém;</w:t>
+      </w:r>
+      <w:r>
+        <w:rPr>
+          <w:rFonts w:ascii="Garamond" w:hAnsi="Garamond"/>
+          <w:i/>
+          <w:iCs/>
+          <w:sz w:val="36"/>
+          <w:szCs w:val="36"/>
+        </w:rPr>
+        <w:t xml:space="preserve"> </w:t>
+      </w:r>
+      <w:r>
+        <w:rPr>
+          <w:rFonts w:ascii="Garamond" w:hAnsi="Garamond"/>
+          <w:i/>
+          <w:iCs/>
+          <w:sz w:val="36"/>
+          <w:szCs w:val="36"/>
+        </w:rPr>
+        <w:t>quer dizer: é que há entre eles afinidade. Ora, a isto não dais o</w:t>
+      </w:r>
+      <w:r>
+        <w:rPr>
+          <w:rFonts w:ascii="Garamond" w:hAnsi="Garamond"/>
+          <w:i/>
+          <w:iCs/>
+          <w:sz w:val="36"/>
+          <w:szCs w:val="36"/>
+        </w:rPr>
+        <w:t xml:space="preserve"> </w:t>
+      </w:r>
+      <w:r>
+        <w:rPr>
+          <w:rFonts w:ascii="Garamond" w:hAnsi="Garamond"/>
+          <w:i/>
+          <w:iCs/>
+          <w:sz w:val="36"/>
+          <w:szCs w:val="36"/>
+        </w:rPr>
+        <w:t xml:space="preserve">nome de instinto.” </w:t>
       </w:r>
     </w:p>
     <w:p>

</xml_diff>

<commit_message>
01/10/2026 - 23:33 h
</commit_message>
<xml_diff>
--- a/Estudo de O Livro dos Espíritos - 28-09-2026.docx
+++ b/Estudo de O Livro dos Espíritos - 28-09-2026.docx
@@ -2478,50 +2478,29 @@
           <w:szCs w:val="36"/>
           <w:lang w:val="pt-BR" w:eastAsia="zh-CN" w:bidi="hi-IN"/>
         </w:rPr>
-        <w:t xml:space="preserve">Bastante interessante a </w:t>
-      </w:r>
-      <w:r>
-        <w:rPr>
-          <w:rFonts w:eastAsia="Noto Serif CJK SC" w:cs="Noto Sans Devanagari" w:ascii="Garamond" w:hAnsi="Garamond"/>
-          <w:i w:val="false"/>
-          <w:iCs w:val="false"/>
-          <w:color w:val="00A0FC"/>
-          <w:kern w:val="2"/>
-          <w:sz w:val="36"/>
-          <w:szCs w:val="36"/>
-          <w:lang w:val="pt-BR" w:eastAsia="zh-CN" w:bidi="hi-IN"/>
-        </w:rPr>
-        <w:t xml:space="preserve"> pergunta de Kardec</w:t>
-      </w:r>
-      <w:r>
-        <w:rPr>
-          <w:rFonts w:eastAsia="Noto Serif CJK SC" w:cs="Noto Sans Devanagari" w:ascii="Garamond" w:hAnsi="Garamond"/>
-          <w:i w:val="false"/>
-          <w:iCs w:val="false"/>
-          <w:color w:val="00A0FC"/>
-          <w:kern w:val="2"/>
-          <w:sz w:val="36"/>
-          <w:szCs w:val="36"/>
-          <w:lang w:val="pt-BR" w:eastAsia="zh-CN" w:bidi="hi-IN"/>
-        </w:rPr>
-        <w:t>. Ele fala de determinadas espécies de plantas que tem um comportamento que dá a entender que elas pensam.</w:t>
-      </w:r>
-    </w:p>
-    <w:p>
-      <w:pPr>
-        <w:pStyle w:val="Normal"/>
-        <w:bidi w:val="0"/>
-        <w:ind w:left="709" w:hanging="0"/>
-        <w:jc w:val="both"/>
-        <w:rPr>
-          <w:rFonts w:ascii="Garamond" w:hAnsi="Garamond"/>
-          <w:color w:val="00A0FC"/>
-          <w:sz w:val="36"/>
-          <w:szCs w:val="36"/>
-        </w:rPr>
-      </w:pPr>
-      <w:r>
-        <w:rPr/>
+        <w:t>Bastante interessante a  pergunta de Kardec. Ele fala de determinadas espécies de plantas que tem um comportamento que dá a entender que elas pensam.</w:t>
+      </w:r>
+    </w:p>
+    <w:p>
+      <w:pPr>
+        <w:pStyle w:val="Normal"/>
+        <w:bidi w:val="0"/>
+        <w:ind w:left="709" w:hanging="0"/>
+        <w:jc w:val="both"/>
+        <w:rPr>
+          <w:rFonts w:ascii="Garamond" w:hAnsi="Garamond"/>
+          <w:color w:val="00A0FC"/>
+          <w:sz w:val="36"/>
+          <w:szCs w:val="36"/>
+        </w:rPr>
+      </w:pPr>
+      <w:r>
+        <w:rPr>
+          <w:rFonts w:ascii="Garamond" w:hAnsi="Garamond"/>
+          <w:color w:val="00A0FC"/>
+          <w:sz w:val="36"/>
+          <w:szCs w:val="36"/>
+        </w:rPr>
       </w:r>
     </w:p>
     <w:p>
@@ -2565,7 +2544,12 @@
         </w:rPr>
       </w:pPr>
       <w:r>
-        <w:rPr/>
+        <w:rPr>
+          <w:rFonts w:ascii="Garamond" w:hAnsi="Garamond"/>
+          <w:color w:val="00A0FC"/>
+          <w:sz w:val="36"/>
+          <w:szCs w:val="36"/>
+        </w:rPr>
       </w:r>
     </w:p>
     <w:p>
@@ -2609,7 +2593,12 @@
         </w:rPr>
       </w:pPr>
       <w:r>
-        <w:rPr/>
+        <w:rPr>
+          <w:rFonts w:ascii="Garamond" w:hAnsi="Garamond"/>
+          <w:color w:val="00A0FC"/>
+          <w:sz w:val="36"/>
+          <w:szCs w:val="36"/>
+        </w:rPr>
       </w:r>
     </w:p>
     <w:p>
@@ -2653,7 +2642,12 @@
         </w:rPr>
       </w:pPr>
       <w:r>
-        <w:rPr/>
+        <w:rPr>
+          <w:rFonts w:ascii="Garamond" w:hAnsi="Garamond"/>
+          <w:color w:val="00A0FC"/>
+          <w:sz w:val="36"/>
+          <w:szCs w:val="36"/>
+        </w:rPr>
       </w:r>
     </w:p>
     <w:p>
@@ -2697,7 +2691,12 @@
         </w:rPr>
       </w:pPr>
       <w:r>
-        <w:rPr/>
+        <w:rPr>
+          <w:rFonts w:ascii="Garamond" w:hAnsi="Garamond"/>
+          <w:color w:val="00A0FC"/>
+          <w:sz w:val="36"/>
+          <w:szCs w:val="36"/>
+        </w:rPr>
       </w:r>
     </w:p>
     <w:p>
@@ -2741,7 +2740,12 @@
         </w:rPr>
       </w:pPr>
       <w:r>
-        <w:rPr/>
+        <w:rPr>
+          <w:rFonts w:ascii="Garamond" w:hAnsi="Garamond"/>
+          <w:color w:val="00A0FC"/>
+          <w:sz w:val="36"/>
+          <w:szCs w:val="36"/>
+        </w:rPr>
       </w:r>
     </w:p>
     <w:p>
@@ -2785,7 +2789,12 @@
         </w:rPr>
       </w:pPr>
       <w:r>
-        <w:rPr/>
+        <w:rPr>
+          <w:rFonts w:ascii="Garamond" w:hAnsi="Garamond"/>
+          <w:color w:val="00A0FC"/>
+          <w:sz w:val="36"/>
+          <w:szCs w:val="36"/>
+        </w:rPr>
       </w:r>
     </w:p>
     <w:p>
@@ -2829,7 +2838,12 @@
         </w:rPr>
       </w:pPr>
       <w:r>
-        <w:rPr/>
+        <w:rPr>
+          <w:rFonts w:ascii="Garamond" w:hAnsi="Garamond"/>
+          <w:color w:val="00A0FC"/>
+          <w:sz w:val="36"/>
+          <w:szCs w:val="36"/>
+        </w:rPr>
       </w:r>
     </w:p>
     <w:p>
@@ -2873,7 +2887,12 @@
         </w:rPr>
       </w:pPr>
       <w:r>
-        <w:rPr/>
+        <w:rPr>
+          <w:rFonts w:ascii="Garamond" w:hAnsi="Garamond"/>
+          <w:color w:val="00A0FC"/>
+          <w:sz w:val="36"/>
+          <w:szCs w:val="36"/>
+        </w:rPr>
       </w:r>
     </w:p>
     <w:p>
@@ -2917,7 +2936,12 @@
         </w:rPr>
       </w:pPr>
       <w:r>
-        <w:rPr/>
+        <w:rPr>
+          <w:rFonts w:ascii="Garamond" w:hAnsi="Garamond"/>
+          <w:color w:val="00A0FC"/>
+          <w:sz w:val="36"/>
+          <w:szCs w:val="36"/>
+        </w:rPr>
       </w:r>
     </w:p>
     <w:p>
@@ -2961,7 +2985,12 @@
         </w:rPr>
       </w:pPr>
       <w:r>
-        <w:rPr/>
+        <w:rPr>
+          <w:rFonts w:ascii="Garamond" w:hAnsi="Garamond"/>
+          <w:color w:val="00A0FC"/>
+          <w:sz w:val="36"/>
+          <w:szCs w:val="36"/>
+        </w:rPr>
       </w:r>
     </w:p>
     <w:p>
@@ -3005,24 +3034,34 @@
         </w:rPr>
       </w:pPr>
       <w:r>
-        <w:rPr/>
-      </w:r>
-    </w:p>
-    <w:p>
-      <w:pPr>
-        <w:pStyle w:val="Normal"/>
-        <w:bidi w:val="0"/>
-        <w:ind w:left="709" w:hanging="0"/>
-        <w:jc w:val="both"/>
-        <w:rPr>
-          <w:rFonts w:ascii="Garamond" w:hAnsi="Garamond"/>
-          <w:color w:val="00A0FC"/>
-          <w:sz w:val="36"/>
-          <w:szCs w:val="36"/>
-        </w:rPr>
-      </w:pPr>
-      <w:r>
-        <w:rPr/>
+        <w:rPr>
+          <w:rFonts w:ascii="Garamond" w:hAnsi="Garamond"/>
+          <w:color w:val="00A0FC"/>
+          <w:sz w:val="36"/>
+          <w:szCs w:val="36"/>
+        </w:rPr>
+      </w:r>
+    </w:p>
+    <w:p>
+      <w:pPr>
+        <w:pStyle w:val="Normal"/>
+        <w:bidi w:val="0"/>
+        <w:ind w:left="709" w:hanging="0"/>
+        <w:jc w:val="both"/>
+        <w:rPr>
+          <w:rFonts w:ascii="Garamond" w:hAnsi="Garamond"/>
+          <w:color w:val="00A0FC"/>
+          <w:sz w:val="36"/>
+          <w:szCs w:val="36"/>
+        </w:rPr>
+      </w:pPr>
+      <w:r>
+        <w:rPr>
+          <w:rFonts w:ascii="Garamond" w:hAnsi="Garamond"/>
+          <w:color w:val="00A0FC"/>
+          <w:sz w:val="36"/>
+          <w:szCs w:val="36"/>
+        </w:rPr>
       </w:r>
     </w:p>
     <w:p>
@@ -3054,20 +3093,7 @@
           <w:szCs w:val="36"/>
           <w:lang w:val="pt-BR" w:eastAsia="zh-CN" w:bidi="hi-IN"/>
         </w:rPr>
-        <w:t>Basta nós observarmos a diferença absurda que existe entre o organismo de um</w:t>
-      </w:r>
-      <w:r>
-        <w:rPr>
-          <w:rFonts w:eastAsia="Noto Serif CJK SC" w:cs="Noto Sans Devanagari" w:ascii="Garamond" w:hAnsi="Garamond"/>
-          <w:i w:val="false"/>
-          <w:iCs w:val="false"/>
-          <w:color w:val="00A0FC"/>
-          <w:kern w:val="2"/>
-          <w:sz w:val="36"/>
-          <w:szCs w:val="36"/>
-          <w:lang w:val="pt-BR" w:eastAsia="zh-CN" w:bidi="hi-IN"/>
-        </w:rPr>
-        <w:t xml:space="preserve">a esponja-do-mar e um chimpanzé. Só por curiosidade: preparando esse estudo eu descobri que os insetos e os caramujos possuem organismos mais complexos do que a esponja-do-mar. </w:t>
+        <w:t xml:space="preserve">Basta nós observarmos a diferença absurda que existe entre o organismo de uma esponja-do-mar e um chimpanzé. Só por curiosidade: preparando esse estudo eu descobri que os insetos e os caramujos possuem organismos mais complexos do que a esponja-do-mar. </w:t>
       </w:r>
     </w:p>
     <w:p>
@@ -3273,24 +3299,34 @@
         </w:rPr>
       </w:pPr>
       <w:r>
-        <w:rPr/>
-      </w:r>
-    </w:p>
-    <w:p>
-      <w:pPr>
-        <w:pStyle w:val="Normal"/>
-        <w:bidi w:val="0"/>
-        <w:ind w:left="709" w:hanging="0"/>
-        <w:jc w:val="both"/>
-        <w:rPr>
-          <w:rFonts w:ascii="Garamond" w:hAnsi="Garamond"/>
-          <w:color w:val="00A0FC"/>
-          <w:sz w:val="36"/>
-          <w:szCs w:val="36"/>
-        </w:rPr>
-      </w:pPr>
-      <w:r>
-        <w:rPr/>
+        <w:rPr>
+          <w:rFonts w:ascii="Garamond" w:hAnsi="Garamond"/>
+          <w:color w:val="00A0FC"/>
+          <w:sz w:val="36"/>
+          <w:szCs w:val="36"/>
+        </w:rPr>
+      </w:r>
+    </w:p>
+    <w:p>
+      <w:pPr>
+        <w:pStyle w:val="Normal"/>
+        <w:bidi w:val="0"/>
+        <w:ind w:left="709" w:hanging="0"/>
+        <w:jc w:val="both"/>
+        <w:rPr>
+          <w:rFonts w:ascii="Garamond" w:hAnsi="Garamond"/>
+          <w:color w:val="00A0FC"/>
+          <w:sz w:val="36"/>
+          <w:szCs w:val="36"/>
+        </w:rPr>
+      </w:pPr>
+      <w:r>
+        <w:rPr>
+          <w:rFonts w:ascii="Garamond" w:hAnsi="Garamond"/>
+          <w:color w:val="00A0FC"/>
+          <w:sz w:val="36"/>
+          <w:szCs w:val="36"/>
+        </w:rPr>
       </w:r>
     </w:p>
     <w:p>
@@ -3321,23 +3357,7 @@
           <w:sz w:val="36"/>
           <w:szCs w:val="36"/>
         </w:rPr>
-        <w:t>. Não haverá nas plantas, como nos animais, um instinto de conservação, que as induza a procurar o que lhes possa ser útil e a evitar o</w:t>
-      </w:r>
-      <w:r>
-        <w:rPr>
-          <w:rFonts w:ascii="Garamond" w:hAnsi="Garamond"/>
-          <w:sz w:val="36"/>
-          <w:szCs w:val="36"/>
-        </w:rPr>
-        <w:t xml:space="preserve"> </w:t>
-      </w:r>
-      <w:r>
-        <w:rPr>
-          <w:rFonts w:ascii="Garamond" w:hAnsi="Garamond"/>
-          <w:sz w:val="36"/>
-          <w:szCs w:val="36"/>
-        </w:rPr>
-        <w:t>que lhes possa ser nocivo?</w:t>
+        <w:t>. Não haverá nas plantas, como nos animais, um instinto de conservação, que as induza a procurar o que lhes possa ser útil e a evitar o que lhes possa ser nocivo?</w:t>
       </w:r>
     </w:p>
     <w:p>
@@ -3389,8 +3409,744 @@
           <w:sz w:val="36"/>
           <w:szCs w:val="36"/>
         </w:rPr>
-        <w:t>Há, se quiserdes, uma espécie de instinto, dependendo isso da</w:t>
-      </w:r>
+        <w:t xml:space="preserve">Há, se quiserdes, uma espécie de instinto, dependendo isso da extensão que se dê ao significado desta palavra. É, porém, um instinto puramente mecânico. Quando, nas operações químicas,observais que dois corpos se reúnem, é que um ao outro convém; quer dizer: é que há entre eles afinidade. Ora, a isto não dais o nome de instinto.” </w:t>
+      </w:r>
+    </w:p>
+    <w:p>
+      <w:pPr>
+        <w:pStyle w:val="Normal"/>
+        <w:bidi w:val="0"/>
+        <w:ind w:left="709" w:hanging="0"/>
+        <w:jc w:val="both"/>
+        <w:rPr>
+          <w:rFonts w:ascii="Garamond" w:hAnsi="Garamond" w:eastAsia="Noto Serif CJK SC" w:cs="Noto Sans Devanagari"/>
+          <w:i w:val="false"/>
+          <w:i w:val="false"/>
+          <w:iCs w:val="false"/>
+          <w:color w:val="00A0FC"/>
+          <w:kern w:val="2"/>
+          <w:sz w:val="36"/>
+          <w:szCs w:val="36"/>
+          <w:lang w:val="pt-BR" w:eastAsia="zh-CN" w:bidi="hi-IN"/>
+        </w:rPr>
+      </w:pPr>
+      <w:r>
+        <w:rPr>
+          <w:rFonts w:eastAsia="Noto Serif CJK SC" w:cs="Noto Sans Devanagari" w:ascii="Garamond" w:hAnsi="Garamond"/>
+          <w:i w:val="false"/>
+          <w:iCs w:val="false"/>
+          <w:color w:val="00A0FC"/>
+          <w:kern w:val="2"/>
+          <w:sz w:val="36"/>
+          <w:szCs w:val="36"/>
+          <w:lang w:val="pt-BR" w:eastAsia="zh-CN" w:bidi="hi-IN"/>
+        </w:rPr>
+      </w:r>
+    </w:p>
+    <w:p>
+      <w:pPr>
+        <w:pStyle w:val="Normal"/>
+        <w:bidi w:val="0"/>
+        <w:ind w:left="709" w:hanging="0"/>
+        <w:jc w:val="both"/>
+        <w:rPr>
+          <w:rFonts w:ascii="Garamond" w:hAnsi="Garamond"/>
+          <w:color w:val="00A0FC"/>
+          <w:sz w:val="36"/>
+          <w:szCs w:val="36"/>
+        </w:rPr>
+      </w:pPr>
+      <w:r>
+        <w:rPr>
+          <w:rFonts w:eastAsia="Noto Serif CJK SC" w:cs="Noto Sans Devanagari" w:ascii="Garamond" w:hAnsi="Garamond"/>
+          <w:i w:val="false"/>
+          <w:iCs w:val="false"/>
+          <w:color w:val="00A0FC"/>
+          <w:kern w:val="2"/>
+          <w:sz w:val="36"/>
+          <w:szCs w:val="36"/>
+          <w:lang w:val="pt-BR" w:eastAsia="zh-CN" w:bidi="hi-IN"/>
+        </w:rPr>
+        <w:t xml:space="preserve">Nessa questão </w:t>
+      </w:r>
+      <w:r>
+        <w:rPr>
+          <w:rFonts w:eastAsia="Noto Serif CJK SC" w:cs="Noto Sans Devanagari" w:ascii="Garamond" w:hAnsi="Garamond"/>
+          <w:i w:val="false"/>
+          <w:iCs w:val="false"/>
+          <w:color w:val="00A0FC"/>
+          <w:kern w:val="2"/>
+          <w:sz w:val="36"/>
+          <w:szCs w:val="36"/>
+          <w:lang w:val="pt-BR" w:eastAsia="zh-CN" w:bidi="hi-IN"/>
+        </w:rPr>
+        <w:t xml:space="preserve">Kardec </w:t>
+      </w:r>
+      <w:r>
+        <w:rPr>
+          <w:rFonts w:eastAsia="Noto Serif CJK SC" w:cs="Noto Sans Devanagari" w:ascii="Garamond" w:hAnsi="Garamond"/>
+          <w:i w:val="false"/>
+          <w:iCs w:val="false"/>
+          <w:color w:val="00A0FC"/>
+          <w:kern w:val="2"/>
+          <w:sz w:val="36"/>
+          <w:szCs w:val="36"/>
+          <w:lang w:val="pt-BR" w:eastAsia="zh-CN" w:bidi="hi-IN"/>
+        </w:rPr>
+        <w:t xml:space="preserve">quer saber se as plantas, assim como os animais, são dotadas de algum instinto de conservação que as faz procurar por aquilo que lhes é útil, ao mesmo tempo que </w:t>
+      </w:r>
+      <w:r>
+        <w:rPr>
+          <w:rFonts w:eastAsia="Noto Serif CJK SC" w:cs="Noto Sans Devanagari" w:ascii="Garamond" w:hAnsi="Garamond"/>
+          <w:i w:val="false"/>
+          <w:iCs w:val="false"/>
+          <w:color w:val="00A0FC"/>
+          <w:kern w:val="2"/>
+          <w:sz w:val="36"/>
+          <w:szCs w:val="36"/>
+          <w:lang w:val="pt-BR" w:eastAsia="zh-CN" w:bidi="hi-IN"/>
+        </w:rPr>
+        <w:t>as faz se afastarem</w:t>
+      </w:r>
+      <w:r>
+        <w:rPr>
+          <w:rFonts w:eastAsia="Noto Serif CJK SC" w:cs="Noto Sans Devanagari" w:ascii="Garamond" w:hAnsi="Garamond"/>
+          <w:i w:val="false"/>
+          <w:iCs w:val="false"/>
+          <w:color w:val="00A0FC"/>
+          <w:kern w:val="2"/>
+          <w:sz w:val="36"/>
+          <w:szCs w:val="36"/>
+          <w:lang w:val="pt-BR" w:eastAsia="zh-CN" w:bidi="hi-IN"/>
+        </w:rPr>
+        <w:t xml:space="preserve"> daquilo que lhes seja nocivo.</w:t>
+      </w:r>
+    </w:p>
+    <w:p>
+      <w:pPr>
+        <w:pStyle w:val="Normal"/>
+        <w:bidi w:val="0"/>
+        <w:ind w:left="709" w:hanging="0"/>
+        <w:jc w:val="both"/>
+        <w:rPr>
+          <w:rFonts w:ascii="Garamond" w:hAnsi="Garamond"/>
+          <w:color w:val="00A0FC"/>
+          <w:sz w:val="36"/>
+          <w:szCs w:val="36"/>
+        </w:rPr>
+      </w:pPr>
+      <w:r>
+        <w:rPr/>
+      </w:r>
+    </w:p>
+    <w:p>
+      <w:pPr>
+        <w:pStyle w:val="Normal"/>
+        <w:bidi w:val="0"/>
+        <w:ind w:left="709" w:hanging="0"/>
+        <w:jc w:val="both"/>
+        <w:rPr>
+          <w:rFonts w:ascii="Garamond" w:hAnsi="Garamond"/>
+          <w:color w:val="00A0FC"/>
+          <w:sz w:val="36"/>
+          <w:szCs w:val="36"/>
+        </w:rPr>
+      </w:pPr>
+      <w:r>
+        <w:rPr>
+          <w:rFonts w:eastAsia="Noto Serif CJK SC" w:cs="Noto Sans Devanagari" w:ascii="Garamond" w:hAnsi="Garamond"/>
+          <w:i w:val="false"/>
+          <w:iCs w:val="false"/>
+          <w:color w:val="00A0FC"/>
+          <w:kern w:val="2"/>
+          <w:sz w:val="36"/>
+          <w:szCs w:val="36"/>
+          <w:lang w:val="pt-BR" w:eastAsia="zh-CN" w:bidi="hi-IN"/>
+        </w:rPr>
+        <w:t xml:space="preserve">De fato, algumas plantas apresentam um comportamento muito particular que pode nos levar a </w:t>
+      </w:r>
+      <w:r>
+        <w:rPr>
+          <w:rFonts w:eastAsia="Noto Serif CJK SC" w:cs="Noto Sans Devanagari" w:ascii="Garamond" w:hAnsi="Garamond"/>
+          <w:i w:val="false"/>
+          <w:iCs w:val="false"/>
+          <w:color w:val="00A0FC"/>
+          <w:kern w:val="2"/>
+          <w:sz w:val="36"/>
+          <w:szCs w:val="36"/>
+          <w:lang w:val="pt-BR" w:eastAsia="zh-CN" w:bidi="hi-IN"/>
+        </w:rPr>
+        <w:t>acreditar</w:t>
+      </w:r>
+      <w:r>
+        <w:rPr>
+          <w:rFonts w:eastAsia="Noto Serif CJK SC" w:cs="Noto Sans Devanagari" w:ascii="Garamond" w:hAnsi="Garamond"/>
+          <w:i w:val="false"/>
+          <w:iCs w:val="false"/>
+          <w:color w:val="00A0FC"/>
+          <w:kern w:val="2"/>
+          <w:sz w:val="36"/>
+          <w:szCs w:val="36"/>
+          <w:lang w:val="pt-BR" w:eastAsia="zh-CN" w:bidi="hi-IN"/>
+        </w:rPr>
+        <w:t xml:space="preserve"> que elas realmente são dotadas de instinto.</w:t>
+      </w:r>
+    </w:p>
+    <w:p>
+      <w:pPr>
+        <w:pStyle w:val="Normal"/>
+        <w:bidi w:val="0"/>
+        <w:ind w:left="709" w:hanging="0"/>
+        <w:jc w:val="both"/>
+        <w:rPr>
+          <w:rFonts w:ascii="Garamond" w:hAnsi="Garamond"/>
+          <w:color w:val="00A0FC"/>
+          <w:sz w:val="36"/>
+          <w:szCs w:val="36"/>
+        </w:rPr>
+      </w:pPr>
+      <w:r>
+        <w:rPr/>
+      </w:r>
+    </w:p>
+    <w:p>
+      <w:pPr>
+        <w:pStyle w:val="Normal"/>
+        <w:bidi w:val="0"/>
+        <w:ind w:left="709" w:hanging="0"/>
+        <w:jc w:val="both"/>
+        <w:rPr>
+          <w:rFonts w:ascii="Garamond" w:hAnsi="Garamond"/>
+          <w:color w:val="00A0FC"/>
+          <w:sz w:val="36"/>
+          <w:szCs w:val="36"/>
+        </w:rPr>
+      </w:pPr>
+      <w:r>
+        <w:rPr>
+          <w:rFonts w:eastAsia="Noto Serif CJK SC" w:cs="Noto Sans Devanagari" w:ascii="Garamond" w:hAnsi="Garamond"/>
+          <w:i w:val="false"/>
+          <w:iCs w:val="false"/>
+          <w:color w:val="00A0FC"/>
+          <w:kern w:val="2"/>
+          <w:sz w:val="36"/>
+          <w:szCs w:val="36"/>
+          <w:lang w:val="pt-BR" w:eastAsia="zh-CN" w:bidi="hi-IN"/>
+        </w:rPr>
+        <w:t xml:space="preserve">Existe, por exemplo, um fenômeno chamado hidrotropismo que </w:t>
+      </w:r>
+      <w:r>
+        <w:rPr>
+          <w:rFonts w:eastAsia="Noto Serif CJK SC" w:cs="Noto Sans Devanagari" w:ascii="Garamond" w:hAnsi="Garamond"/>
+          <w:i w:val="false"/>
+          <w:iCs w:val="false"/>
+          <w:color w:val="00A0FC"/>
+          <w:kern w:val="2"/>
+          <w:sz w:val="36"/>
+          <w:szCs w:val="36"/>
+          <w:lang w:val="pt-BR" w:eastAsia="zh-CN" w:bidi="hi-IN"/>
+        </w:rPr>
+        <w:t xml:space="preserve">acontece </w:t>
+      </w:r>
+      <w:r>
+        <w:rPr>
+          <w:rFonts w:eastAsia="Noto Serif CJK SC" w:cs="Noto Sans Devanagari" w:ascii="Garamond" w:hAnsi="Garamond"/>
+          <w:i w:val="false"/>
+          <w:iCs w:val="false"/>
+          <w:color w:val="00A0FC"/>
+          <w:kern w:val="2"/>
+          <w:sz w:val="36"/>
+          <w:szCs w:val="36"/>
+          <w:lang w:val="pt-BR" w:eastAsia="zh-CN" w:bidi="hi-IN"/>
+        </w:rPr>
+        <w:t xml:space="preserve">quando a raiz da planta cresce preferencialmente para o lado que oferece melhores condições </w:t>
+      </w:r>
+      <w:r>
+        <w:rPr>
+          <w:rFonts w:eastAsia="Noto Serif CJK SC" w:cs="Noto Sans Devanagari" w:ascii="Garamond" w:hAnsi="Garamond"/>
+          <w:i w:val="false"/>
+          <w:iCs w:val="false"/>
+          <w:color w:val="00A0FC"/>
+          <w:kern w:val="2"/>
+          <w:sz w:val="36"/>
+          <w:szCs w:val="36"/>
+          <w:lang w:val="pt-BR" w:eastAsia="zh-CN" w:bidi="hi-IN"/>
+        </w:rPr>
+        <w:t>de encontrar água</w:t>
+      </w:r>
+      <w:r>
+        <w:rPr>
+          <w:rFonts w:eastAsia="Noto Serif CJK SC" w:cs="Noto Sans Devanagari" w:ascii="Garamond" w:hAnsi="Garamond"/>
+          <w:i w:val="false"/>
+          <w:iCs w:val="false"/>
+          <w:color w:val="00A0FC"/>
+          <w:kern w:val="2"/>
+          <w:sz w:val="36"/>
+          <w:szCs w:val="36"/>
+          <w:lang w:val="pt-BR" w:eastAsia="zh-CN" w:bidi="hi-IN"/>
+        </w:rPr>
+        <w:t xml:space="preserve">. </w:t>
+      </w:r>
+      <w:r>
+        <w:rPr>
+          <w:rFonts w:eastAsia="Noto Serif CJK SC" w:cs="Noto Sans Devanagari" w:ascii="Garamond" w:hAnsi="Garamond"/>
+          <w:i w:val="false"/>
+          <w:iCs w:val="false"/>
+          <w:color w:val="00A0FC"/>
+          <w:kern w:val="2"/>
+          <w:sz w:val="36"/>
+          <w:szCs w:val="36"/>
+          <w:lang w:val="pt-BR" w:eastAsia="zh-CN" w:bidi="hi-IN"/>
+        </w:rPr>
+        <w:t>Isso faz com que o crescimento das raízes seja redistribuído de acordo com o grau de umidade do solo.</w:t>
+      </w:r>
+    </w:p>
+    <w:p>
+      <w:pPr>
+        <w:pStyle w:val="Normal"/>
+        <w:bidi w:val="0"/>
+        <w:ind w:left="709" w:hanging="0"/>
+        <w:jc w:val="both"/>
+        <w:rPr>
+          <w:rFonts w:ascii="Garamond" w:hAnsi="Garamond"/>
+          <w:color w:val="00A0FC"/>
+          <w:sz w:val="36"/>
+          <w:szCs w:val="36"/>
+        </w:rPr>
+      </w:pPr>
+      <w:r>
+        <w:rPr/>
+      </w:r>
+    </w:p>
+    <w:p>
+      <w:pPr>
+        <w:pStyle w:val="Normal"/>
+        <w:bidi w:val="0"/>
+        <w:ind w:left="709" w:hanging="0"/>
+        <w:jc w:val="both"/>
+        <w:rPr>
+          <w:rFonts w:ascii="Garamond" w:hAnsi="Garamond"/>
+          <w:color w:val="00A0FC"/>
+          <w:sz w:val="36"/>
+          <w:szCs w:val="36"/>
+        </w:rPr>
+      </w:pPr>
+      <w:r>
+        <w:rPr>
+          <w:rFonts w:eastAsia="Noto Serif CJK SC" w:cs="Noto Sans Devanagari" w:ascii="Garamond" w:hAnsi="Garamond"/>
+          <w:i w:val="false"/>
+          <w:iCs w:val="false"/>
+          <w:color w:val="00A0FC"/>
+          <w:kern w:val="2"/>
+          <w:sz w:val="36"/>
+          <w:szCs w:val="36"/>
+          <w:lang w:val="pt-BR" w:eastAsia="zh-CN" w:bidi="hi-IN"/>
+        </w:rPr>
+        <w:t xml:space="preserve">Outro fenômeno bastante interessante que se nota em algumas plantas é que elas "decidem" como irão se desenvolver. Se a planta percebe que está competindo por luz, ela </w:t>
+      </w:r>
+      <w:r>
+        <w:rPr>
+          <w:rFonts w:eastAsia="Noto Serif CJK SC" w:cs="Noto Sans Devanagari" w:ascii="Garamond" w:hAnsi="Garamond"/>
+          <w:i w:val="false"/>
+          <w:iCs w:val="false"/>
+          <w:color w:val="00A0FC"/>
+          <w:kern w:val="2"/>
+          <w:sz w:val="36"/>
+          <w:szCs w:val="36"/>
+          <w:lang w:val="pt-BR" w:eastAsia="zh-CN" w:bidi="hi-IN"/>
+        </w:rPr>
+        <w:t>procurar crescer mais no caule, tornando-se mais alta</w:t>
+      </w:r>
+      <w:r>
+        <w:rPr>
+          <w:rFonts w:eastAsia="Noto Serif CJK SC" w:cs="Noto Sans Devanagari" w:ascii="Garamond" w:hAnsi="Garamond"/>
+          <w:i w:val="false"/>
+          <w:iCs w:val="false"/>
+          <w:color w:val="00A0FC"/>
+          <w:kern w:val="2"/>
+          <w:sz w:val="36"/>
+          <w:szCs w:val="36"/>
+          <w:lang w:val="pt-BR" w:eastAsia="zh-CN" w:bidi="hi-IN"/>
+        </w:rPr>
+        <w:t>. Se o problema for a escassez de água ou nutrientes, ela investe no crescimento de suas raízes</w:t>
+      </w:r>
+      <w:r>
+        <w:rPr>
+          <w:rFonts w:eastAsia="Noto Serif CJK SC" w:cs="Noto Sans Devanagari" w:ascii="Garamond" w:hAnsi="Garamond"/>
+          <w:i w:val="false"/>
+          <w:iCs w:val="false"/>
+          <w:color w:val="00A0FC"/>
+          <w:kern w:val="2"/>
+          <w:sz w:val="36"/>
+          <w:szCs w:val="36"/>
+          <w:lang w:val="pt-BR" w:eastAsia="zh-CN" w:bidi="hi-IN"/>
+        </w:rPr>
+        <w:t>, de forma a ter mais chances de encontrar esses recursos.</w:t>
+      </w:r>
+    </w:p>
+    <w:p>
+      <w:pPr>
+        <w:pStyle w:val="Normal"/>
+        <w:bidi w:val="0"/>
+        <w:ind w:left="709" w:hanging="0"/>
+        <w:jc w:val="both"/>
+        <w:rPr>
+          <w:rFonts w:ascii="Garamond" w:hAnsi="Garamond"/>
+          <w:color w:val="00A0FC"/>
+          <w:sz w:val="36"/>
+          <w:szCs w:val="36"/>
+        </w:rPr>
+      </w:pPr>
+      <w:r>
+        <w:rPr/>
+      </w:r>
+    </w:p>
+    <w:p>
+      <w:pPr>
+        <w:pStyle w:val="Normal"/>
+        <w:bidi w:val="0"/>
+        <w:ind w:left="709" w:hanging="0"/>
+        <w:jc w:val="both"/>
+        <w:rPr>
+          <w:rFonts w:ascii="Garamond" w:hAnsi="Garamond"/>
+          <w:color w:val="00A0FC"/>
+          <w:sz w:val="36"/>
+          <w:szCs w:val="36"/>
+        </w:rPr>
+      </w:pPr>
+      <w:r>
+        <w:rPr>
+          <w:rFonts w:eastAsia="Noto Serif CJK SC" w:cs="Noto Sans Devanagari" w:ascii="Garamond" w:hAnsi="Garamond"/>
+          <w:i w:val="false"/>
+          <w:iCs w:val="false"/>
+          <w:color w:val="00A0FC"/>
+          <w:kern w:val="2"/>
+          <w:sz w:val="36"/>
+          <w:szCs w:val="36"/>
+          <w:lang w:val="pt-BR" w:eastAsia="zh-CN" w:bidi="hi-IN"/>
+        </w:rPr>
+        <w:t xml:space="preserve">Só que, por mais interessantes que sejam esses fenômenos, a Espiritualidade diz que eles não podem ser classificados </w:t>
+      </w:r>
+      <w:r>
+        <w:rPr>
+          <w:rFonts w:eastAsia="Noto Serif CJK SC" w:cs="Noto Sans Devanagari" w:ascii="Garamond" w:hAnsi="Garamond"/>
+          <w:i w:val="false"/>
+          <w:iCs w:val="false"/>
+          <w:color w:val="00A0FC"/>
+          <w:kern w:val="2"/>
+          <w:sz w:val="36"/>
+          <w:szCs w:val="36"/>
+          <w:lang w:val="pt-BR" w:eastAsia="zh-CN" w:bidi="hi-IN"/>
+        </w:rPr>
+        <w:t>como</w:t>
+      </w:r>
+      <w:r>
+        <w:rPr>
+          <w:rFonts w:eastAsia="Noto Serif CJK SC" w:cs="Noto Sans Devanagari" w:ascii="Garamond" w:hAnsi="Garamond"/>
+          <w:i w:val="false"/>
+          <w:iCs w:val="false"/>
+          <w:color w:val="00A0FC"/>
+          <w:kern w:val="2"/>
+          <w:sz w:val="36"/>
+          <w:szCs w:val="36"/>
+          <w:lang w:val="pt-BR" w:eastAsia="zh-CN" w:bidi="hi-IN"/>
+        </w:rPr>
+        <w:t xml:space="preserve"> instinto, não no sentido </w:t>
+      </w:r>
+      <w:r>
+        <w:rPr>
+          <w:rFonts w:eastAsia="Noto Serif CJK SC" w:cs="Noto Sans Devanagari" w:ascii="Garamond" w:hAnsi="Garamond"/>
+          <w:i w:val="false"/>
+          <w:iCs w:val="false"/>
+          <w:color w:val="00A0FC"/>
+          <w:kern w:val="2"/>
+          <w:sz w:val="36"/>
+          <w:szCs w:val="36"/>
+          <w:lang w:val="pt-BR" w:eastAsia="zh-CN" w:bidi="hi-IN"/>
+        </w:rPr>
+        <w:t>em que conhecemos</w:t>
+      </w:r>
+      <w:r>
+        <w:rPr>
+          <w:rFonts w:eastAsia="Noto Serif CJK SC" w:cs="Noto Sans Devanagari" w:ascii="Garamond" w:hAnsi="Garamond"/>
+          <w:i w:val="false"/>
+          <w:iCs w:val="false"/>
+          <w:color w:val="00A0FC"/>
+          <w:kern w:val="2"/>
+          <w:sz w:val="36"/>
+          <w:szCs w:val="36"/>
+          <w:lang w:val="pt-BR" w:eastAsia="zh-CN" w:bidi="hi-IN"/>
+        </w:rPr>
+        <w:t xml:space="preserve">. </w:t>
+      </w:r>
+      <w:r>
+        <w:rPr>
+          <w:rFonts w:eastAsia="Noto Serif CJK SC" w:cs="Noto Sans Devanagari" w:ascii="Garamond" w:hAnsi="Garamond"/>
+          <w:i w:val="false"/>
+          <w:iCs w:val="false"/>
+          <w:color w:val="00A0FC"/>
+          <w:kern w:val="2"/>
+          <w:sz w:val="36"/>
+          <w:szCs w:val="36"/>
+          <w:lang w:val="pt-BR" w:eastAsia="zh-CN" w:bidi="hi-IN"/>
+        </w:rPr>
+        <w:t>São fenômenos puramente mecânicos. Não há neles o menor traço de vontade ou sentimento da planta.</w:t>
+      </w:r>
+    </w:p>
+    <w:p>
+      <w:pPr>
+        <w:pStyle w:val="Normal"/>
+        <w:bidi w:val="0"/>
+        <w:ind w:left="709" w:hanging="0"/>
+        <w:jc w:val="both"/>
+        <w:rPr>
+          <w:rFonts w:ascii="Garamond" w:hAnsi="Garamond"/>
+          <w:color w:val="00A0FC"/>
+          <w:sz w:val="36"/>
+          <w:szCs w:val="36"/>
+        </w:rPr>
+      </w:pPr>
+      <w:r>
+        <w:rPr/>
+      </w:r>
+    </w:p>
+    <w:p>
+      <w:pPr>
+        <w:pStyle w:val="Normal"/>
+        <w:bidi w:val="0"/>
+        <w:ind w:left="709" w:hanging="0"/>
+        <w:jc w:val="both"/>
+        <w:rPr>
+          <w:rFonts w:ascii="Garamond" w:hAnsi="Garamond"/>
+          <w:color w:val="00A0FC"/>
+          <w:sz w:val="36"/>
+          <w:szCs w:val="36"/>
+        </w:rPr>
+      </w:pPr>
+      <w:r>
+        <w:rPr>
+          <w:rFonts w:eastAsia="Noto Serif CJK SC" w:cs="Noto Sans Devanagari" w:ascii="Garamond" w:hAnsi="Garamond"/>
+          <w:i w:val="false"/>
+          <w:iCs w:val="false"/>
+          <w:color w:val="00A0FC"/>
+          <w:kern w:val="2"/>
+          <w:sz w:val="36"/>
+          <w:szCs w:val="36"/>
+          <w:lang w:val="pt-BR" w:eastAsia="zh-CN" w:bidi="hi-IN"/>
+        </w:rPr>
+        <w:t>A Espiritualidade lembra a Kardec que na química há reações que acontecem devido à grande força de atração entre os elementos ou substâncias envolvidas e afirma que nós não damos a essa força de atração o nome de instinto.</w:t>
+      </w:r>
+    </w:p>
+    <w:p>
+      <w:pPr>
+        <w:pStyle w:val="Normal"/>
+        <w:bidi w:val="0"/>
+        <w:ind w:left="709" w:hanging="0"/>
+        <w:jc w:val="both"/>
+        <w:rPr>
+          <w:rFonts w:ascii="Garamond" w:hAnsi="Garamond"/>
+          <w:color w:val="00A0FC"/>
+          <w:sz w:val="36"/>
+          <w:szCs w:val="36"/>
+        </w:rPr>
+      </w:pPr>
+      <w:r>
+        <w:rPr/>
+      </w:r>
+    </w:p>
+    <w:p>
+      <w:pPr>
+        <w:pStyle w:val="Normal"/>
+        <w:bidi w:val="0"/>
+        <w:ind w:left="709" w:hanging="0"/>
+        <w:jc w:val="both"/>
+        <w:rPr>
+          <w:rFonts w:ascii="Garamond" w:hAnsi="Garamond" w:eastAsia="Noto Serif CJK SC" w:cs="Noto Sans Devanagari"/>
+          <w:i w:val="false"/>
+          <w:i w:val="false"/>
+          <w:iCs w:val="false"/>
+          <w:color w:val="00A0FC"/>
+          <w:kern w:val="2"/>
+          <w:sz w:val="36"/>
+          <w:szCs w:val="36"/>
+          <w:lang w:val="pt-BR" w:eastAsia="zh-CN" w:bidi="hi-IN"/>
+        </w:rPr>
+      </w:pPr>
+      <w:r>
+        <w:rPr>
+          <w:rFonts w:eastAsia="Noto Serif CJK SC" w:cs="Noto Sans Devanagari" w:ascii="Garamond" w:hAnsi="Garamond"/>
+          <w:i w:val="false"/>
+          <w:iCs w:val="false"/>
+          <w:color w:val="00A0FC"/>
+          <w:kern w:val="2"/>
+          <w:sz w:val="36"/>
+          <w:szCs w:val="36"/>
+          <w:lang w:val="pt-BR" w:eastAsia="zh-CN" w:bidi="hi-IN"/>
+        </w:rPr>
+        <w:t xml:space="preserve">Ainda que sejam fenômenos meramente mecânicos, não há como não sentirmos admiração ao observá-los porque neles estão presentes a sabedoria e a perfeição divinas. </w:t>
+      </w:r>
+    </w:p>
+    <w:p>
+      <w:pPr>
+        <w:pStyle w:val="Normal"/>
+        <w:bidi w:val="0"/>
+        <w:ind w:left="709" w:hanging="0"/>
+        <w:jc w:val="both"/>
+        <w:rPr>
+          <w:rFonts w:ascii="Garamond" w:hAnsi="Garamond"/>
+          <w:color w:val="00A0FC"/>
+          <w:sz w:val="36"/>
+          <w:szCs w:val="36"/>
+        </w:rPr>
+      </w:pPr>
+      <w:r>
+        <w:rPr/>
+      </w:r>
+    </w:p>
+    <w:p>
+      <w:pPr>
+        <w:pStyle w:val="Normal"/>
+        <w:bidi w:val="0"/>
+        <w:ind w:left="709" w:hanging="0"/>
+        <w:jc w:val="both"/>
+        <w:rPr>
+          <w:rFonts w:ascii="Garamond" w:hAnsi="Garamond"/>
+          <w:color w:val="00A0FC"/>
+          <w:sz w:val="36"/>
+          <w:szCs w:val="36"/>
+        </w:rPr>
+      </w:pPr>
+      <w:r>
+        <w:rPr>
+          <w:rFonts w:eastAsia="Noto Serif CJK SC" w:cs="Noto Sans Devanagari" w:ascii="Garamond" w:hAnsi="Garamond"/>
+          <w:i w:val="false"/>
+          <w:iCs w:val="false"/>
+          <w:color w:val="00A0FC"/>
+          <w:kern w:val="2"/>
+          <w:sz w:val="36"/>
+          <w:szCs w:val="36"/>
+          <w:lang w:val="pt-BR" w:eastAsia="zh-CN" w:bidi="hi-IN"/>
+        </w:rPr>
+        <w:t xml:space="preserve">Um ser que não sente, não pensa, traz consigo recursos para fazer aquilo que é importante e útil para ela.  </w:t>
+      </w:r>
+    </w:p>
+    <w:p>
+      <w:pPr>
+        <w:pStyle w:val="Normal"/>
+        <w:bidi w:val="0"/>
+        <w:ind w:left="709" w:hanging="0"/>
+        <w:jc w:val="both"/>
+        <w:rPr>
+          <w:rFonts w:ascii="Garamond" w:hAnsi="Garamond"/>
+          <w:color w:val="00A0FC"/>
+          <w:sz w:val="36"/>
+          <w:szCs w:val="36"/>
+        </w:rPr>
+      </w:pPr>
+      <w:r>
+        <w:rPr/>
+      </w:r>
+    </w:p>
+    <w:p>
+      <w:pPr>
+        <w:pStyle w:val="Normal"/>
+        <w:bidi w:val="0"/>
+        <w:ind w:left="709" w:hanging="0"/>
+        <w:jc w:val="both"/>
+        <w:rPr>
+          <w:rFonts w:ascii="Garamond" w:hAnsi="Garamond"/>
+          <w:color w:val="00A0FC"/>
+          <w:sz w:val="36"/>
+          <w:szCs w:val="36"/>
+        </w:rPr>
+      </w:pPr>
+      <w:r>
+        <w:rPr>
+          <w:rFonts w:ascii="Garamond" w:hAnsi="Garamond"/>
+          <w:color w:val="00A0FC"/>
+          <w:sz w:val="36"/>
+          <w:szCs w:val="36"/>
+        </w:rPr>
+      </w:r>
+    </w:p>
+    <w:p>
+      <w:pPr>
+        <w:pStyle w:val="Normal"/>
+        <w:bidi w:val="0"/>
+        <w:jc w:val="both"/>
+        <w:rPr>
+          <w:rFonts w:ascii="Garamond" w:hAnsi="Garamond"/>
+          <w:sz w:val="36"/>
+          <w:szCs w:val="36"/>
+        </w:rPr>
+      </w:pPr>
+      <w:r>
+        <w:rPr>
+          <w:rFonts w:eastAsia="Noto Serif CJK SC" w:cs="Noto Sans Devanagari" w:ascii="Garamond" w:hAnsi="Garamond"/>
+          <w:color w:val="auto"/>
+          <w:kern w:val="2"/>
+          <w:sz w:val="36"/>
+          <w:szCs w:val="36"/>
+          <w:lang w:val="pt-BR" w:eastAsia="zh-CN" w:bidi="hi-IN"/>
+        </w:rPr>
+        <w:t>591</w:t>
+      </w:r>
+      <w:r>
+        <w:rPr>
+          <w:rFonts w:ascii="Garamond" w:hAnsi="Garamond"/>
+          <w:sz w:val="36"/>
+          <w:szCs w:val="36"/>
+        </w:rPr>
+        <w:t>. Nos mundos superiores, as plantas são de natureza mais perfeita,</w:t>
+      </w:r>
+      <w:r>
+        <w:rPr>
+          <w:rFonts w:ascii="Garamond" w:hAnsi="Garamond"/>
+          <w:sz w:val="36"/>
+          <w:szCs w:val="36"/>
+        </w:rPr>
+        <w:t xml:space="preserve"> </w:t>
+      </w:r>
+      <w:r>
+        <w:rPr>
+          <w:rFonts w:ascii="Garamond" w:hAnsi="Garamond"/>
+          <w:sz w:val="36"/>
+          <w:szCs w:val="36"/>
+        </w:rPr>
+        <w:t>como os outros seres?</w:t>
+      </w:r>
+    </w:p>
+    <w:p>
+      <w:pPr>
+        <w:pStyle w:val="Normal"/>
+        <w:bidi w:val="0"/>
+        <w:jc w:val="both"/>
+        <w:rPr>
+          <w:rFonts w:ascii="Garamond" w:hAnsi="Garamond"/>
+          <w:sz w:val="36"/>
+          <w:szCs w:val="36"/>
+        </w:rPr>
+      </w:pPr>
+      <w:r>
+        <w:rPr>
+          <w:rFonts w:ascii="Garamond" w:hAnsi="Garamond"/>
+          <w:sz w:val="36"/>
+          <w:szCs w:val="36"/>
+        </w:rPr>
+      </w:r>
+    </w:p>
+    <w:p>
+      <w:pPr>
+        <w:pStyle w:val="Normal"/>
+        <w:bidi w:val="0"/>
+        <w:ind w:hanging="0"/>
+        <w:jc w:val="both"/>
+        <w:rPr>
+          <w:rFonts w:ascii="Garamond" w:hAnsi="Garamond"/>
+          <w:sz w:val="36"/>
+          <w:szCs w:val="36"/>
+        </w:rPr>
+      </w:pPr>
       <w:r>
         <w:rPr>
           <w:rFonts w:ascii="Garamond" w:hAnsi="Garamond"/>
@@ -3399,7 +4155,7 @@
           <w:sz w:val="36"/>
           <w:szCs w:val="36"/>
         </w:rPr>
-        <w:t xml:space="preserve"> </w:t>
+        <w:t>“</w:t>
       </w:r>
       <w:r>
         <w:rPr>
@@ -3409,7 +4165,7 @@
           <w:sz w:val="36"/>
           <w:szCs w:val="36"/>
         </w:rPr>
-        <w:t>extensão que se dê ao significado desta palavra. É, porém, um</w:t>
+        <w:t>Tudo é mais perfeito. As plantas, porém, são sempre plantas,</w:t>
       </w:r>
       <w:r>
         <w:rPr>
@@ -3429,395 +4185,7 @@
           <w:sz w:val="36"/>
           <w:szCs w:val="36"/>
         </w:rPr>
-        <w:t>instinto puramente mecânico. Quando, nas operações químicas,observais que dois corpos se reúnem, é que um ao outro convém;</w:t>
-      </w:r>
-      <w:r>
-        <w:rPr>
-          <w:rFonts w:ascii="Garamond" w:hAnsi="Garamond"/>
-          <w:i/>
-          <w:iCs/>
-          <w:sz w:val="36"/>
-          <w:szCs w:val="36"/>
-        </w:rPr>
-        <w:t xml:space="preserve"> </w:t>
-      </w:r>
-      <w:r>
-        <w:rPr>
-          <w:rFonts w:ascii="Garamond" w:hAnsi="Garamond"/>
-          <w:i/>
-          <w:iCs/>
-          <w:sz w:val="36"/>
-          <w:szCs w:val="36"/>
-        </w:rPr>
-        <w:t>quer dizer: é que há entre eles afinidade. Ora, a isto não dais o</w:t>
-      </w:r>
-      <w:r>
-        <w:rPr>
-          <w:rFonts w:ascii="Garamond" w:hAnsi="Garamond"/>
-          <w:i/>
-          <w:iCs/>
-          <w:sz w:val="36"/>
-          <w:szCs w:val="36"/>
-        </w:rPr>
-        <w:t xml:space="preserve"> </w:t>
-      </w:r>
-      <w:r>
-        <w:rPr>
-          <w:rFonts w:ascii="Garamond" w:hAnsi="Garamond"/>
-          <w:i/>
-          <w:iCs/>
-          <w:sz w:val="36"/>
-          <w:szCs w:val="36"/>
-        </w:rPr>
-        <w:t xml:space="preserve">nome de instinto.” </w:t>
-      </w:r>
-    </w:p>
-    <w:p>
-      <w:pPr>
-        <w:pStyle w:val="Normal"/>
-        <w:bidi w:val="0"/>
-        <w:ind w:left="709" w:hanging="0"/>
-        <w:jc w:val="both"/>
-        <w:rPr>
-          <w:rFonts w:ascii="Garamond" w:hAnsi="Garamond" w:eastAsia="Noto Serif CJK SC" w:cs="Noto Sans Devanagari"/>
-          <w:i w:val="false"/>
-          <w:i w:val="false"/>
-          <w:iCs w:val="false"/>
-          <w:color w:val="00A0FC"/>
-          <w:kern w:val="2"/>
-          <w:sz w:val="36"/>
-          <w:szCs w:val="36"/>
-          <w:lang w:val="pt-BR" w:eastAsia="zh-CN" w:bidi="hi-IN"/>
-        </w:rPr>
-      </w:pPr>
-      <w:r>
-        <w:rPr>
-          <w:rFonts w:eastAsia="Noto Serif CJK SC" w:cs="Noto Sans Devanagari" w:ascii="Garamond" w:hAnsi="Garamond"/>
-          <w:i w:val="false"/>
-          <w:iCs w:val="false"/>
-          <w:color w:val="00A0FC"/>
-          <w:kern w:val="2"/>
-          <w:sz w:val="36"/>
-          <w:szCs w:val="36"/>
-          <w:lang w:val="pt-BR" w:eastAsia="zh-CN" w:bidi="hi-IN"/>
-        </w:rPr>
-      </w:r>
-    </w:p>
-    <w:p>
-      <w:pPr>
-        <w:pStyle w:val="Normal"/>
-        <w:bidi w:val="0"/>
-        <w:ind w:left="709" w:hanging="0"/>
-        <w:jc w:val="both"/>
-        <w:rPr>
-          <w:rFonts w:ascii="Garamond" w:hAnsi="Garamond"/>
-          <w:color w:val="00A0FC"/>
-          <w:sz w:val="36"/>
-          <w:szCs w:val="36"/>
-        </w:rPr>
-      </w:pPr>
-      <w:r>
-        <w:rPr>
-          <w:rFonts w:eastAsia="Noto Serif CJK SC" w:cs="Noto Sans Devanagari" w:ascii="Garamond" w:hAnsi="Garamond"/>
-          <w:i w:val="false"/>
-          <w:iCs w:val="false"/>
-          <w:color w:val="00A0FC"/>
-          <w:kern w:val="2"/>
-          <w:sz w:val="36"/>
-          <w:szCs w:val="36"/>
-          <w:lang w:val="pt-BR" w:eastAsia="zh-CN" w:bidi="hi-IN"/>
-        </w:rPr>
-        <w:t xml:space="preserve">Kardec pergunta o seguinte: pode uma pessoa que confia em um talismã - ainda que essa confiança não tenha fundamento lógico -  realmente atrair um Espírito visto que a força do pensamento da pessoa foi potencializada pelo uso do talismã? </w:t>
-      </w:r>
-    </w:p>
-    <w:p>
-      <w:pPr>
-        <w:pStyle w:val="Normal"/>
-        <w:bidi w:val="0"/>
-        <w:ind w:left="709" w:hanging="0"/>
-        <w:jc w:val="both"/>
-        <w:rPr>
-          <w:rFonts w:ascii="Garamond" w:hAnsi="Garamond"/>
-          <w:color w:val="00A0FC"/>
-          <w:sz w:val="36"/>
-          <w:szCs w:val="36"/>
-        </w:rPr>
-      </w:pPr>
-      <w:r>
-        <w:rPr>
-          <w:rFonts w:ascii="Garamond" w:hAnsi="Garamond"/>
-          <w:color w:val="00A0FC"/>
-          <w:sz w:val="36"/>
-          <w:szCs w:val="36"/>
-        </w:rPr>
-      </w:r>
-    </w:p>
-    <w:p>
-      <w:pPr>
-        <w:pStyle w:val="Normal"/>
-        <w:bidi w:val="0"/>
-        <w:ind w:left="709" w:hanging="0"/>
-        <w:jc w:val="both"/>
-        <w:rPr>
-          <w:rFonts w:ascii="Garamond" w:hAnsi="Garamond"/>
-          <w:color w:val="00A0FC"/>
-          <w:sz w:val="36"/>
-          <w:szCs w:val="36"/>
-        </w:rPr>
-      </w:pPr>
-      <w:r>
-        <w:rPr>
-          <w:rFonts w:eastAsia="Noto Serif CJK SC" w:cs="Noto Sans Devanagari" w:ascii="Garamond" w:hAnsi="Garamond"/>
-          <w:i w:val="false"/>
-          <w:iCs w:val="false"/>
-          <w:color w:val="00A0FC"/>
-          <w:kern w:val="2"/>
-          <w:sz w:val="36"/>
-          <w:szCs w:val="36"/>
-          <w:lang w:val="pt-BR" w:eastAsia="zh-CN" w:bidi="hi-IN"/>
-        </w:rPr>
-        <w:t xml:space="preserve">A Espiritualidade responde que sim, é possível que o talismã acabe por fortalecer o pensamento daquela pessoa ao ponto de ela realmente conseguir atrair um Espírito. </w:t>
-      </w:r>
-    </w:p>
-    <w:p>
-      <w:pPr>
-        <w:pStyle w:val="Normal"/>
-        <w:bidi w:val="0"/>
-        <w:ind w:left="709" w:hanging="0"/>
-        <w:jc w:val="both"/>
-        <w:rPr>
-          <w:rFonts w:ascii="Garamond" w:hAnsi="Garamond"/>
-          <w:color w:val="00A0FC"/>
-          <w:sz w:val="36"/>
-          <w:szCs w:val="36"/>
-        </w:rPr>
-      </w:pPr>
-      <w:r>
-        <w:rPr>
-          <w:rFonts w:ascii="Garamond" w:hAnsi="Garamond"/>
-          <w:color w:val="00A0FC"/>
-          <w:sz w:val="36"/>
-          <w:szCs w:val="36"/>
-        </w:rPr>
-      </w:r>
-    </w:p>
-    <w:p>
-      <w:pPr>
-        <w:pStyle w:val="Normal"/>
-        <w:bidi w:val="0"/>
-        <w:ind w:left="709" w:hanging="0"/>
-        <w:jc w:val="both"/>
-        <w:rPr>
-          <w:rFonts w:ascii="Garamond" w:hAnsi="Garamond"/>
-          <w:color w:val="00A0FC"/>
-          <w:sz w:val="36"/>
-          <w:szCs w:val="36"/>
-        </w:rPr>
-      </w:pPr>
-      <w:r>
-        <w:rPr>
-          <w:rFonts w:eastAsia="Noto Serif CJK SC" w:cs="Noto Sans Devanagari" w:ascii="Garamond" w:hAnsi="Garamond"/>
-          <w:i w:val="false"/>
-          <w:iCs w:val="false"/>
-          <w:color w:val="00A0FC"/>
-          <w:kern w:val="2"/>
-          <w:sz w:val="36"/>
-          <w:szCs w:val="36"/>
-          <w:lang w:val="pt-BR" w:eastAsia="zh-CN" w:bidi="hi-IN"/>
-        </w:rPr>
-        <w:t>Contudo, a natureza do Espírito a ser atraído ainda depende da pureza da intenção e da elevação dos sentimentos daquele que utiliza o talismã.</w:t>
-      </w:r>
-    </w:p>
-    <w:p>
-      <w:pPr>
-        <w:pStyle w:val="Normal"/>
-        <w:bidi w:val="0"/>
-        <w:ind w:left="709" w:hanging="0"/>
-        <w:jc w:val="both"/>
-        <w:rPr>
-          <w:rFonts w:ascii="Garamond" w:hAnsi="Garamond"/>
-          <w:color w:val="00A0FC"/>
-          <w:sz w:val="36"/>
-          <w:szCs w:val="36"/>
-        </w:rPr>
-      </w:pPr>
-      <w:r>
-        <w:rPr>
-          <w:rFonts w:ascii="Garamond" w:hAnsi="Garamond"/>
-          <w:color w:val="00A0FC"/>
-          <w:sz w:val="36"/>
-          <w:szCs w:val="36"/>
-        </w:rPr>
-      </w:r>
-    </w:p>
-    <w:p>
-      <w:pPr>
-        <w:pStyle w:val="Normal"/>
-        <w:bidi w:val="0"/>
-        <w:ind w:left="709" w:hanging="0"/>
-        <w:jc w:val="both"/>
-        <w:rPr>
-          <w:rFonts w:ascii="Garamond" w:hAnsi="Garamond"/>
-          <w:color w:val="00A0FC"/>
-          <w:sz w:val="36"/>
-          <w:szCs w:val="36"/>
-        </w:rPr>
-      </w:pPr>
-      <w:r>
-        <w:rPr>
-          <w:rFonts w:eastAsia="Noto Serif CJK SC" w:cs="Noto Sans Devanagari" w:ascii="Garamond" w:hAnsi="Garamond"/>
-          <w:i w:val="false"/>
-          <w:iCs w:val="false"/>
-          <w:color w:val="00A0FC"/>
-          <w:kern w:val="2"/>
-          <w:sz w:val="36"/>
-          <w:szCs w:val="36"/>
-          <w:lang w:val="pt-BR" w:eastAsia="zh-CN" w:bidi="hi-IN"/>
-        </w:rPr>
-        <w:t>A Espiritualidade afirma também que, uma pessoa que acredita em talismã, muito provavelmente busca o auxílio para questões de ordem material. Dificilmente essa pessoa buscará auxílio para questões de ordem moral.</w:t>
-      </w:r>
-    </w:p>
-    <w:p>
-      <w:pPr>
-        <w:pStyle w:val="Normal"/>
-        <w:bidi w:val="0"/>
-        <w:ind w:left="709" w:hanging="0"/>
-        <w:jc w:val="both"/>
-        <w:rPr>
-          <w:rFonts w:ascii="Garamond" w:hAnsi="Garamond"/>
-          <w:color w:val="00A0FC"/>
-          <w:sz w:val="36"/>
-          <w:szCs w:val="36"/>
-        </w:rPr>
-      </w:pPr>
-      <w:r>
-        <w:rPr>
-          <w:rFonts w:ascii="Garamond" w:hAnsi="Garamond"/>
-          <w:color w:val="00A0FC"/>
-          <w:sz w:val="36"/>
-          <w:szCs w:val="36"/>
-        </w:rPr>
-      </w:r>
-    </w:p>
-    <w:p>
-      <w:pPr>
-        <w:pStyle w:val="Normal"/>
-        <w:bidi w:val="0"/>
-        <w:ind w:left="709" w:hanging="0"/>
-        <w:jc w:val="both"/>
-        <w:rPr>
-          <w:rFonts w:ascii="Garamond" w:hAnsi="Garamond"/>
-          <w:color w:val="00A0FC"/>
-          <w:sz w:val="36"/>
-          <w:szCs w:val="36"/>
-        </w:rPr>
-      </w:pPr>
-      <w:r>
-        <w:rPr>
-          <w:rFonts w:eastAsia="Noto Serif CJK SC" w:cs="Noto Sans Devanagari" w:ascii="Garamond" w:hAnsi="Garamond"/>
-          <w:i w:val="false"/>
-          <w:iCs w:val="false"/>
-          <w:color w:val="00A0FC"/>
-          <w:kern w:val="2"/>
-          <w:sz w:val="36"/>
-          <w:szCs w:val="36"/>
-          <w:lang w:val="pt-BR" w:eastAsia="zh-CN" w:bidi="hi-IN"/>
-        </w:rPr>
-        <w:t xml:space="preserve">E conclui dizendo que, independente da pessoa buscar o auxílio dos espíritos para questões materiais ou morais, acreditar em talismãs ainda é um sinal de inferioridade e isso, por si só, dá margem para a manifestação de espíritos imperfeitos e escarninhos.  </w:t>
-      </w:r>
-    </w:p>
-    <w:p>
-      <w:pPr>
-        <w:pStyle w:val="Normal"/>
-        <w:bidi w:val="0"/>
-        <w:ind w:left="709" w:hanging="0"/>
-        <w:jc w:val="both"/>
-        <w:rPr>
-          <w:rFonts w:ascii="Garamond" w:hAnsi="Garamond"/>
-          <w:color w:val="00A0FC"/>
-          <w:sz w:val="36"/>
-          <w:szCs w:val="36"/>
-        </w:rPr>
-      </w:pPr>
-      <w:r>
-        <w:rPr>
-          <w:rFonts w:ascii="Garamond" w:hAnsi="Garamond"/>
-          <w:color w:val="00A0FC"/>
-          <w:sz w:val="36"/>
-          <w:szCs w:val="36"/>
-        </w:rPr>
-      </w:r>
-    </w:p>
-    <w:p>
-      <w:pPr>
-        <w:pStyle w:val="Normal"/>
-        <w:bidi w:val="0"/>
-        <w:ind w:left="709" w:hanging="0"/>
-        <w:jc w:val="both"/>
-        <w:rPr>
-          <w:rFonts w:ascii="Garamond" w:hAnsi="Garamond"/>
-          <w:color w:val="00A0FC"/>
-          <w:sz w:val="36"/>
-          <w:szCs w:val="36"/>
-        </w:rPr>
-      </w:pPr>
-      <w:r>
-        <w:rPr>
-          <w:rFonts w:ascii="Garamond" w:hAnsi="Garamond"/>
-          <w:color w:val="00A0FC"/>
-          <w:sz w:val="36"/>
-          <w:szCs w:val="36"/>
-        </w:rPr>
-      </w:r>
-    </w:p>
-    <w:p>
-      <w:pPr>
-        <w:pStyle w:val="Normal"/>
-        <w:bidi w:val="0"/>
-        <w:jc w:val="both"/>
-        <w:rPr>
-          <w:rFonts w:ascii="Garamond" w:hAnsi="Garamond"/>
-          <w:sz w:val="36"/>
-          <w:szCs w:val="36"/>
-        </w:rPr>
-      </w:pPr>
-      <w:r>
-        <w:rPr>
-          <w:rFonts w:eastAsia="Noto Serif CJK SC" w:cs="Noto Sans Devanagari" w:ascii="Garamond" w:hAnsi="Garamond"/>
-          <w:color w:val="auto"/>
-          <w:kern w:val="2"/>
-          <w:sz w:val="36"/>
-          <w:szCs w:val="36"/>
-          <w:lang w:val="pt-BR" w:eastAsia="zh-CN" w:bidi="hi-IN"/>
-        </w:rPr>
-        <w:t>555</w:t>
-      </w:r>
-      <w:r>
-        <w:rPr>
-          <w:rFonts w:ascii="Garamond" w:hAnsi="Garamond"/>
-          <w:sz w:val="36"/>
-          <w:szCs w:val="36"/>
-        </w:rPr>
-        <w:t>. Que sentido se deve dar ao qualificativo de feiticeiro?</w:t>
-      </w:r>
-    </w:p>
-    <w:p>
-      <w:pPr>
-        <w:pStyle w:val="Normal"/>
-        <w:bidi w:val="0"/>
-        <w:jc w:val="both"/>
-        <w:rPr>
-          <w:rFonts w:ascii="Garamond" w:hAnsi="Garamond"/>
-          <w:sz w:val="36"/>
-          <w:szCs w:val="36"/>
-        </w:rPr>
-      </w:pPr>
-      <w:r>
-        <w:rPr>
-          <w:rFonts w:ascii="Garamond" w:hAnsi="Garamond"/>
-          <w:sz w:val="36"/>
-          <w:szCs w:val="36"/>
-        </w:rPr>
+        <w:t>como os animais sempre animais e os homens sempre homens.”</w:t>
       </w:r>
     </w:p>
     <w:p>
@@ -3835,104 +4203,8 @@
       <w:r>
         <w:rPr>
           <w:rFonts w:ascii="Garamond" w:hAnsi="Garamond"/>
-          <w:i/>
-          <w:iCs/>
-          <w:sz w:val="36"/>
-          <w:szCs w:val="36"/>
-        </w:rPr>
-        <w:t>“</w:t>
-      </w:r>
-      <w:r>
-        <w:rPr>
-          <w:rFonts w:ascii="Garamond" w:hAnsi="Garamond"/>
-          <w:i/>
-          <w:iCs/>
-          <w:sz w:val="36"/>
-          <w:szCs w:val="36"/>
-        </w:rPr>
-        <w:t>Aqueles a quem chamais feiticeiros são pessoas que, quando de boa-fé, gozam de certas faculdades, como sejam a força magnética ou a dupla vista. Então, como fazem coisas geralmente incompreensíveis, são tidas por dotadas de um poder sobrenatural. Os vossos sábios não têm passado muitas vezes por feiticeiros aos olhos dos ignorantes?”</w:t>
-      </w:r>
-    </w:p>
-    <w:p>
-      <w:pPr>
-        <w:pStyle w:val="Normal"/>
-        <w:bidi w:val="0"/>
-        <w:ind w:hanging="0"/>
-        <w:jc w:val="both"/>
-        <w:rPr>
-          <w:rFonts w:ascii="Garamond" w:hAnsi="Garamond"/>
-          <w:sz w:val="36"/>
-          <w:szCs w:val="36"/>
-        </w:rPr>
-      </w:pPr>
-      <w:r>
-        <w:rPr>
-          <w:rFonts w:ascii="Garamond" w:hAnsi="Garamond"/>
-          <w:sz w:val="36"/>
-          <w:szCs w:val="36"/>
-        </w:rPr>
-      </w:r>
-    </w:p>
-    <w:p>
-      <w:pPr>
-        <w:pStyle w:val="Normal"/>
-        <w:bidi w:val="0"/>
-        <w:ind w:left="709" w:hanging="0"/>
-        <w:jc w:val="both"/>
-        <w:rPr>
-          <w:rFonts w:ascii="Garamond" w:hAnsi="Garamond" w:eastAsia="Noto Serif CJK SC" w:cs="Noto Sans Devanagari"/>
-          <w:i w:val="false"/>
-          <w:i w:val="false"/>
-          <w:iCs w:val="false"/>
-          <w:color w:val="000000"/>
-          <w:kern w:val="2"/>
-          <w:sz w:val="36"/>
-          <w:szCs w:val="36"/>
-          <w:lang w:val="pt-BR" w:eastAsia="zh-CN" w:bidi="hi-IN"/>
-        </w:rPr>
-      </w:pPr>
-      <w:r>
-        <w:rPr>
-          <w:rFonts w:eastAsia="Noto Serif CJK SC" w:cs="Noto Sans Devanagari" w:ascii="Garamond" w:hAnsi="Garamond"/>
-          <w:i w:val="false"/>
-          <w:iCs w:val="false"/>
-          <w:color w:val="000000"/>
-          <w:kern w:val="2"/>
-          <w:sz w:val="28"/>
-          <w:szCs w:val="28"/>
-          <w:lang w:val="pt-BR" w:eastAsia="zh-CN" w:bidi="hi-IN"/>
-        </w:rPr>
-        <w:t>O Espiritismo e o magnetismo nos dão a chave de uma imensidade de fenômenos sobre os quais a ignorância teceu um sem-número de fábulas, em que os fatos se apresentam exagerados pela imaginação. O conhecimento lúcido dessas duas ciências que, a bem dizer, formam uma única, mostrando a realidade das coisas e suas verdadeiras causas, constitui o melhor preservativo contra as ideias supersticiosas, porque revela o que é possível e o que é impossível, o que está nas Leis da Natureza e o que não passa de ridícula crendice.</w:t>
-      </w:r>
-    </w:p>
-    <w:p>
-      <w:pPr>
-        <w:pStyle w:val="Normal"/>
-        <w:bidi w:val="0"/>
-        <w:ind w:left="709" w:hanging="0"/>
-        <w:jc w:val="both"/>
-        <w:rPr>
-          <w:rFonts w:ascii="Garamond" w:hAnsi="Garamond" w:eastAsia="Noto Serif CJK SC" w:cs="Noto Sans Devanagari"/>
-          <w:i w:val="false"/>
-          <w:i w:val="false"/>
-          <w:iCs w:val="false"/>
-          <w:color w:val="000000"/>
-          <w:kern w:val="2"/>
-          <w:sz w:val="36"/>
-          <w:szCs w:val="36"/>
-          <w:lang w:val="pt-BR" w:eastAsia="zh-CN" w:bidi="hi-IN"/>
-        </w:rPr>
-      </w:pPr>
-      <w:r>
-        <w:rPr>
-          <w:rFonts w:eastAsia="Noto Serif CJK SC" w:cs="Noto Sans Devanagari" w:ascii="Garamond" w:hAnsi="Garamond"/>
-          <w:i w:val="false"/>
-          <w:iCs w:val="false"/>
-          <w:color w:val="000000"/>
-          <w:kern w:val="2"/>
-          <w:sz w:val="36"/>
-          <w:szCs w:val="36"/>
-          <w:lang w:val="pt-BR" w:eastAsia="zh-CN" w:bidi="hi-IN"/>
+          <w:sz w:val="36"/>
+          <w:szCs w:val="36"/>
         </w:rPr>
       </w:r>
     </w:p>
@@ -3961,6 +4233,47 @@
           <w:lang w:val="pt-BR" w:eastAsia="zh-CN" w:bidi="hi-IN"/>
         </w:rPr>
         <w:t xml:space="preserve">O que Kardec deseja saber é o real significado que devemos dar à palavra feiticeiro. </w:t>
+      </w:r>
+    </w:p>
+    <w:p>
+      <w:pPr>
+        <w:pStyle w:val="Normal"/>
+        <w:bidi w:val="0"/>
+        <w:ind w:left="709" w:hanging="0"/>
+        <w:jc w:val="both"/>
+        <w:rPr>
+          <w:rFonts w:ascii="Garamond" w:hAnsi="Garamond"/>
+          <w:color w:val="00A0FC"/>
+          <w:sz w:val="36"/>
+          <w:szCs w:val="36"/>
+        </w:rPr>
+      </w:pPr>
+      <w:r>
+        <w:rPr/>
+      </w:r>
+    </w:p>
+    <w:p>
+      <w:pPr>
+        <w:pStyle w:val="Normal"/>
+        <w:bidi w:val="0"/>
+        <w:ind w:left="709" w:hanging="0"/>
+        <w:jc w:val="both"/>
+        <w:rPr>
+          <w:color w:val="C9211E"/>
+        </w:rPr>
+      </w:pPr>
+      <w:r>
+        <w:rPr>
+          <w:rFonts w:eastAsia="Noto Serif CJK SC" w:cs="Noto Sans Devanagari" w:ascii="Garamond" w:hAnsi="Garamond"/>
+          <w:i w:val="false"/>
+          <w:iCs w:val="false"/>
+          <w:color w:val="C9211E"/>
+          <w:kern w:val="2"/>
+          <w:sz w:val="36"/>
+          <w:szCs w:val="36"/>
+          <w:lang w:val="pt-BR" w:eastAsia="zh-CN" w:bidi="hi-IN"/>
+        </w:rPr>
+        <w:t>[ Citar a entrevista de Mozart sobre a vida em Júpiter ]</w:t>
       </w:r>
     </w:p>
     <w:p>
@@ -6621,7 +6934,7 @@
     <w:pPr>
       <w:widowControl/>
       <w:suppressAutoHyphens w:val="true"/>
-      <w:overflowPunct w:val="false"/>
+      <w:overflowPunct w:val="true"/>
       <w:bidi w:val="0"/>
       <w:spacing w:before="0" w:after="0"/>
       <w:jc w:val="left"/>

</xml_diff>